<commit_message>
journal: polish tool guarantees per-column minimum widths (no token wrapping); rebuild v9 DOCX
Co-Authored-By: Claude Fable 5.1 <noreply@anthropic.com>
Claude-Session: https://claude.ai/code/session_01SvckvZxt3hAXTDPnm8YPEC
</commit_message>
<xml_diff>
--- a/journal/manuscript_v9_ko.docx
+++ b/journal/manuscript_v9_ko.docx
@@ -1855,7 +1855,7 @@
     <w:tbl>
       <w:tblPr>
         <w:tblStyle w:val="Table"/>
-        <w:tblW w:type="dxa" w:w="9067"/>
+        <w:tblW w:type="dxa" w:w="9066"/>
         <w:tblLayout w:type="fixed"/>
         <w:tblLook w:firstRow="1" w:lastRow="0" w:firstColumn="0" w:lastColumn="0" w:noHBand="0" w:noVBand="0" w:val="0020"/>
         <w:tblCellMar>
@@ -1874,14 +1874,14 @@
         </w:tblBorders>
       </w:tblPr>
       <w:tblGrid>
-        <w:gridCol w:w="922"/>
-        <w:gridCol w:w="678"/>
-        <w:gridCol w:w="1187"/>
-        <w:gridCol w:w="1385"/>
-        <w:gridCol w:w="1187"/>
-        <w:gridCol w:w="906"/>
-        <w:gridCol w:w="1714"/>
-        <w:gridCol w:w="1088"/>
+        <w:gridCol w:w="952"/>
+        <w:gridCol w:w="408"/>
+        <w:gridCol w:w="1225"/>
+        <w:gridCol w:w="1429"/>
+        <w:gridCol w:w="1225"/>
+        <w:gridCol w:w="935"/>
+        <w:gridCol w:w="1769"/>
+        <w:gridCol w:w="1123"/>
       </w:tblGrid>
       <w:tr>
         <w:trPr>
@@ -1890,7 +1890,7 @@
         </w:trPr>
         <w:tc>
           <w:tcPr>
-            <w:tcW w:type="dxa" w:w="922"/>
+            <w:tcW w:type="dxa" w:w="952"/>
             <w:tcBorders>
               <w:bottom w:val="single" w:sz="4" w:space="0" w:color="000000"/>
             </w:tcBorders>
@@ -1912,7 +1912,7 @@
         </w:tc>
         <w:tc>
           <w:tcPr>
-            <w:tcW w:type="dxa" w:w="678"/>
+            <w:tcW w:type="dxa" w:w="408"/>
             <w:tcBorders>
               <w:bottom w:val="single" w:sz="4" w:space="0" w:color="000000"/>
             </w:tcBorders>
@@ -1935,7 +1935,7 @@
         </w:tc>
         <w:tc>
           <w:tcPr>
-            <w:tcW w:type="dxa" w:w="1187"/>
+            <w:tcW w:type="dxa" w:w="1225"/>
             <w:tcBorders>
               <w:bottom w:val="single" w:sz="4" w:space="0" w:color="000000"/>
             </w:tcBorders>
@@ -1957,7 +1957,7 @@
         </w:tc>
         <w:tc>
           <w:tcPr>
-            <w:tcW w:type="dxa" w:w="1385"/>
+            <w:tcW w:type="dxa" w:w="1429"/>
             <w:tcBorders>
               <w:bottom w:val="single" w:sz="4" w:space="0" w:color="000000"/>
             </w:tcBorders>
@@ -1979,7 +1979,7 @@
         </w:tc>
         <w:tc>
           <w:tcPr>
-            <w:tcW w:type="dxa" w:w="1187"/>
+            <w:tcW w:type="dxa" w:w="1225"/>
             <w:tcBorders>
               <w:bottom w:val="single" w:sz="4" w:space="0" w:color="000000"/>
             </w:tcBorders>
@@ -2001,7 +2001,7 @@
         </w:tc>
         <w:tc>
           <w:tcPr>
-            <w:tcW w:type="dxa" w:w="906"/>
+            <w:tcW w:type="dxa" w:w="935"/>
             <w:tcBorders>
               <w:bottom w:val="single" w:sz="4" w:space="0" w:color="000000"/>
             </w:tcBorders>
@@ -2024,7 +2024,7 @@
         </w:tc>
         <w:tc>
           <w:tcPr>
-            <w:tcW w:type="dxa" w:w="1714"/>
+            <w:tcW w:type="dxa" w:w="1769"/>
             <w:tcBorders>
               <w:bottom w:val="single" w:sz="4" w:space="0" w:color="000000"/>
             </w:tcBorders>
@@ -2046,7 +2046,7 @@
         </w:tc>
         <w:tc>
           <w:tcPr>
-            <w:tcW w:type="dxa" w:w="1088"/>
+            <w:tcW w:type="dxa" w:w="1123"/>
             <w:tcBorders>
               <w:bottom w:val="single" w:sz="4" w:space="0" w:color="000000"/>
             </w:tcBorders>
@@ -2074,7 +2074,7 @@
         </w:trPr>
         <w:tc>
           <w:tcPr>
-            <w:tcW w:type="dxa" w:w="922"/>
+            <w:tcW w:type="dxa" w:w="952"/>
           </w:tcPr>
           <w:p>
             <w:pPr>
@@ -2093,7 +2093,7 @@
         </w:tc>
         <w:tc>
           <w:tcPr>
-            <w:tcW w:type="dxa" w:w="678"/>
+            <w:tcW w:type="dxa" w:w="408"/>
           </w:tcPr>
           <w:p>
             <w:pPr>
@@ -2113,7 +2113,7 @@
         </w:tc>
         <w:tc>
           <w:tcPr>
-            <w:tcW w:type="dxa" w:w="1187"/>
+            <w:tcW w:type="dxa" w:w="1225"/>
           </w:tcPr>
           <w:p>
             <w:pPr>
@@ -2132,7 +2132,7 @@
         </w:tc>
         <w:tc>
           <w:tcPr>
-            <w:tcW w:type="dxa" w:w="1385"/>
+            <w:tcW w:type="dxa" w:w="1429"/>
           </w:tcPr>
           <w:p>
             <w:pPr>
@@ -2151,7 +2151,7 @@
         </w:tc>
         <w:tc>
           <w:tcPr>
-            <w:tcW w:type="dxa" w:w="1187"/>
+            <w:tcW w:type="dxa" w:w="1225"/>
           </w:tcPr>
           <w:p>
             <w:pPr>
@@ -2170,7 +2170,7 @@
         </w:tc>
         <w:tc>
           <w:tcPr>
-            <w:tcW w:type="dxa" w:w="906"/>
+            <w:tcW w:type="dxa" w:w="935"/>
           </w:tcPr>
           <w:p>
             <w:pPr>
@@ -2190,7 +2190,7 @@
         </w:tc>
         <w:tc>
           <w:tcPr>
-            <w:tcW w:type="dxa" w:w="1714"/>
+            <w:tcW w:type="dxa" w:w="1769"/>
           </w:tcPr>
           <w:p>
             <w:pPr>
@@ -2209,7 +2209,7 @@
         </w:tc>
         <w:tc>
           <w:tcPr>
-            <w:tcW w:type="dxa" w:w="1088"/>
+            <w:tcW w:type="dxa" w:w="1123"/>
           </w:tcPr>
           <w:p>
             <w:pPr>
@@ -2234,7 +2234,7 @@
         </w:trPr>
         <w:tc>
           <w:tcPr>
-            <w:tcW w:type="dxa" w:w="922"/>
+            <w:tcW w:type="dxa" w:w="952"/>
           </w:tcPr>
           <w:p>
             <w:pPr>
@@ -2253,7 +2253,7 @@
         </w:tc>
         <w:tc>
           <w:tcPr>
-            <w:tcW w:type="dxa" w:w="678"/>
+            <w:tcW w:type="dxa" w:w="408"/>
           </w:tcPr>
           <w:p>
             <w:pPr>
@@ -2273,7 +2273,7 @@
         </w:tc>
         <w:tc>
           <w:tcPr>
-            <w:tcW w:type="dxa" w:w="1187"/>
+            <w:tcW w:type="dxa" w:w="1225"/>
           </w:tcPr>
           <w:p>
             <w:pPr>
@@ -2292,7 +2292,7 @@
         </w:tc>
         <w:tc>
           <w:tcPr>
-            <w:tcW w:type="dxa" w:w="1385"/>
+            <w:tcW w:type="dxa" w:w="1429"/>
           </w:tcPr>
           <w:p>
             <w:pPr>
@@ -2311,7 +2311,7 @@
         </w:tc>
         <w:tc>
           <w:tcPr>
-            <w:tcW w:type="dxa" w:w="1187"/>
+            <w:tcW w:type="dxa" w:w="1225"/>
           </w:tcPr>
           <w:p>
             <w:pPr>
@@ -2330,7 +2330,7 @@
         </w:tc>
         <w:tc>
           <w:tcPr>
-            <w:tcW w:type="dxa" w:w="906"/>
+            <w:tcW w:type="dxa" w:w="935"/>
           </w:tcPr>
           <w:p>
             <w:pPr>
@@ -2350,7 +2350,7 @@
         </w:tc>
         <w:tc>
           <w:tcPr>
-            <w:tcW w:type="dxa" w:w="1714"/>
+            <w:tcW w:type="dxa" w:w="1769"/>
           </w:tcPr>
           <w:p>
             <w:pPr>
@@ -2369,7 +2369,7 @@
         </w:tc>
         <w:tc>
           <w:tcPr>
-            <w:tcW w:type="dxa" w:w="1088"/>
+            <w:tcW w:type="dxa" w:w="1123"/>
           </w:tcPr>
           <w:p>
             <w:pPr>
@@ -2394,7 +2394,7 @@
         </w:trPr>
         <w:tc>
           <w:tcPr>
-            <w:tcW w:type="dxa" w:w="922"/>
+            <w:tcW w:type="dxa" w:w="952"/>
           </w:tcPr>
           <w:p>
             <w:pPr>
@@ -2413,7 +2413,7 @@
         </w:tc>
         <w:tc>
           <w:tcPr>
-            <w:tcW w:type="dxa" w:w="678"/>
+            <w:tcW w:type="dxa" w:w="408"/>
           </w:tcPr>
           <w:p>
             <w:pPr>
@@ -2433,7 +2433,7 @@
         </w:tc>
         <w:tc>
           <w:tcPr>
-            <w:tcW w:type="dxa" w:w="1187"/>
+            <w:tcW w:type="dxa" w:w="1225"/>
           </w:tcPr>
           <w:p>
             <w:pPr>
@@ -2452,7 +2452,7 @@
         </w:tc>
         <w:tc>
           <w:tcPr>
-            <w:tcW w:type="dxa" w:w="1385"/>
+            <w:tcW w:type="dxa" w:w="1429"/>
           </w:tcPr>
           <w:p>
             <w:pPr>
@@ -2471,7 +2471,7 @@
         </w:tc>
         <w:tc>
           <w:tcPr>
-            <w:tcW w:type="dxa" w:w="1187"/>
+            <w:tcW w:type="dxa" w:w="1225"/>
           </w:tcPr>
           <w:p>
             <w:pPr>
@@ -2490,7 +2490,7 @@
         </w:tc>
         <w:tc>
           <w:tcPr>
-            <w:tcW w:type="dxa" w:w="906"/>
+            <w:tcW w:type="dxa" w:w="935"/>
           </w:tcPr>
           <w:p>
             <w:pPr>
@@ -2510,7 +2510,7 @@
         </w:tc>
         <w:tc>
           <w:tcPr>
-            <w:tcW w:type="dxa" w:w="1714"/>
+            <w:tcW w:type="dxa" w:w="1769"/>
           </w:tcPr>
           <w:p>
             <w:pPr>
@@ -2529,7 +2529,7 @@
         </w:tc>
         <w:tc>
           <w:tcPr>
-            <w:tcW w:type="dxa" w:w="1088"/>
+            <w:tcW w:type="dxa" w:w="1123"/>
           </w:tcPr>
           <w:p>
             <w:pPr>
@@ -2554,7 +2554,7 @@
         </w:trPr>
         <w:tc>
           <w:tcPr>
-            <w:tcW w:type="dxa" w:w="922"/>
+            <w:tcW w:type="dxa" w:w="952"/>
           </w:tcPr>
           <w:p>
             <w:pPr>
@@ -2573,7 +2573,7 @@
         </w:tc>
         <w:tc>
           <w:tcPr>
-            <w:tcW w:type="dxa" w:w="678"/>
+            <w:tcW w:type="dxa" w:w="408"/>
           </w:tcPr>
           <w:p>
             <w:pPr>
@@ -2593,7 +2593,7 @@
         </w:tc>
         <w:tc>
           <w:tcPr>
-            <w:tcW w:type="dxa" w:w="1187"/>
+            <w:tcW w:type="dxa" w:w="1225"/>
           </w:tcPr>
           <w:p>
             <w:pPr>
@@ -2612,7 +2612,7 @@
         </w:tc>
         <w:tc>
           <w:tcPr>
-            <w:tcW w:type="dxa" w:w="1385"/>
+            <w:tcW w:type="dxa" w:w="1429"/>
           </w:tcPr>
           <w:p>
             <w:pPr>
@@ -2631,7 +2631,7 @@
         </w:tc>
         <w:tc>
           <w:tcPr>
-            <w:tcW w:type="dxa" w:w="1187"/>
+            <w:tcW w:type="dxa" w:w="1225"/>
           </w:tcPr>
           <w:p>
             <w:pPr>
@@ -2650,7 +2650,7 @@
         </w:tc>
         <w:tc>
           <w:tcPr>
-            <w:tcW w:type="dxa" w:w="906"/>
+            <w:tcW w:type="dxa" w:w="935"/>
           </w:tcPr>
           <w:p>
             <w:pPr>
@@ -2670,7 +2670,7 @@
         </w:tc>
         <w:tc>
           <w:tcPr>
-            <w:tcW w:type="dxa" w:w="1714"/>
+            <w:tcW w:type="dxa" w:w="1769"/>
           </w:tcPr>
           <w:p>
             <w:pPr>
@@ -2689,7 +2689,7 @@
         </w:tc>
         <w:tc>
           <w:tcPr>
-            <w:tcW w:type="dxa" w:w="1088"/>
+            <w:tcW w:type="dxa" w:w="1123"/>
           </w:tcPr>
           <w:p>
             <w:pPr>
@@ -2714,7 +2714,7 @@
         </w:trPr>
         <w:tc>
           <w:tcPr>
-            <w:tcW w:type="dxa" w:w="922"/>
+            <w:tcW w:type="dxa" w:w="952"/>
           </w:tcPr>
           <w:p>
             <w:pPr>
@@ -2733,7 +2733,7 @@
         </w:tc>
         <w:tc>
           <w:tcPr>
-            <w:tcW w:type="dxa" w:w="678"/>
+            <w:tcW w:type="dxa" w:w="408"/>
           </w:tcPr>
           <w:p>
             <w:pPr>
@@ -2753,7 +2753,7 @@
         </w:tc>
         <w:tc>
           <w:tcPr>
-            <w:tcW w:type="dxa" w:w="1187"/>
+            <w:tcW w:type="dxa" w:w="1225"/>
           </w:tcPr>
           <w:p>
             <w:pPr>
@@ -2772,7 +2772,7 @@
         </w:tc>
         <w:tc>
           <w:tcPr>
-            <w:tcW w:type="dxa" w:w="1385"/>
+            <w:tcW w:type="dxa" w:w="1429"/>
           </w:tcPr>
           <w:p>
             <w:pPr>
@@ -2791,7 +2791,7 @@
         </w:tc>
         <w:tc>
           <w:tcPr>
-            <w:tcW w:type="dxa" w:w="1187"/>
+            <w:tcW w:type="dxa" w:w="1225"/>
           </w:tcPr>
           <w:p>
             <w:pPr>
@@ -2810,7 +2810,7 @@
         </w:tc>
         <w:tc>
           <w:tcPr>
-            <w:tcW w:type="dxa" w:w="906"/>
+            <w:tcW w:type="dxa" w:w="935"/>
           </w:tcPr>
           <w:p>
             <w:pPr>
@@ -2830,7 +2830,7 @@
         </w:tc>
         <w:tc>
           <w:tcPr>
-            <w:tcW w:type="dxa" w:w="1714"/>
+            <w:tcW w:type="dxa" w:w="1769"/>
           </w:tcPr>
           <w:p>
             <w:pPr>
@@ -2849,7 +2849,7 @@
         </w:tc>
         <w:tc>
           <w:tcPr>
-            <w:tcW w:type="dxa" w:w="1088"/>
+            <w:tcW w:type="dxa" w:w="1123"/>
           </w:tcPr>
           <w:p>
             <w:pPr>
@@ -2874,7 +2874,7 @@
         </w:trPr>
         <w:tc>
           <w:tcPr>
-            <w:tcW w:type="dxa" w:w="922"/>
+            <w:tcW w:type="dxa" w:w="952"/>
           </w:tcPr>
           <w:p>
             <w:pPr>
@@ -2893,7 +2893,7 @@
         </w:tc>
         <w:tc>
           <w:tcPr>
-            <w:tcW w:type="dxa" w:w="678"/>
+            <w:tcW w:type="dxa" w:w="408"/>
           </w:tcPr>
           <w:p>
             <w:pPr>
@@ -2913,7 +2913,7 @@
         </w:tc>
         <w:tc>
           <w:tcPr>
-            <w:tcW w:type="dxa" w:w="1187"/>
+            <w:tcW w:type="dxa" w:w="1225"/>
           </w:tcPr>
           <w:p>
             <w:pPr>
@@ -2932,7 +2932,7 @@
         </w:tc>
         <w:tc>
           <w:tcPr>
-            <w:tcW w:type="dxa" w:w="1385"/>
+            <w:tcW w:type="dxa" w:w="1429"/>
           </w:tcPr>
           <w:p>
             <w:pPr>
@@ -2951,7 +2951,7 @@
         </w:tc>
         <w:tc>
           <w:tcPr>
-            <w:tcW w:type="dxa" w:w="1187"/>
+            <w:tcW w:type="dxa" w:w="1225"/>
           </w:tcPr>
           <w:p>
             <w:pPr>
@@ -2970,7 +2970,7 @@
         </w:tc>
         <w:tc>
           <w:tcPr>
-            <w:tcW w:type="dxa" w:w="906"/>
+            <w:tcW w:type="dxa" w:w="935"/>
           </w:tcPr>
           <w:p>
             <w:pPr>
@@ -2990,7 +2990,7 @@
         </w:tc>
         <w:tc>
           <w:tcPr>
-            <w:tcW w:type="dxa" w:w="1714"/>
+            <w:tcW w:type="dxa" w:w="1769"/>
           </w:tcPr>
           <w:p>
             <w:pPr>
@@ -3009,7 +3009,7 @@
         </w:tc>
         <w:tc>
           <w:tcPr>
-            <w:tcW w:type="dxa" w:w="1088"/>
+            <w:tcW w:type="dxa" w:w="1123"/>
           </w:tcPr>
           <w:p>
             <w:pPr>
@@ -3034,7 +3034,7 @@
         </w:trPr>
         <w:tc>
           <w:tcPr>
-            <w:tcW w:type="dxa" w:w="922"/>
+            <w:tcW w:type="dxa" w:w="952"/>
           </w:tcPr>
           <w:p>
             <w:pPr>
@@ -3053,7 +3053,7 @@
         </w:tc>
         <w:tc>
           <w:tcPr>
-            <w:tcW w:type="dxa" w:w="678"/>
+            <w:tcW w:type="dxa" w:w="408"/>
           </w:tcPr>
           <w:p>
             <w:pPr>
@@ -3073,7 +3073,7 @@
         </w:tc>
         <w:tc>
           <w:tcPr>
-            <w:tcW w:type="dxa" w:w="1187"/>
+            <w:tcW w:type="dxa" w:w="1225"/>
           </w:tcPr>
           <w:p>
             <w:pPr>
@@ -3092,7 +3092,7 @@
         </w:tc>
         <w:tc>
           <w:tcPr>
-            <w:tcW w:type="dxa" w:w="1385"/>
+            <w:tcW w:type="dxa" w:w="1429"/>
           </w:tcPr>
           <w:p>
             <w:pPr>
@@ -3111,7 +3111,7 @@
         </w:tc>
         <w:tc>
           <w:tcPr>
-            <w:tcW w:type="dxa" w:w="1187"/>
+            <w:tcW w:type="dxa" w:w="1225"/>
           </w:tcPr>
           <w:p>
             <w:pPr>
@@ -3130,7 +3130,7 @@
         </w:tc>
         <w:tc>
           <w:tcPr>
-            <w:tcW w:type="dxa" w:w="906"/>
+            <w:tcW w:type="dxa" w:w="935"/>
           </w:tcPr>
           <w:p>
             <w:pPr>
@@ -3150,7 +3150,7 @@
         </w:tc>
         <w:tc>
           <w:tcPr>
-            <w:tcW w:type="dxa" w:w="1714"/>
+            <w:tcW w:type="dxa" w:w="1769"/>
           </w:tcPr>
           <w:p>
             <w:pPr>
@@ -3169,7 +3169,7 @@
         </w:tc>
         <w:tc>
           <w:tcPr>
-            <w:tcW w:type="dxa" w:w="1088"/>
+            <w:tcW w:type="dxa" w:w="1123"/>
           </w:tcPr>
           <w:p>
             <w:pPr>
@@ -3194,7 +3194,7 @@
         </w:trPr>
         <w:tc>
           <w:tcPr>
-            <w:tcW w:type="dxa" w:w="922"/>
+            <w:tcW w:type="dxa" w:w="952"/>
           </w:tcPr>
           <w:p>
             <w:pPr>
@@ -3213,7 +3213,7 @@
         </w:tc>
         <w:tc>
           <w:tcPr>
-            <w:tcW w:type="dxa" w:w="678"/>
+            <w:tcW w:type="dxa" w:w="408"/>
           </w:tcPr>
           <w:p>
             <w:pPr>
@@ -3233,7 +3233,7 @@
         </w:tc>
         <w:tc>
           <w:tcPr>
-            <w:tcW w:type="dxa" w:w="1187"/>
+            <w:tcW w:type="dxa" w:w="1225"/>
           </w:tcPr>
           <w:p>
             <w:pPr>
@@ -3252,7 +3252,7 @@
         </w:tc>
         <w:tc>
           <w:tcPr>
-            <w:tcW w:type="dxa" w:w="1385"/>
+            <w:tcW w:type="dxa" w:w="1429"/>
           </w:tcPr>
           <w:p>
             <w:pPr>
@@ -3271,7 +3271,7 @@
         </w:tc>
         <w:tc>
           <w:tcPr>
-            <w:tcW w:type="dxa" w:w="1187"/>
+            <w:tcW w:type="dxa" w:w="1225"/>
           </w:tcPr>
           <w:p>
             <w:pPr>
@@ -3290,7 +3290,7 @@
         </w:tc>
         <w:tc>
           <w:tcPr>
-            <w:tcW w:type="dxa" w:w="906"/>
+            <w:tcW w:type="dxa" w:w="935"/>
           </w:tcPr>
           <w:p>
             <w:pPr>
@@ -3310,7 +3310,7 @@
         </w:tc>
         <w:tc>
           <w:tcPr>
-            <w:tcW w:type="dxa" w:w="1714"/>
+            <w:tcW w:type="dxa" w:w="1769"/>
           </w:tcPr>
           <w:p>
             <w:pPr>
@@ -3329,7 +3329,7 @@
         </w:tc>
         <w:tc>
           <w:tcPr>
-            <w:tcW w:type="dxa" w:w="1088"/>
+            <w:tcW w:type="dxa" w:w="1123"/>
           </w:tcPr>
           <w:p>
             <w:pPr>
@@ -3354,7 +3354,7 @@
         </w:trPr>
         <w:tc>
           <w:tcPr>
-            <w:tcW w:type="dxa" w:w="922"/>
+            <w:tcW w:type="dxa" w:w="952"/>
           </w:tcPr>
           <w:p>
             <w:pPr>
@@ -3373,7 +3373,7 @@
         </w:tc>
         <w:tc>
           <w:tcPr>
-            <w:tcW w:type="dxa" w:w="678"/>
+            <w:tcW w:type="dxa" w:w="408"/>
           </w:tcPr>
           <w:p>
             <w:pPr>
@@ -3393,7 +3393,7 @@
         </w:tc>
         <w:tc>
           <w:tcPr>
-            <w:tcW w:type="dxa" w:w="1187"/>
+            <w:tcW w:type="dxa" w:w="1225"/>
           </w:tcPr>
           <w:p>
             <w:pPr>
@@ -3412,7 +3412,7 @@
         </w:tc>
         <w:tc>
           <w:tcPr>
-            <w:tcW w:type="dxa" w:w="1385"/>
+            <w:tcW w:type="dxa" w:w="1429"/>
           </w:tcPr>
           <w:p>
             <w:pPr>
@@ -3431,7 +3431,7 @@
         </w:tc>
         <w:tc>
           <w:tcPr>
-            <w:tcW w:type="dxa" w:w="1187"/>
+            <w:tcW w:type="dxa" w:w="1225"/>
           </w:tcPr>
           <w:p>
             <w:pPr>
@@ -3450,7 +3450,7 @@
         </w:tc>
         <w:tc>
           <w:tcPr>
-            <w:tcW w:type="dxa" w:w="906"/>
+            <w:tcW w:type="dxa" w:w="935"/>
           </w:tcPr>
           <w:p>
             <w:pPr>
@@ -3470,7 +3470,7 @@
         </w:tc>
         <w:tc>
           <w:tcPr>
-            <w:tcW w:type="dxa" w:w="1714"/>
+            <w:tcW w:type="dxa" w:w="1769"/>
           </w:tcPr>
           <w:p>
             <w:pPr>
@@ -3489,7 +3489,7 @@
         </w:tc>
         <w:tc>
           <w:tcPr>
-            <w:tcW w:type="dxa" w:w="1088"/>
+            <w:tcW w:type="dxa" w:w="1123"/>
           </w:tcPr>
           <w:p>
             <w:pPr>
@@ -7570,7 +7570,7 @@
     <w:tbl>
       <w:tblPr>
         <w:tblStyle w:val="Table"/>
-        <w:tblW w:type="dxa" w:w="9068"/>
+        <w:tblW w:type="dxa" w:w="9069"/>
         <w:tblLayout w:type="fixed"/>
         <w:tblLook w:firstRow="1" w:lastRow="0" w:firstColumn="0" w:lastColumn="0" w:noHBand="0" w:noVBand="0" w:val="0020"/>
         <w:tblCellMar>
@@ -7589,10 +7589,10 @@
         </w:tblBorders>
       </w:tblPr>
       <w:tblGrid>
-        <w:gridCol w:w="688"/>
-        <w:gridCol w:w="2568"/>
-        <w:gridCol w:w="3244"/>
-        <w:gridCol w:w="2568"/>
+        <w:gridCol w:w="549"/>
+        <w:gridCol w:w="2611"/>
+        <w:gridCol w:w="3298"/>
+        <w:gridCol w:w="2611"/>
       </w:tblGrid>
       <w:tr>
         <w:trPr>
@@ -7601,7 +7601,7 @@
         </w:trPr>
         <w:tc>
           <w:tcPr>
-            <w:tcW w:type="dxa" w:w="688"/>
+            <w:tcW w:type="dxa" w:w="549"/>
             <w:tcBorders>
               <w:bottom w:val="single" w:sz="4" w:space="0" w:color="000000"/>
             </w:tcBorders>
@@ -7623,7 +7623,7 @@
         </w:tc>
         <w:tc>
           <w:tcPr>
-            <w:tcW w:type="dxa" w:w="2568"/>
+            <w:tcW w:type="dxa" w:w="2611"/>
             <w:tcBorders>
               <w:bottom w:val="single" w:sz="4" w:space="0" w:color="000000"/>
             </w:tcBorders>
@@ -7645,7 +7645,7 @@
         </w:tc>
         <w:tc>
           <w:tcPr>
-            <w:tcW w:type="dxa" w:w="3244"/>
+            <w:tcW w:type="dxa" w:w="3298"/>
             <w:tcBorders>
               <w:bottom w:val="single" w:sz="4" w:space="0" w:color="000000"/>
             </w:tcBorders>
@@ -7667,7 +7667,7 @@
         </w:tc>
         <w:tc>
           <w:tcPr>
-            <w:tcW w:type="dxa" w:w="2568"/>
+            <w:tcW w:type="dxa" w:w="2611"/>
             <w:tcBorders>
               <w:bottom w:val="single" w:sz="4" w:space="0" w:color="000000"/>
             </w:tcBorders>
@@ -7694,7 +7694,7 @@
         </w:trPr>
         <w:tc>
           <w:tcPr>
-            <w:tcW w:type="dxa" w:w="688"/>
+            <w:tcW w:type="dxa" w:w="549"/>
           </w:tcPr>
           <w:p>
             <w:pPr>
@@ -7713,7 +7713,7 @@
         </w:tc>
         <w:tc>
           <w:tcPr>
-            <w:tcW w:type="dxa" w:w="2568"/>
+            <w:tcW w:type="dxa" w:w="2611"/>
           </w:tcPr>
           <w:p>
             <w:pPr>
@@ -7732,7 +7732,7 @@
         </w:tc>
         <w:tc>
           <w:tcPr>
-            <w:tcW w:type="dxa" w:w="3244"/>
+            <w:tcW w:type="dxa" w:w="3298"/>
           </w:tcPr>
           <w:p>
             <w:pPr>
@@ -7751,7 +7751,7 @@
         </w:tc>
         <w:tc>
           <w:tcPr>
-            <w:tcW w:type="dxa" w:w="2568"/>
+            <w:tcW w:type="dxa" w:w="2611"/>
           </w:tcPr>
           <w:p>
             <w:pPr>
@@ -7775,7 +7775,7 @@
         </w:trPr>
         <w:tc>
           <w:tcPr>
-            <w:tcW w:type="dxa" w:w="688"/>
+            <w:tcW w:type="dxa" w:w="549"/>
           </w:tcPr>
           <w:p>
             <w:pPr>
@@ -7794,7 +7794,7 @@
         </w:tc>
         <w:tc>
           <w:tcPr>
-            <w:tcW w:type="dxa" w:w="2568"/>
+            <w:tcW w:type="dxa" w:w="2611"/>
           </w:tcPr>
           <w:p>
             <w:pPr>
@@ -7813,7 +7813,7 @@
         </w:tc>
         <w:tc>
           <w:tcPr>
-            <w:tcW w:type="dxa" w:w="3244"/>
+            <w:tcW w:type="dxa" w:w="3298"/>
           </w:tcPr>
           <w:p>
             <w:pPr>
@@ -7832,7 +7832,7 @@
         </w:tc>
         <w:tc>
           <w:tcPr>
-            <w:tcW w:type="dxa" w:w="2568"/>
+            <w:tcW w:type="dxa" w:w="2611"/>
           </w:tcPr>
           <w:p>
             <w:pPr>
@@ -7856,7 +7856,7 @@
         </w:trPr>
         <w:tc>
           <w:tcPr>
-            <w:tcW w:type="dxa" w:w="688"/>
+            <w:tcW w:type="dxa" w:w="549"/>
           </w:tcPr>
           <w:p>
             <w:pPr>
@@ -7875,7 +7875,7 @@
         </w:tc>
         <w:tc>
           <w:tcPr>
-            <w:tcW w:type="dxa" w:w="2568"/>
+            <w:tcW w:type="dxa" w:w="2611"/>
           </w:tcPr>
           <w:p>
             <w:pPr>
@@ -7894,7 +7894,7 @@
         </w:tc>
         <w:tc>
           <w:tcPr>
-            <w:tcW w:type="dxa" w:w="3244"/>
+            <w:tcW w:type="dxa" w:w="3298"/>
           </w:tcPr>
           <w:p>
             <w:pPr>
@@ -7913,7 +7913,7 @@
         </w:tc>
         <w:tc>
           <w:tcPr>
-            <w:tcW w:type="dxa" w:w="2568"/>
+            <w:tcW w:type="dxa" w:w="2611"/>
           </w:tcPr>
           <w:p>
             <w:pPr>
@@ -7937,7 +7937,7 @@
         </w:trPr>
         <w:tc>
           <w:tcPr>
-            <w:tcW w:type="dxa" w:w="688"/>
+            <w:tcW w:type="dxa" w:w="549"/>
           </w:tcPr>
           <w:p>
             <w:pPr>
@@ -7956,7 +7956,7 @@
         </w:tc>
         <w:tc>
           <w:tcPr>
-            <w:tcW w:type="dxa" w:w="2568"/>
+            <w:tcW w:type="dxa" w:w="2611"/>
           </w:tcPr>
           <w:p>
             <w:pPr>
@@ -7975,7 +7975,7 @@
         </w:tc>
         <w:tc>
           <w:tcPr>
-            <w:tcW w:type="dxa" w:w="3244"/>
+            <w:tcW w:type="dxa" w:w="3298"/>
           </w:tcPr>
           <w:p>
             <w:pPr>
@@ -7994,7 +7994,7 @@
         </w:tc>
         <w:tc>
           <w:tcPr>
-            <w:tcW w:type="dxa" w:w="2568"/>
+            <w:tcW w:type="dxa" w:w="2611"/>
           </w:tcPr>
           <w:p>
             <w:pPr>
@@ -8206,12 +8206,12 @@
         </w:tblBorders>
       </w:tblPr>
       <w:tblGrid>
-        <w:gridCol w:w="1738"/>
-        <w:gridCol w:w="1738"/>
-        <w:gridCol w:w="2028"/>
-        <w:gridCol w:w="1545"/>
-        <w:gridCol w:w="691"/>
-        <w:gridCol w:w="1327"/>
+        <w:gridCol w:w="1760"/>
+        <w:gridCol w:w="1760"/>
+        <w:gridCol w:w="2053"/>
+        <w:gridCol w:w="1564"/>
+        <w:gridCol w:w="586"/>
+        <w:gridCol w:w="1344"/>
       </w:tblGrid>
       <w:tr>
         <w:trPr>
@@ -8220,7 +8220,7 @@
         </w:trPr>
         <w:tc>
           <w:tcPr>
-            <w:tcW w:type="dxa" w:w="1738"/>
+            <w:tcW w:type="dxa" w:w="1760"/>
             <w:tcBorders>
               <w:bottom w:val="single" w:sz="4" w:space="0" w:color="000000"/>
             </w:tcBorders>
@@ -8242,7 +8242,7 @@
         </w:tc>
         <w:tc>
           <w:tcPr>
-            <w:tcW w:type="dxa" w:w="1738"/>
+            <w:tcW w:type="dxa" w:w="1760"/>
             <w:tcBorders>
               <w:bottom w:val="single" w:sz="4" w:space="0" w:color="000000"/>
             </w:tcBorders>
@@ -8264,7 +8264,7 @@
         </w:tc>
         <w:tc>
           <w:tcPr>
-            <w:tcW w:type="dxa" w:w="2028"/>
+            <w:tcW w:type="dxa" w:w="2053"/>
             <w:tcBorders>
               <w:bottom w:val="single" w:sz="4" w:space="0" w:color="000000"/>
             </w:tcBorders>
@@ -8286,7 +8286,7 @@
         </w:tc>
         <w:tc>
           <w:tcPr>
-            <w:tcW w:type="dxa" w:w="1545"/>
+            <w:tcW w:type="dxa" w:w="1564"/>
             <w:tcBorders>
               <w:bottom w:val="single" w:sz="4" w:space="0" w:color="000000"/>
             </w:tcBorders>
@@ -8308,7 +8308,7 @@
         </w:tc>
         <w:tc>
           <w:tcPr>
-            <w:tcW w:type="dxa" w:w="691"/>
+            <w:tcW w:type="dxa" w:w="586"/>
             <w:tcBorders>
               <w:bottom w:val="single" w:sz="4" w:space="0" w:color="000000"/>
             </w:tcBorders>
@@ -8331,7 +8331,7 @@
         </w:tc>
         <w:tc>
           <w:tcPr>
-            <w:tcW w:type="dxa" w:w="1327"/>
+            <w:tcW w:type="dxa" w:w="1344"/>
             <w:tcBorders>
               <w:bottom w:val="single" w:sz="4" w:space="0" w:color="000000"/>
             </w:tcBorders>
@@ -8359,7 +8359,7 @@
         </w:trPr>
         <w:tc>
           <w:tcPr>
-            <w:tcW w:type="dxa" w:w="1738"/>
+            <w:tcW w:type="dxa" w:w="1760"/>
           </w:tcPr>
           <w:p>
             <w:pPr>
@@ -8378,7 +8378,7 @@
         </w:tc>
         <w:tc>
           <w:tcPr>
-            <w:tcW w:type="dxa" w:w="1738"/>
+            <w:tcW w:type="dxa" w:w="1760"/>
           </w:tcPr>
           <w:p>
             <w:pPr>
@@ -8397,7 +8397,7 @@
         </w:tc>
         <w:tc>
           <w:tcPr>
-            <w:tcW w:type="dxa" w:w="2028"/>
+            <w:tcW w:type="dxa" w:w="2053"/>
           </w:tcPr>
           <w:p>
             <w:pPr>
@@ -8416,7 +8416,7 @@
         </w:tc>
         <w:tc>
           <w:tcPr>
-            <w:tcW w:type="dxa" w:w="1545"/>
+            <w:tcW w:type="dxa" w:w="1564"/>
           </w:tcPr>
           <w:p>
             <w:pPr>
@@ -8435,7 +8435,7 @@
         </w:tc>
         <w:tc>
           <w:tcPr>
-            <w:tcW w:type="dxa" w:w="691"/>
+            <w:tcW w:type="dxa" w:w="586"/>
           </w:tcPr>
           <w:p>
             <w:pPr>
@@ -8455,7 +8455,7 @@
         </w:tc>
         <w:tc>
           <w:tcPr>
-            <w:tcW w:type="dxa" w:w="1327"/>
+            <w:tcW w:type="dxa" w:w="1344"/>
           </w:tcPr>
           <w:p>
             <w:pPr>
@@ -8480,7 +8480,7 @@
         </w:trPr>
         <w:tc>
           <w:tcPr>
-            <w:tcW w:type="dxa" w:w="1738"/>
+            <w:tcW w:type="dxa" w:w="1760"/>
           </w:tcPr>
           <w:p>
             <w:pPr>
@@ -8499,7 +8499,7 @@
         </w:tc>
         <w:tc>
           <w:tcPr>
-            <w:tcW w:type="dxa" w:w="1738"/>
+            <w:tcW w:type="dxa" w:w="1760"/>
           </w:tcPr>
           <w:p>
             <w:pPr>
@@ -8518,7 +8518,7 @@
         </w:tc>
         <w:tc>
           <w:tcPr>
-            <w:tcW w:type="dxa" w:w="2028"/>
+            <w:tcW w:type="dxa" w:w="2053"/>
           </w:tcPr>
           <w:p>
             <w:pPr>
@@ -8537,7 +8537,7 @@
         </w:tc>
         <w:tc>
           <w:tcPr>
-            <w:tcW w:type="dxa" w:w="1545"/>
+            <w:tcW w:type="dxa" w:w="1564"/>
           </w:tcPr>
           <w:p>
             <w:pPr>
@@ -8556,7 +8556,7 @@
         </w:tc>
         <w:tc>
           <w:tcPr>
-            <w:tcW w:type="dxa" w:w="691"/>
+            <w:tcW w:type="dxa" w:w="586"/>
           </w:tcPr>
           <w:p>
             <w:pPr>
@@ -8576,7 +8576,7 @@
         </w:tc>
         <w:tc>
           <w:tcPr>
-            <w:tcW w:type="dxa" w:w="1327"/>
+            <w:tcW w:type="dxa" w:w="1344"/>
           </w:tcPr>
           <w:p>
             <w:pPr>
@@ -8601,7 +8601,7 @@
         </w:trPr>
         <w:tc>
           <w:tcPr>
-            <w:tcW w:type="dxa" w:w="1738"/>
+            <w:tcW w:type="dxa" w:w="1760"/>
           </w:tcPr>
           <w:p>
             <w:pPr>
@@ -8620,7 +8620,7 @@
         </w:tc>
         <w:tc>
           <w:tcPr>
-            <w:tcW w:type="dxa" w:w="1738"/>
+            <w:tcW w:type="dxa" w:w="1760"/>
           </w:tcPr>
           <w:p>
             <w:pPr>
@@ -8639,7 +8639,7 @@
         </w:tc>
         <w:tc>
           <w:tcPr>
-            <w:tcW w:type="dxa" w:w="2028"/>
+            <w:tcW w:type="dxa" w:w="2053"/>
           </w:tcPr>
           <w:p>
             <w:pPr>
@@ -8658,7 +8658,7 @@
         </w:tc>
         <w:tc>
           <w:tcPr>
-            <w:tcW w:type="dxa" w:w="1545"/>
+            <w:tcW w:type="dxa" w:w="1564"/>
           </w:tcPr>
           <w:p>
             <w:pPr>
@@ -8677,7 +8677,7 @@
         </w:tc>
         <w:tc>
           <w:tcPr>
-            <w:tcW w:type="dxa" w:w="691"/>
+            <w:tcW w:type="dxa" w:w="586"/>
           </w:tcPr>
           <w:p>
             <w:pPr>
@@ -8697,7 +8697,7 @@
         </w:tc>
         <w:tc>
           <w:tcPr>
-            <w:tcW w:type="dxa" w:w="1327"/>
+            <w:tcW w:type="dxa" w:w="1344"/>
           </w:tcPr>
           <w:p>
             <w:pPr>
@@ -8805,7 +8805,7 @@
     <w:tbl>
       <w:tblPr>
         <w:tblStyle w:val="Table"/>
-        <w:tblW w:type="dxa" w:w="9065"/>
+        <w:tblW w:type="dxa" w:w="9073"/>
         <w:tblLayout w:type="fixed"/>
         <w:tblLook w:firstRow="1" w:lastRow="0" w:firstColumn="0" w:lastColumn="0" w:noHBand="0" w:noVBand="0" w:val="0020"/>
         <w:tblCellMar>
@@ -8824,15 +8824,15 @@
         </w:tblBorders>
       </w:tblPr>
       <w:tblGrid>
-        <w:gridCol w:w="1850"/>
-        <w:gridCol w:w="666"/>
-        <w:gridCol w:w="735"/>
-        <w:gridCol w:w="951"/>
-        <w:gridCol w:w="984"/>
-        <w:gridCol w:w="1180"/>
-        <w:gridCol w:w="779"/>
-        <w:gridCol w:w="779"/>
-        <w:gridCol w:w="1141"/>
+        <w:gridCol w:w="1916"/>
+        <w:gridCol w:w="355"/>
+        <w:gridCol w:w="769"/>
+        <w:gridCol w:w="988"/>
+        <w:gridCol w:w="1017"/>
+        <w:gridCol w:w="1215"/>
+        <w:gridCol w:w="809"/>
+        <w:gridCol w:w="809"/>
+        <w:gridCol w:w="1195"/>
       </w:tblGrid>
       <w:tr>
         <w:trPr>
@@ -8841,7 +8841,7 @@
         </w:trPr>
         <w:tc>
           <w:tcPr>
-            <w:tcW w:type="dxa" w:w="1850"/>
+            <w:tcW w:type="dxa" w:w="1916"/>
             <w:tcBorders>
               <w:bottom w:val="single" w:sz="4" w:space="0" w:color="000000"/>
             </w:tcBorders>
@@ -8854,8 +8854,8 @@
             </w:pPr>
             <w:r>
               <w:rPr>
-                <w:sz w:val="15"/>
-                <w:szCs w:val="15"/>
+                <w:sz w:val="13"/>
+                <w:szCs w:val="13"/>
               </w:rPr>
               <w:t xml:space="preserve">모형 설정</w:t>
             </w:r>
@@ -8863,7 +8863,7 @@
         </w:tc>
         <w:tc>
           <w:tcPr>
-            <w:tcW w:type="dxa" w:w="666"/>
+            <w:tcW w:type="dxa" w:w="355"/>
             <w:tcBorders>
               <w:bottom w:val="single" w:sz="4" w:space="0" w:color="000000"/>
             </w:tcBorders>
@@ -8877,8 +8877,8 @@
             </w:pPr>
             <w:r>
               <w:rPr>
-                <w:sz w:val="15"/>
-                <w:szCs w:val="15"/>
+                <w:sz w:val="13"/>
+                <w:szCs w:val="13"/>
               </w:rPr>
               <w:t xml:space="preserve">N</w:t>
             </w:r>
@@ -8886,7 +8886,7 @@
         </w:tc>
         <w:tc>
           <w:tcPr>
-            <w:tcW w:type="dxa" w:w="735"/>
+            <w:tcW w:type="dxa" w:w="769"/>
             <w:tcBorders>
               <w:bottom w:val="single" w:sz="4" w:space="0" w:color="000000"/>
             </w:tcBorders>
@@ -8899,8 +8899,8 @@
             </w:pPr>
             <w:r>
               <w:rPr>
-                <w:sz w:val="15"/>
-                <w:szCs w:val="15"/>
+                <w:sz w:val="13"/>
+                <w:szCs w:val="13"/>
               </w:rPr>
               <w:t xml:space="preserve">기술범위 → 통합형</w:t>
             </w:r>
@@ -8908,7 +8908,7 @@
         </w:tc>
         <w:tc>
           <w:tcPr>
-            <w:tcW w:type="dxa" w:w="951"/>
+            <w:tcW w:type="dxa" w:w="988"/>
             <w:tcBorders>
               <w:bottom w:val="single" w:sz="4" w:space="0" w:color="000000"/>
             </w:tcBorders>
@@ -8921,8 +8921,8 @@
             </w:pPr>
             <w:r>
               <w:rPr>
-                <w:sz w:val="15"/>
-                <w:szCs w:val="15"/>
+                <w:sz w:val="13"/>
+                <w:szCs w:val="13"/>
               </w:rPr>
               <w:t xml:space="preserve">기술범위 → 공정 단독형</w:t>
             </w:r>
@@ -8930,7 +8930,7 @@
         </w:tc>
         <w:tc>
           <w:tcPr>
-            <w:tcW w:type="dxa" w:w="984"/>
+            <w:tcW w:type="dxa" w:w="1017"/>
             <w:tcBorders>
               <w:bottom w:val="single" w:sz="4" w:space="0" w:color="000000"/>
             </w:tcBorders>
@@ -8943,8 +8943,8 @@
             </w:pPr>
             <w:r>
               <w:rPr>
-                <w:sz w:val="15"/>
-                <w:szCs w:val="15"/>
+                <w:sz w:val="13"/>
+                <w:szCs w:val="13"/>
               </w:rPr>
               <w:t xml:space="preserve">연도 → 통합형</w:t>
             </w:r>
@@ -8952,7 +8952,7 @@
         </w:tc>
         <w:tc>
           <w:tcPr>
-            <w:tcW w:type="dxa" w:w="1180"/>
+            <w:tcW w:type="dxa" w:w="1215"/>
             <w:tcBorders>
               <w:bottom w:val="single" w:sz="4" w:space="0" w:color="000000"/>
             </w:tcBorders>
@@ -8965,8 +8965,8 @@
             </w:pPr>
             <w:r>
               <w:rPr>
-                <w:sz w:val="15"/>
-                <w:szCs w:val="15"/>
+                <w:sz w:val="13"/>
+                <w:szCs w:val="13"/>
               </w:rPr>
               <w:t xml:space="preserve">연도 → 공정 단독형</w:t>
             </w:r>
@@ -8974,7 +8974,7 @@
         </w:tc>
         <w:tc>
           <w:tcPr>
-            <w:tcW w:type="dxa" w:w="779"/>
+            <w:tcW w:type="dxa" w:w="809"/>
             <w:tcBorders>
               <w:bottom w:val="single" w:sz="4" w:space="0" w:color="000000"/>
             </w:tcBorders>
@@ -8987,8 +8987,8 @@
             </w:pPr>
             <w:r>
               <w:rPr>
-                <w:sz w:val="15"/>
-                <w:szCs w:val="15"/>
+                <w:sz w:val="13"/>
+                <w:szCs w:val="13"/>
               </w:rPr>
               <w:t xml:space="preserve">중국 → 공정 단독형</w:t>
             </w:r>
@@ -8996,7 +8996,7 @@
         </w:tc>
         <w:tc>
           <w:tcPr>
-            <w:tcW w:type="dxa" w:w="779"/>
+            <w:tcW w:type="dxa" w:w="809"/>
             <w:tcBorders>
               <w:bottom w:val="single" w:sz="4" w:space="0" w:color="000000"/>
             </w:tcBorders>
@@ -9009,8 +9009,8 @@
             </w:pPr>
             <w:r>
               <w:rPr>
-                <w:sz w:val="15"/>
-                <w:szCs w:val="15"/>
+                <w:sz w:val="13"/>
+                <w:szCs w:val="13"/>
               </w:rPr>
               <w:t xml:space="preserve">일본 → 공정 단독형</w:t>
             </w:r>
@@ -9018,7 +9018,7 @@
         </w:tc>
         <w:tc>
           <w:tcPr>
-            <w:tcW w:type="dxa" w:w="1141"/>
+            <w:tcW w:type="dxa" w:w="1195"/>
             <w:tcBorders>
               <w:bottom w:val="single" w:sz="4" w:space="0" w:color="000000"/>
             </w:tcBorders>
@@ -9031,8 +9031,8 @@
             </w:pPr>
             <w:r>
               <w:rPr>
-                <w:sz w:val="15"/>
-                <w:szCs w:val="15"/>
+                <w:sz w:val="13"/>
+                <w:szCs w:val="13"/>
               </w:rPr>
               <w:t xml:space="preserve">연도 → 기술범위(음이항 IRR)</w:t>
             </w:r>
@@ -9045,18 +9045,18 @@
         </w:trPr>
         <w:tc>
           <w:tcPr>
-            <w:tcW w:type="dxa" w:w="1850"/>
-          </w:tcPr>
-          <w:p>
-            <w:pPr>
-              <w:pStyle w:val="Compact"/>
-              <w:spacing w:before="20" w:after="20" w:line="240" w:lineRule="auto"/>
-              <w:keepNext/>
-            </w:pPr>
-            <w:r>
-              <w:rPr>
-                <w:sz w:val="15"/>
-                <w:szCs w:val="15"/>
+            <w:tcW w:type="dxa" w:w="1916"/>
+          </w:tcPr>
+          <w:p>
+            <w:pPr>
+              <w:pStyle w:val="Compact"/>
+              <w:spacing w:before="20" w:after="20" w:line="240" w:lineRule="auto"/>
+              <w:keepNext/>
+            </w:pPr>
+            <w:r>
+              <w:rPr>
+                <w:sz w:val="13"/>
+                <w:szCs w:val="13"/>
               </w:rPr>
               <w:t xml:space="preserve">기준(표 4·6)</w:t>
             </w:r>
@@ -9064,7 +9064,7 @@
         </w:tc>
         <w:tc>
           <w:tcPr>
-            <w:tcW w:type="dxa" w:w="666"/>
+            <w:tcW w:type="dxa" w:w="355"/>
           </w:tcPr>
           <w:p>
             <w:pPr>
@@ -9075,8 +9075,8 @@
             </w:pPr>
             <w:r>
               <w:rPr>
-                <w:sz w:val="15"/>
-                <w:szCs w:val="15"/>
+                <w:sz w:val="13"/>
+                <w:szCs w:val="13"/>
               </w:rPr>
               <w:t xml:space="preserve">928</w:t>
             </w:r>
@@ -9084,18 +9084,18 @@
         </w:tc>
         <w:tc>
           <w:tcPr>
-            <w:tcW w:type="dxa" w:w="735"/>
-          </w:tcPr>
-          <w:p>
-            <w:pPr>
-              <w:pStyle w:val="Compact"/>
-              <w:spacing w:before="20" w:after="20" w:line="240" w:lineRule="auto"/>
-              <w:keepNext/>
-            </w:pPr>
-            <w:r>
-              <w:rPr>
-                <w:sz w:val="15"/>
-                <w:szCs w:val="15"/>
+            <w:tcW w:type="dxa" w:w="769"/>
+          </w:tcPr>
+          <w:p>
+            <w:pPr>
+              <w:pStyle w:val="Compact"/>
+              <w:spacing w:before="20" w:after="20" w:line="240" w:lineRule="auto"/>
+              <w:keepNext/>
+            </w:pPr>
+            <w:r>
+              <w:rPr>
+                <w:sz w:val="13"/>
+                <w:szCs w:val="13"/>
               </w:rPr>
               <w:t xml:space="preserve">1.403***</w:t>
             </w:r>
@@ -9103,18 +9103,18 @@
         </w:tc>
         <w:tc>
           <w:tcPr>
-            <w:tcW w:type="dxa" w:w="951"/>
-          </w:tcPr>
-          <w:p>
-            <w:pPr>
-              <w:pStyle w:val="Compact"/>
-              <w:spacing w:before="20" w:after="20" w:line="240" w:lineRule="auto"/>
-              <w:keepNext/>
-            </w:pPr>
-            <w:r>
-              <w:rPr>
-                <w:sz w:val="15"/>
-                <w:szCs w:val="15"/>
+            <w:tcW w:type="dxa" w:w="988"/>
+          </w:tcPr>
+          <w:p>
+            <w:pPr>
+              <w:pStyle w:val="Compact"/>
+              <w:spacing w:before="20" w:after="20" w:line="240" w:lineRule="auto"/>
+              <w:keepNext/>
+            </w:pPr>
+            <w:r>
+              <w:rPr>
+                <w:sz w:val="13"/>
+                <w:szCs w:val="13"/>
               </w:rPr>
               <w:t xml:space="preserve">0.905**</w:t>
             </w:r>
@@ -9122,18 +9122,18 @@
         </w:tc>
         <w:tc>
           <w:tcPr>
-            <w:tcW w:type="dxa" w:w="984"/>
-          </w:tcPr>
-          <w:p>
-            <w:pPr>
-              <w:pStyle w:val="Compact"/>
-              <w:spacing w:before="20" w:after="20" w:line="240" w:lineRule="auto"/>
-              <w:keepNext/>
-            </w:pPr>
-            <w:r>
-              <w:rPr>
-                <w:sz w:val="15"/>
-                <w:szCs w:val="15"/>
+            <w:tcW w:type="dxa" w:w="1017"/>
+          </w:tcPr>
+          <w:p>
+            <w:pPr>
+              <w:pStyle w:val="Compact"/>
+              <w:spacing w:before="20" w:after="20" w:line="240" w:lineRule="auto"/>
+              <w:keepNext/>
+            </w:pPr>
+            <w:r>
+              <w:rPr>
+                <w:sz w:val="13"/>
+                <w:szCs w:val="13"/>
               </w:rPr>
               <w:t xml:space="preserve">0.993</w:t>
             </w:r>
@@ -9141,18 +9141,18 @@
         </w:tc>
         <w:tc>
           <w:tcPr>
-            <w:tcW w:type="dxa" w:w="1180"/>
-          </w:tcPr>
-          <w:p>
-            <w:pPr>
-              <w:pStyle w:val="Compact"/>
-              <w:spacing w:before="20" w:after="20" w:line="240" w:lineRule="auto"/>
-              <w:keepNext/>
-            </w:pPr>
-            <w:r>
-              <w:rPr>
-                <w:sz w:val="15"/>
-                <w:szCs w:val="15"/>
+            <w:tcW w:type="dxa" w:w="1215"/>
+          </w:tcPr>
+          <w:p>
+            <w:pPr>
+              <w:pStyle w:val="Compact"/>
+              <w:spacing w:before="20" w:after="20" w:line="240" w:lineRule="auto"/>
+              <w:keepNext/>
+            </w:pPr>
+            <w:r>
+              <w:rPr>
+                <w:sz w:val="13"/>
+                <w:szCs w:val="13"/>
               </w:rPr>
               <w:t xml:space="preserve">0.913***</w:t>
             </w:r>
@@ -9160,18 +9160,18 @@
         </w:tc>
         <w:tc>
           <w:tcPr>
-            <w:tcW w:type="dxa" w:w="779"/>
-          </w:tcPr>
-          <w:p>
-            <w:pPr>
-              <w:pStyle w:val="Compact"/>
-              <w:spacing w:before="20" w:after="20" w:line="240" w:lineRule="auto"/>
-              <w:keepNext/>
-            </w:pPr>
-            <w:r>
-              <w:rPr>
-                <w:sz w:val="15"/>
-                <w:szCs w:val="15"/>
+            <w:tcW w:type="dxa" w:w="809"/>
+          </w:tcPr>
+          <w:p>
+            <w:pPr>
+              <w:pStyle w:val="Compact"/>
+              <w:spacing w:before="20" w:after="20" w:line="240" w:lineRule="auto"/>
+              <w:keepNext/>
+            </w:pPr>
+            <w:r>
+              <w:rPr>
+                <w:sz w:val="13"/>
+                <w:szCs w:val="13"/>
               </w:rPr>
               <w:t xml:space="preserve">2.687***</w:t>
             </w:r>
@@ -9179,18 +9179,18 @@
         </w:tc>
         <w:tc>
           <w:tcPr>
-            <w:tcW w:type="dxa" w:w="779"/>
-          </w:tcPr>
-          <w:p>
-            <w:pPr>
-              <w:pStyle w:val="Compact"/>
-              <w:spacing w:before="20" w:after="20" w:line="240" w:lineRule="auto"/>
-              <w:keepNext/>
-            </w:pPr>
-            <w:r>
-              <w:rPr>
-                <w:sz w:val="15"/>
-                <w:szCs w:val="15"/>
+            <w:tcW w:type="dxa" w:w="809"/>
+          </w:tcPr>
+          <w:p>
+            <w:pPr>
+              <w:pStyle w:val="Compact"/>
+              <w:spacing w:before="20" w:after="20" w:line="240" w:lineRule="auto"/>
+              <w:keepNext/>
+            </w:pPr>
+            <w:r>
+              <w:rPr>
+                <w:sz w:val="13"/>
+                <w:szCs w:val="13"/>
               </w:rPr>
               <w:t xml:space="preserve">0.086***</w:t>
             </w:r>
@@ -9198,18 +9198,18 @@
         </w:tc>
         <w:tc>
           <w:tcPr>
-            <w:tcW w:type="dxa" w:w="1141"/>
-          </w:tcPr>
-          <w:p>
-            <w:pPr>
-              <w:pStyle w:val="Compact"/>
-              <w:spacing w:before="20" w:after="20" w:line="240" w:lineRule="auto"/>
-              <w:keepNext/>
-            </w:pPr>
-            <w:r>
-              <w:rPr>
-                <w:sz w:val="15"/>
-                <w:szCs w:val="15"/>
+            <w:tcW w:type="dxa" w:w="1195"/>
+          </w:tcPr>
+          <w:p>
+            <w:pPr>
+              <w:pStyle w:val="Compact"/>
+              <w:spacing w:before="20" w:after="20" w:line="240" w:lineRule="auto"/>
+              <w:keepNext/>
+            </w:pPr>
+            <w:r>
+              <w:rPr>
+                <w:sz w:val="13"/>
+                <w:szCs w:val="13"/>
               </w:rPr>
               <w:t xml:space="preserve">1.015***</w:t>
             </w:r>
@@ -9222,18 +9222,18 @@
         </w:trPr>
         <w:tc>
           <w:tcPr>
-            <w:tcW w:type="dxa" w:w="1850"/>
-          </w:tcPr>
-          <w:p>
-            <w:pPr>
-              <w:pStyle w:val="Compact"/>
-              <w:spacing w:before="20" w:after="20" w:line="240" w:lineRule="auto"/>
-              <w:keepNext/>
-            </w:pPr>
-            <w:r>
-              <w:rPr>
-                <w:sz w:val="15"/>
-                <w:szCs w:val="15"/>
+            <w:tcW w:type="dxa" w:w="1916"/>
+          </w:tcPr>
+          <w:p>
+            <w:pPr>
+              <w:pStyle w:val="Compact"/>
+              <w:spacing w:before="20" w:after="20" w:line="240" w:lineRule="auto"/>
+              <w:keepNext/>
+            </w:pPr>
+            <w:r>
+              <w:rPr>
+                <w:sz w:val="13"/>
+                <w:szCs w:val="13"/>
               </w:rPr>
               <w:t xml:space="preserve">기준 + 제목 군집 표준오차</w:t>
             </w:r>
@@ -9241,7 +9241,7 @@
         </w:tc>
         <w:tc>
           <w:tcPr>
-            <w:tcW w:type="dxa" w:w="666"/>
+            <w:tcW w:type="dxa" w:w="355"/>
           </w:tcPr>
           <w:p>
             <w:pPr>
@@ -9252,8 +9252,8 @@
             </w:pPr>
             <w:r>
               <w:rPr>
-                <w:sz w:val="15"/>
-                <w:szCs w:val="15"/>
+                <w:sz w:val="13"/>
+                <w:szCs w:val="13"/>
               </w:rPr>
               <w:t xml:space="preserve">928</w:t>
             </w:r>
@@ -9261,18 +9261,18 @@
         </w:tc>
         <w:tc>
           <w:tcPr>
-            <w:tcW w:type="dxa" w:w="735"/>
-          </w:tcPr>
-          <w:p>
-            <w:pPr>
-              <w:pStyle w:val="Compact"/>
-              <w:spacing w:before="20" w:after="20" w:line="240" w:lineRule="auto"/>
-              <w:keepNext/>
-            </w:pPr>
-            <w:r>
-              <w:rPr>
-                <w:sz w:val="15"/>
-                <w:szCs w:val="15"/>
+            <w:tcW w:type="dxa" w:w="769"/>
+          </w:tcPr>
+          <w:p>
+            <w:pPr>
+              <w:pStyle w:val="Compact"/>
+              <w:spacing w:before="20" w:after="20" w:line="240" w:lineRule="auto"/>
+              <w:keepNext/>
+            </w:pPr>
+            <w:r>
+              <w:rPr>
+                <w:sz w:val="13"/>
+                <w:szCs w:val="13"/>
               </w:rPr>
               <w:t xml:space="preserve">1.403***</w:t>
             </w:r>
@@ -9280,18 +9280,18 @@
         </w:tc>
         <w:tc>
           <w:tcPr>
-            <w:tcW w:type="dxa" w:w="951"/>
-          </w:tcPr>
-          <w:p>
-            <w:pPr>
-              <w:pStyle w:val="Compact"/>
-              <w:spacing w:before="20" w:after="20" w:line="240" w:lineRule="auto"/>
-              <w:keepNext/>
-            </w:pPr>
-            <w:r>
-              <w:rPr>
-                <w:sz w:val="15"/>
-                <w:szCs w:val="15"/>
+            <w:tcW w:type="dxa" w:w="988"/>
+          </w:tcPr>
+          <w:p>
+            <w:pPr>
+              <w:pStyle w:val="Compact"/>
+              <w:spacing w:before="20" w:after="20" w:line="240" w:lineRule="auto"/>
+              <w:keepNext/>
+            </w:pPr>
+            <w:r>
+              <w:rPr>
+                <w:sz w:val="13"/>
+                <w:szCs w:val="13"/>
               </w:rPr>
               <w:t xml:space="preserve">0.905</w:t>
             </w:r>
@@ -9299,18 +9299,18 @@
         </w:tc>
         <w:tc>
           <w:tcPr>
-            <w:tcW w:type="dxa" w:w="984"/>
-          </w:tcPr>
-          <w:p>
-            <w:pPr>
-              <w:pStyle w:val="Compact"/>
-              <w:spacing w:before="20" w:after="20" w:line="240" w:lineRule="auto"/>
-              <w:keepNext/>
-            </w:pPr>
-            <w:r>
-              <w:rPr>
-                <w:sz w:val="15"/>
-                <w:szCs w:val="15"/>
+            <w:tcW w:type="dxa" w:w="1017"/>
+          </w:tcPr>
+          <w:p>
+            <w:pPr>
+              <w:pStyle w:val="Compact"/>
+              <w:spacing w:before="20" w:after="20" w:line="240" w:lineRule="auto"/>
+              <w:keepNext/>
+            </w:pPr>
+            <w:r>
+              <w:rPr>
+                <w:sz w:val="13"/>
+                <w:szCs w:val="13"/>
               </w:rPr>
               <w:t xml:space="preserve">0.993</w:t>
             </w:r>
@@ -9318,18 +9318,18 @@
         </w:tc>
         <w:tc>
           <w:tcPr>
-            <w:tcW w:type="dxa" w:w="1180"/>
-          </w:tcPr>
-          <w:p>
-            <w:pPr>
-              <w:pStyle w:val="Compact"/>
-              <w:spacing w:before="20" w:after="20" w:line="240" w:lineRule="auto"/>
-              <w:keepNext/>
-            </w:pPr>
-            <w:r>
-              <w:rPr>
-                <w:sz w:val="15"/>
-                <w:szCs w:val="15"/>
+            <w:tcW w:type="dxa" w:w="1215"/>
+          </w:tcPr>
+          <w:p>
+            <w:pPr>
+              <w:pStyle w:val="Compact"/>
+              <w:spacing w:before="20" w:after="20" w:line="240" w:lineRule="auto"/>
+              <w:keepNext/>
+            </w:pPr>
+            <w:r>
+              <w:rPr>
+                <w:sz w:val="13"/>
+                <w:szCs w:val="13"/>
               </w:rPr>
               <w:t xml:space="preserve">0.913***</w:t>
             </w:r>
@@ -9337,18 +9337,18 @@
         </w:tc>
         <w:tc>
           <w:tcPr>
-            <w:tcW w:type="dxa" w:w="779"/>
-          </w:tcPr>
-          <w:p>
-            <w:pPr>
-              <w:pStyle w:val="Compact"/>
-              <w:spacing w:before="20" w:after="20" w:line="240" w:lineRule="auto"/>
-              <w:keepNext/>
-            </w:pPr>
-            <w:r>
-              <w:rPr>
-                <w:sz w:val="15"/>
-                <w:szCs w:val="15"/>
+            <w:tcW w:type="dxa" w:w="809"/>
+          </w:tcPr>
+          <w:p>
+            <w:pPr>
+              <w:pStyle w:val="Compact"/>
+              <w:spacing w:before="20" w:after="20" w:line="240" w:lineRule="auto"/>
+              <w:keepNext/>
+            </w:pPr>
+            <w:r>
+              <w:rPr>
+                <w:sz w:val="13"/>
+                <w:szCs w:val="13"/>
               </w:rPr>
               <w:t xml:space="preserve">2.687***</w:t>
             </w:r>
@@ -9356,18 +9356,18 @@
         </w:tc>
         <w:tc>
           <w:tcPr>
-            <w:tcW w:type="dxa" w:w="779"/>
-          </w:tcPr>
-          <w:p>
-            <w:pPr>
-              <w:pStyle w:val="Compact"/>
-              <w:spacing w:before="20" w:after="20" w:line="240" w:lineRule="auto"/>
-              <w:keepNext/>
-            </w:pPr>
-            <w:r>
-              <w:rPr>
-                <w:sz w:val="15"/>
-                <w:szCs w:val="15"/>
+            <w:tcW w:type="dxa" w:w="809"/>
+          </w:tcPr>
+          <w:p>
+            <w:pPr>
+              <w:pStyle w:val="Compact"/>
+              <w:spacing w:before="20" w:after="20" w:line="240" w:lineRule="auto"/>
+              <w:keepNext/>
+            </w:pPr>
+            <w:r>
+              <w:rPr>
+                <w:sz w:val="13"/>
+                <w:szCs w:val="13"/>
               </w:rPr>
               <w:t xml:space="preserve">0.086*</w:t>
             </w:r>
@@ -9375,18 +9375,18 @@
         </w:tc>
         <w:tc>
           <w:tcPr>
-            <w:tcW w:type="dxa" w:w="1141"/>
-          </w:tcPr>
-          <w:p>
-            <w:pPr>
-              <w:pStyle w:val="Compact"/>
-              <w:spacing w:before="20" w:after="20" w:line="240" w:lineRule="auto"/>
-              <w:keepNext/>
-            </w:pPr>
-            <w:r>
-              <w:rPr>
-                <w:sz w:val="15"/>
-                <w:szCs w:val="15"/>
+            <w:tcW w:type="dxa" w:w="1195"/>
+          </w:tcPr>
+          <w:p>
+            <w:pPr>
+              <w:pStyle w:val="Compact"/>
+              <w:spacing w:before="20" w:after="20" w:line="240" w:lineRule="auto"/>
+              <w:keepNext/>
+            </w:pPr>
+            <w:r>
+              <w:rPr>
+                <w:sz w:val="13"/>
+                <w:szCs w:val="13"/>
               </w:rPr>
               <w:t xml:space="preserve">1.015</w:t>
             </w:r>
@@ -9399,18 +9399,18 @@
         </w:trPr>
         <w:tc>
           <w:tcPr>
-            <w:tcW w:type="dxa" w:w="1850"/>
-          </w:tcPr>
-          <w:p>
-            <w:pPr>
-              <w:pStyle w:val="Compact"/>
-              <w:spacing w:before="20" w:after="20" w:line="240" w:lineRule="auto"/>
-              <w:keepNext/>
-            </w:pPr>
-            <w:r>
-              <w:rPr>
-                <w:sz w:val="15"/>
-                <w:szCs w:val="15"/>
+            <w:tcW w:type="dxa" w:w="1916"/>
+          </w:tcPr>
+          <w:p>
+            <w:pPr>
+              <w:pStyle w:val="Compact"/>
+              <w:spacing w:before="20" w:after="20" w:line="240" w:lineRule="auto"/>
+              <w:keepNext/>
+            </w:pPr>
+            <w:r>
+              <w:rPr>
+                <w:sz w:val="13"/>
+                <w:szCs w:val="13"/>
               </w:rPr>
               <w:t xml:space="preserve">조정 범위(breadth_adj)</w:t>
             </w:r>
@@ -9418,7 +9418,7 @@
         </w:tc>
         <w:tc>
           <w:tcPr>
-            <w:tcW w:type="dxa" w:w="666"/>
+            <w:tcW w:type="dxa" w:w="355"/>
           </w:tcPr>
           <w:p>
             <w:pPr>
@@ -9429,8 +9429,8 @@
             </w:pPr>
             <w:r>
               <w:rPr>
-                <w:sz w:val="15"/>
-                <w:szCs w:val="15"/>
+                <w:sz w:val="13"/>
+                <w:szCs w:val="13"/>
               </w:rPr>
               <w:t xml:space="preserve">928</w:t>
             </w:r>
@@ -9438,18 +9438,18 @@
         </w:tc>
         <w:tc>
           <w:tcPr>
-            <w:tcW w:type="dxa" w:w="735"/>
-          </w:tcPr>
-          <w:p>
-            <w:pPr>
-              <w:pStyle w:val="Compact"/>
-              <w:spacing w:before="20" w:after="20" w:line="240" w:lineRule="auto"/>
-              <w:keepNext/>
-            </w:pPr>
-            <w:r>
-              <w:rPr>
-                <w:sz w:val="15"/>
-                <w:szCs w:val="15"/>
+            <w:tcW w:type="dxa" w:w="769"/>
+          </w:tcPr>
+          <w:p>
+            <w:pPr>
+              <w:pStyle w:val="Compact"/>
+              <w:spacing w:before="20" w:after="20" w:line="240" w:lineRule="auto"/>
+              <w:keepNext/>
+            </w:pPr>
+            <w:r>
+              <w:rPr>
+                <w:sz w:val="13"/>
+                <w:szCs w:val="13"/>
               </w:rPr>
               <w:t xml:space="preserve">1.262***</w:t>
             </w:r>
@@ -9457,18 +9457,18 @@
         </w:tc>
         <w:tc>
           <w:tcPr>
-            <w:tcW w:type="dxa" w:w="951"/>
-          </w:tcPr>
-          <w:p>
-            <w:pPr>
-              <w:pStyle w:val="Compact"/>
-              <w:spacing w:before="20" w:after="20" w:line="240" w:lineRule="auto"/>
-              <w:keepNext/>
-            </w:pPr>
-            <w:r>
-              <w:rPr>
-                <w:sz w:val="15"/>
-                <w:szCs w:val="15"/>
+            <w:tcW w:type="dxa" w:w="988"/>
+          </w:tcPr>
+          <w:p>
+            <w:pPr>
+              <w:pStyle w:val="Compact"/>
+              <w:spacing w:before="20" w:after="20" w:line="240" w:lineRule="auto"/>
+              <w:keepNext/>
+            </w:pPr>
+            <w:r>
+              <w:rPr>
+                <w:sz w:val="13"/>
+                <w:szCs w:val="13"/>
               </w:rPr>
               <w:t xml:space="preserve">0.915**</w:t>
             </w:r>
@@ -9476,18 +9476,18 @@
         </w:tc>
         <w:tc>
           <w:tcPr>
-            <w:tcW w:type="dxa" w:w="984"/>
-          </w:tcPr>
-          <w:p>
-            <w:pPr>
-              <w:pStyle w:val="Compact"/>
-              <w:spacing w:before="20" w:after="20" w:line="240" w:lineRule="auto"/>
-              <w:keepNext/>
-            </w:pPr>
-            <w:r>
-              <w:rPr>
-                <w:sz w:val="15"/>
-                <w:szCs w:val="15"/>
+            <w:tcW w:type="dxa" w:w="1017"/>
+          </w:tcPr>
+          <w:p>
+            <w:pPr>
+              <w:pStyle w:val="Compact"/>
+              <w:spacing w:before="20" w:after="20" w:line="240" w:lineRule="auto"/>
+              <w:keepNext/>
+            </w:pPr>
+            <w:r>
+              <w:rPr>
+                <w:sz w:val="13"/>
+                <w:szCs w:val="13"/>
               </w:rPr>
               <w:t xml:space="preserve">1.002</w:t>
             </w:r>
@@ -9495,18 +9495,18 @@
         </w:tc>
         <w:tc>
           <w:tcPr>
-            <w:tcW w:type="dxa" w:w="1180"/>
-          </w:tcPr>
-          <w:p>
-            <w:pPr>
-              <w:pStyle w:val="Compact"/>
-              <w:spacing w:before="20" w:after="20" w:line="240" w:lineRule="auto"/>
-              <w:keepNext/>
-            </w:pPr>
-            <w:r>
-              <w:rPr>
-                <w:sz w:val="15"/>
-                <w:szCs w:val="15"/>
+            <w:tcW w:type="dxa" w:w="1215"/>
+          </w:tcPr>
+          <w:p>
+            <w:pPr>
+              <w:pStyle w:val="Compact"/>
+              <w:spacing w:before="20" w:after="20" w:line="240" w:lineRule="auto"/>
+              <w:keepNext/>
+            </w:pPr>
+            <w:r>
+              <w:rPr>
+                <w:sz w:val="13"/>
+                <w:szCs w:val="13"/>
               </w:rPr>
               <w:t xml:space="preserve">0.911***</w:t>
             </w:r>
@@ -9514,18 +9514,18 @@
         </w:tc>
         <w:tc>
           <w:tcPr>
-            <w:tcW w:type="dxa" w:w="779"/>
-          </w:tcPr>
-          <w:p>
-            <w:pPr>
-              <w:pStyle w:val="Compact"/>
-              <w:spacing w:before="20" w:after="20" w:line="240" w:lineRule="auto"/>
-              <w:keepNext/>
-            </w:pPr>
-            <w:r>
-              <w:rPr>
-                <w:sz w:val="15"/>
-                <w:szCs w:val="15"/>
+            <w:tcW w:type="dxa" w:w="809"/>
+          </w:tcPr>
+          <w:p>
+            <w:pPr>
+              <w:pStyle w:val="Compact"/>
+              <w:spacing w:before="20" w:after="20" w:line="240" w:lineRule="auto"/>
+              <w:keepNext/>
+            </w:pPr>
+            <w:r>
+              <w:rPr>
+                <w:sz w:val="13"/>
+                <w:szCs w:val="13"/>
               </w:rPr>
               <w:t xml:space="preserve">2.720***</w:t>
             </w:r>
@@ -9533,18 +9533,18 @@
         </w:tc>
         <w:tc>
           <w:tcPr>
-            <w:tcW w:type="dxa" w:w="779"/>
-          </w:tcPr>
-          <w:p>
-            <w:pPr>
-              <w:pStyle w:val="Compact"/>
-              <w:spacing w:before="20" w:after="20" w:line="240" w:lineRule="auto"/>
-              <w:keepNext/>
-            </w:pPr>
-            <w:r>
-              <w:rPr>
-                <w:sz w:val="15"/>
-                <w:szCs w:val="15"/>
+            <w:tcW w:type="dxa" w:w="809"/>
+          </w:tcPr>
+          <w:p>
+            <w:pPr>
+              <w:pStyle w:val="Compact"/>
+              <w:spacing w:before="20" w:after="20" w:line="240" w:lineRule="auto"/>
+              <w:keepNext/>
+            </w:pPr>
+            <w:r>
+              <w:rPr>
+                <w:sz w:val="13"/>
+                <w:szCs w:val="13"/>
               </w:rPr>
               <w:t xml:space="preserve">0.087***</w:t>
             </w:r>
@@ -9552,18 +9552,18 @@
         </w:tc>
         <w:tc>
           <w:tcPr>
-            <w:tcW w:type="dxa" w:w="1141"/>
-          </w:tcPr>
-          <w:p>
-            <w:pPr>
-              <w:pStyle w:val="Compact"/>
-              <w:spacing w:before="20" w:after="20" w:line="240" w:lineRule="auto"/>
-              <w:keepNext/>
-            </w:pPr>
-            <w:r>
-              <w:rPr>
-                <w:sz w:val="15"/>
-                <w:szCs w:val="15"/>
+            <w:tcW w:type="dxa" w:w="1195"/>
+          </w:tcPr>
+          <w:p>
+            <w:pPr>
+              <w:pStyle w:val="Compact"/>
+              <w:spacing w:before="20" w:after="20" w:line="240" w:lineRule="auto"/>
+              <w:keepNext/>
+            </w:pPr>
+            <w:r>
+              <w:rPr>
+                <w:sz w:val="13"/>
+                <w:szCs w:val="13"/>
               </w:rPr>
               <w:t xml:space="preserve">—</w:t>
             </w:r>
@@ -9576,18 +9576,18 @@
         </w:trPr>
         <w:tc>
           <w:tcPr>
-            <w:tcW w:type="dxa" w:w="1850"/>
-          </w:tcPr>
-          <w:p>
-            <w:pPr>
-              <w:pStyle w:val="Compact"/>
-              <w:spacing w:before="20" w:after="20" w:line="240" w:lineRule="auto"/>
-              <w:keepNext/>
-            </w:pPr>
-            <w:r>
-              <w:rPr>
-                <w:sz w:val="15"/>
-                <w:szCs w:val="15"/>
+            <w:tcW w:type="dxa" w:w="1916"/>
+          </w:tcPr>
+          <w:p>
+            <w:pPr>
+              <w:pStyle w:val="Compact"/>
+              <w:spacing w:before="20" w:after="20" w:line="240" w:lineRule="auto"/>
+              <w:keepNext/>
+            </w:pPr>
+            <w:r>
+              <w:rPr>
+                <w:sz w:val="13"/>
+                <w:szCs w:val="13"/>
               </w:rPr>
               <w:t xml:space="preserve">2010년 이후 표본</w:t>
             </w:r>
@@ -9595,7 +9595,7 @@
         </w:tc>
         <w:tc>
           <w:tcPr>
-            <w:tcW w:type="dxa" w:w="666"/>
+            <w:tcW w:type="dxa" w:w="355"/>
           </w:tcPr>
           <w:p>
             <w:pPr>
@@ -9606,8 +9606,8 @@
             </w:pPr>
             <w:r>
               <w:rPr>
-                <w:sz w:val="15"/>
-                <w:szCs w:val="15"/>
+                <w:sz w:val="13"/>
+                <w:szCs w:val="13"/>
               </w:rPr>
               <w:t xml:space="preserve">830</w:t>
             </w:r>
@@ -9615,18 +9615,18 @@
         </w:tc>
         <w:tc>
           <w:tcPr>
-            <w:tcW w:type="dxa" w:w="735"/>
-          </w:tcPr>
-          <w:p>
-            <w:pPr>
-              <w:pStyle w:val="Compact"/>
-              <w:spacing w:before="20" w:after="20" w:line="240" w:lineRule="auto"/>
-              <w:keepNext/>
-            </w:pPr>
-            <w:r>
-              <w:rPr>
-                <w:sz w:val="15"/>
-                <w:szCs w:val="15"/>
+            <w:tcW w:type="dxa" w:w="769"/>
+          </w:tcPr>
+          <w:p>
+            <w:pPr>
+              <w:pStyle w:val="Compact"/>
+              <w:spacing w:before="20" w:after="20" w:line="240" w:lineRule="auto"/>
+              <w:keepNext/>
+            </w:pPr>
+            <w:r>
+              <w:rPr>
+                <w:sz w:val="13"/>
+                <w:szCs w:val="13"/>
               </w:rPr>
               <w:t xml:space="preserve">1.385***</w:t>
             </w:r>
@@ -9634,18 +9634,18 @@
         </w:tc>
         <w:tc>
           <w:tcPr>
-            <w:tcW w:type="dxa" w:w="951"/>
-          </w:tcPr>
-          <w:p>
-            <w:pPr>
-              <w:pStyle w:val="Compact"/>
-              <w:spacing w:before="20" w:after="20" w:line="240" w:lineRule="auto"/>
-              <w:keepNext/>
-            </w:pPr>
-            <w:r>
-              <w:rPr>
-                <w:sz w:val="15"/>
-                <w:szCs w:val="15"/>
+            <w:tcW w:type="dxa" w:w="988"/>
+          </w:tcPr>
+          <w:p>
+            <w:pPr>
+              <w:pStyle w:val="Compact"/>
+              <w:spacing w:before="20" w:after="20" w:line="240" w:lineRule="auto"/>
+              <w:keepNext/>
+            </w:pPr>
+            <w:r>
+              <w:rPr>
+                <w:sz w:val="13"/>
+                <w:szCs w:val="13"/>
               </w:rPr>
               <w:t xml:space="preserve">0.910*</w:t>
             </w:r>
@@ -9653,18 +9653,18 @@
         </w:tc>
         <w:tc>
           <w:tcPr>
-            <w:tcW w:type="dxa" w:w="984"/>
-          </w:tcPr>
-          <w:p>
-            <w:pPr>
-              <w:pStyle w:val="Compact"/>
-              <w:spacing w:before="20" w:after="20" w:line="240" w:lineRule="auto"/>
-              <w:keepNext/>
-            </w:pPr>
-            <w:r>
-              <w:rPr>
-                <w:sz w:val="15"/>
-                <w:szCs w:val="15"/>
+            <w:tcW w:type="dxa" w:w="1017"/>
+          </w:tcPr>
+          <w:p>
+            <w:pPr>
+              <w:pStyle w:val="Compact"/>
+              <w:spacing w:before="20" w:after="20" w:line="240" w:lineRule="auto"/>
+              <w:keepNext/>
+            </w:pPr>
+            <w:r>
+              <w:rPr>
+                <w:sz w:val="13"/>
+                <w:szCs w:val="13"/>
               </w:rPr>
               <w:t xml:space="preserve">0.934**</w:t>
             </w:r>
@@ -9672,18 +9672,18 @@
         </w:tc>
         <w:tc>
           <w:tcPr>
-            <w:tcW w:type="dxa" w:w="1180"/>
-          </w:tcPr>
-          <w:p>
-            <w:pPr>
-              <w:pStyle w:val="Compact"/>
-              <w:spacing w:before="20" w:after="20" w:line="240" w:lineRule="auto"/>
-              <w:keepNext/>
-            </w:pPr>
-            <w:r>
-              <w:rPr>
-                <w:sz w:val="15"/>
-                <w:szCs w:val="15"/>
+            <w:tcW w:type="dxa" w:w="1215"/>
+          </w:tcPr>
+          <w:p>
+            <w:pPr>
+              <w:pStyle w:val="Compact"/>
+              <w:spacing w:before="20" w:after="20" w:line="240" w:lineRule="auto"/>
+              <w:keepNext/>
+            </w:pPr>
+            <w:r>
+              <w:rPr>
+                <w:sz w:val="13"/>
+                <w:szCs w:val="13"/>
               </w:rPr>
               <w:t xml:space="preserve">0.862***</w:t>
             </w:r>
@@ -9691,18 +9691,18 @@
         </w:tc>
         <w:tc>
           <w:tcPr>
-            <w:tcW w:type="dxa" w:w="779"/>
-          </w:tcPr>
-          <w:p>
-            <w:pPr>
-              <w:pStyle w:val="Compact"/>
-              <w:spacing w:before="20" w:after="20" w:line="240" w:lineRule="auto"/>
-              <w:keepNext/>
-            </w:pPr>
-            <w:r>
-              <w:rPr>
-                <w:sz w:val="15"/>
-                <w:szCs w:val="15"/>
+            <w:tcW w:type="dxa" w:w="809"/>
+          </w:tcPr>
+          <w:p>
+            <w:pPr>
+              <w:pStyle w:val="Compact"/>
+              <w:spacing w:before="20" w:after="20" w:line="240" w:lineRule="auto"/>
+              <w:keepNext/>
+            </w:pPr>
+            <w:r>
+              <w:rPr>
+                <w:sz w:val="13"/>
+                <w:szCs w:val="13"/>
               </w:rPr>
               <w:t xml:space="preserve">2.701***</w:t>
             </w:r>
@@ -9710,18 +9710,18 @@
         </w:tc>
         <w:tc>
           <w:tcPr>
-            <w:tcW w:type="dxa" w:w="779"/>
-          </w:tcPr>
-          <w:p>
-            <w:pPr>
-              <w:pStyle w:val="Compact"/>
-              <w:spacing w:before="20" w:after="20" w:line="240" w:lineRule="auto"/>
-              <w:keepNext/>
-            </w:pPr>
-            <w:r>
-              <w:rPr>
-                <w:sz w:val="15"/>
-                <w:szCs w:val="15"/>
+            <w:tcW w:type="dxa" w:w="809"/>
+          </w:tcPr>
+          <w:p>
+            <w:pPr>
+              <w:pStyle w:val="Compact"/>
+              <w:spacing w:before="20" w:after="20" w:line="240" w:lineRule="auto"/>
+              <w:keepNext/>
+            </w:pPr>
+            <w:r>
+              <w:rPr>
+                <w:sz w:val="13"/>
+                <w:szCs w:val="13"/>
               </w:rPr>
               <w:t xml:space="preserve">3.240</w:t>
             </w:r>
@@ -9729,18 +9729,18 @@
         </w:tc>
         <w:tc>
           <w:tcPr>
-            <w:tcW w:type="dxa" w:w="1141"/>
-          </w:tcPr>
-          <w:p>
-            <w:pPr>
-              <w:pStyle w:val="Compact"/>
-              <w:spacing w:before="20" w:after="20" w:line="240" w:lineRule="auto"/>
-              <w:keepNext/>
-            </w:pPr>
-            <w:r>
-              <w:rPr>
-                <w:sz w:val="15"/>
-                <w:szCs w:val="15"/>
+            <w:tcW w:type="dxa" w:w="1195"/>
+          </w:tcPr>
+          <w:p>
+            <w:pPr>
+              <w:pStyle w:val="Compact"/>
+              <w:spacing w:before="20" w:after="20" w:line="240" w:lineRule="auto"/>
+              <w:keepNext/>
+            </w:pPr>
+            <w:r>
+              <w:rPr>
+                <w:sz w:val="13"/>
+                <w:szCs w:val="13"/>
               </w:rPr>
               <w:t xml:space="preserve">0.970***</w:t>
             </w:r>
@@ -9753,18 +9753,18 @@
         </w:trPr>
         <w:tc>
           <w:tcPr>
-            <w:tcW w:type="dxa" w:w="1850"/>
-          </w:tcPr>
-          <w:p>
-            <w:pPr>
-              <w:pStyle w:val="Compact"/>
-              <w:spacing w:before="20" w:after="20" w:line="240" w:lineRule="auto"/>
-              <w:keepNext/>
-            </w:pPr>
-            <w:r>
-              <w:rPr>
-                <w:sz w:val="15"/>
-                <w:szCs w:val="15"/>
+            <w:tcW w:type="dxa" w:w="1916"/>
+          </w:tcPr>
+          <w:p>
+            <w:pPr>
+              <w:pStyle w:val="Compact"/>
+              <w:spacing w:before="20" w:after="20" w:line="240" w:lineRule="auto"/>
+              <w:keepNext/>
+            </w:pPr>
+            <w:r>
+              <w:rPr>
+                <w:sz w:val="13"/>
+                <w:szCs w:val="13"/>
               </w:rPr>
               <w:t xml:space="preserve">기간 더미(2015–2019년 / 2020–2024년)</w:t>
             </w:r>
@@ -9772,7 +9772,7 @@
         </w:tc>
         <w:tc>
           <w:tcPr>
-            <w:tcW w:type="dxa" w:w="666"/>
+            <w:tcW w:type="dxa" w:w="355"/>
           </w:tcPr>
           <w:p>
             <w:pPr>
@@ -9783,8 +9783,8 @@
             </w:pPr>
             <w:r>
               <w:rPr>
-                <w:sz w:val="15"/>
-                <w:szCs w:val="15"/>
+                <w:sz w:val="13"/>
+                <w:szCs w:val="13"/>
               </w:rPr>
               <w:t xml:space="preserve">928</w:t>
             </w:r>
@@ -9792,18 +9792,18 @@
         </w:tc>
         <w:tc>
           <w:tcPr>
-            <w:tcW w:type="dxa" w:w="735"/>
-          </w:tcPr>
-          <w:p>
-            <w:pPr>
-              <w:pStyle w:val="Compact"/>
-              <w:spacing w:before="20" w:after="20" w:line="240" w:lineRule="auto"/>
-              <w:keepNext/>
-            </w:pPr>
-            <w:r>
-              <w:rPr>
-                <w:sz w:val="15"/>
-                <w:szCs w:val="15"/>
+            <w:tcW w:type="dxa" w:w="769"/>
+          </w:tcPr>
+          <w:p>
+            <w:pPr>
+              <w:pStyle w:val="Compact"/>
+              <w:spacing w:before="20" w:after="20" w:line="240" w:lineRule="auto"/>
+              <w:keepNext/>
+            </w:pPr>
+            <w:r>
+              <w:rPr>
+                <w:sz w:val="13"/>
+                <w:szCs w:val="13"/>
               </w:rPr>
               <w:t xml:space="preserve">1.397***</w:t>
             </w:r>
@@ -9811,18 +9811,18 @@
         </w:tc>
         <w:tc>
           <w:tcPr>
-            <w:tcW w:type="dxa" w:w="951"/>
-          </w:tcPr>
-          <w:p>
-            <w:pPr>
-              <w:pStyle w:val="Compact"/>
-              <w:spacing w:before="20" w:after="20" w:line="240" w:lineRule="auto"/>
-              <w:keepNext/>
-            </w:pPr>
-            <w:r>
-              <w:rPr>
-                <w:sz w:val="15"/>
-                <w:szCs w:val="15"/>
+            <w:tcW w:type="dxa" w:w="988"/>
+          </w:tcPr>
+          <w:p>
+            <w:pPr>
+              <w:pStyle w:val="Compact"/>
+              <w:spacing w:before="20" w:after="20" w:line="240" w:lineRule="auto"/>
+              <w:keepNext/>
+            </w:pPr>
+            <w:r>
+              <w:rPr>
+                <w:sz w:val="13"/>
+                <w:szCs w:val="13"/>
               </w:rPr>
               <w:t xml:space="preserve">0.897**</w:t>
             </w:r>
@@ -9830,18 +9830,18 @@
         </w:tc>
         <w:tc>
           <w:tcPr>
-            <w:tcW w:type="dxa" w:w="984"/>
-          </w:tcPr>
-          <w:p>
-            <w:pPr>
-              <w:pStyle w:val="Compact"/>
-              <w:spacing w:before="20" w:after="20" w:line="240" w:lineRule="auto"/>
-              <w:keepNext/>
-            </w:pPr>
-            <w:r>
-              <w:rPr>
-                <w:sz w:val="15"/>
-                <w:szCs w:val="15"/>
+            <w:tcW w:type="dxa" w:w="1017"/>
+          </w:tcPr>
+          <w:p>
+            <w:pPr>
+              <w:pStyle w:val="Compact"/>
+              <w:spacing w:before="20" w:after="20" w:line="240" w:lineRule="auto"/>
+              <w:keepNext/>
+            </w:pPr>
+            <w:r>
+              <w:rPr>
+                <w:sz w:val="13"/>
+                <w:szCs w:val="13"/>
               </w:rPr>
               <w:t xml:space="preserve">1.707* / 0.762</w:t>
             </w:r>
@@ -9849,18 +9849,18 @@
         </w:tc>
         <w:tc>
           <w:tcPr>
-            <w:tcW w:type="dxa" w:w="1180"/>
-          </w:tcPr>
-          <w:p>
-            <w:pPr>
-              <w:pStyle w:val="Compact"/>
-              <w:spacing w:before="20" w:after="20" w:line="240" w:lineRule="auto"/>
-              <w:keepNext/>
-            </w:pPr>
-            <w:r>
-              <w:rPr>
-                <w:sz w:val="15"/>
-                <w:szCs w:val="15"/>
+            <w:tcW w:type="dxa" w:w="1215"/>
+          </w:tcPr>
+          <w:p>
+            <w:pPr>
+              <w:pStyle w:val="Compact"/>
+              <w:spacing w:before="20" w:after="20" w:line="240" w:lineRule="auto"/>
+              <w:keepNext/>
+            </w:pPr>
+            <w:r>
+              <w:rPr>
+                <w:sz w:val="13"/>
+                <w:szCs w:val="13"/>
               </w:rPr>
               <w:t xml:space="preserve">0.273*** / 0.101***</w:t>
             </w:r>
@@ -9868,18 +9868,18 @@
         </w:tc>
         <w:tc>
           <w:tcPr>
-            <w:tcW w:type="dxa" w:w="779"/>
-          </w:tcPr>
-          <w:p>
-            <w:pPr>
-              <w:pStyle w:val="Compact"/>
-              <w:spacing w:before="20" w:after="20" w:line="240" w:lineRule="auto"/>
-              <w:keepNext/>
-            </w:pPr>
-            <w:r>
-              <w:rPr>
-                <w:sz w:val="15"/>
-                <w:szCs w:val="15"/>
+            <w:tcW w:type="dxa" w:w="809"/>
+          </w:tcPr>
+          <w:p>
+            <w:pPr>
+              <w:pStyle w:val="Compact"/>
+              <w:spacing w:before="20" w:after="20" w:line="240" w:lineRule="auto"/>
+              <w:keepNext/>
+            </w:pPr>
+            <w:r>
+              <w:rPr>
+                <w:sz w:val="13"/>
+                <w:szCs w:val="13"/>
               </w:rPr>
               <w:t xml:space="preserve">2.898***</w:t>
             </w:r>
@@ -9887,18 +9887,18 @@
         </w:tc>
         <w:tc>
           <w:tcPr>
-            <w:tcW w:type="dxa" w:w="779"/>
-          </w:tcPr>
-          <w:p>
-            <w:pPr>
-              <w:pStyle w:val="Compact"/>
-              <w:spacing w:before="20" w:after="20" w:line="240" w:lineRule="auto"/>
-              <w:keepNext/>
-            </w:pPr>
-            <w:r>
-              <w:rPr>
-                <w:sz w:val="15"/>
-                <w:szCs w:val="15"/>
+            <w:tcW w:type="dxa" w:w="809"/>
+          </w:tcPr>
+          <w:p>
+            <w:pPr>
+              <w:pStyle w:val="Compact"/>
+              <w:spacing w:before="20" w:after="20" w:line="240" w:lineRule="auto"/>
+              <w:keepNext/>
+            </w:pPr>
+            <w:r>
+              <w:rPr>
+                <w:sz w:val="13"/>
+                <w:szCs w:val="13"/>
               </w:rPr>
               <w:t xml:space="preserve">0.239**</w:t>
             </w:r>
@@ -9906,18 +9906,18 @@
         </w:tc>
         <w:tc>
           <w:tcPr>
-            <w:tcW w:type="dxa" w:w="1141"/>
-          </w:tcPr>
-          <w:p>
-            <w:pPr>
-              <w:pStyle w:val="Compact"/>
-              <w:spacing w:before="20" w:after="20" w:line="240" w:lineRule="auto"/>
-              <w:keepNext/>
-            </w:pPr>
-            <w:r>
-              <w:rPr>
-                <w:sz w:val="15"/>
-                <w:szCs w:val="15"/>
+            <w:tcW w:type="dxa" w:w="1195"/>
+          </w:tcPr>
+          <w:p>
+            <w:pPr>
+              <w:pStyle w:val="Compact"/>
+              <w:spacing w:before="20" w:after="20" w:line="240" w:lineRule="auto"/>
+              <w:keepNext/>
+            </w:pPr>
+            <w:r>
+              <w:rPr>
+                <w:sz w:val="13"/>
+                <w:szCs w:val="13"/>
               </w:rPr>
               <w:t xml:space="preserve">—</w:t>
             </w:r>
@@ -9930,18 +9930,18 @@
         </w:trPr>
         <w:tc>
           <w:tcPr>
-            <w:tcW w:type="dxa" w:w="1850"/>
-          </w:tcPr>
-          <w:p>
-            <w:pPr>
-              <w:pStyle w:val="Compact"/>
-              <w:spacing w:before="20" w:after="20" w:line="240" w:lineRule="auto"/>
-              <w:keepNext/>
-            </w:pPr>
-            <w:r>
-              <w:rPr>
-                <w:sz w:val="15"/>
-                <w:szCs w:val="15"/>
+            <w:tcW w:type="dxa" w:w="1916"/>
+          </w:tcPr>
+          <w:p>
+            <w:pPr>
+              <w:pStyle w:val="Compact"/>
+              <w:spacing w:before="20" w:after="20" w:line="240" w:lineRule="auto"/>
+              <w:keepNext/>
+            </w:pPr>
+            <w:r>
+              <w:rPr>
+                <w:sz w:val="13"/>
+                <w:szCs w:val="13"/>
               </w:rPr>
               <w:t xml:space="preserve">2023–2024년 제외</w:t>
             </w:r>
@@ -9949,7 +9949,7 @@
         </w:tc>
         <w:tc>
           <w:tcPr>
-            <w:tcW w:type="dxa" w:w="666"/>
+            <w:tcW w:type="dxa" w:w="355"/>
           </w:tcPr>
           <w:p>
             <w:pPr>
@@ -9960,8 +9960,8 @@
             </w:pPr>
             <w:r>
               <w:rPr>
-                <w:sz w:val="15"/>
-                <w:szCs w:val="15"/>
+                <w:sz w:val="13"/>
+                <w:szCs w:val="13"/>
               </w:rPr>
               <w:t xml:space="preserve">753</w:t>
             </w:r>
@@ -9969,18 +9969,18 @@
         </w:tc>
         <w:tc>
           <w:tcPr>
-            <w:tcW w:type="dxa" w:w="735"/>
-          </w:tcPr>
-          <w:p>
-            <w:pPr>
-              <w:pStyle w:val="Compact"/>
-              <w:spacing w:before="20" w:after="20" w:line="240" w:lineRule="auto"/>
-              <w:keepNext/>
-            </w:pPr>
-            <w:r>
-              <w:rPr>
-                <w:sz w:val="15"/>
-                <w:szCs w:val="15"/>
+            <w:tcW w:type="dxa" w:w="769"/>
+          </w:tcPr>
+          <w:p>
+            <w:pPr>
+              <w:pStyle w:val="Compact"/>
+              <w:spacing w:before="20" w:after="20" w:line="240" w:lineRule="auto"/>
+              <w:keepNext/>
+            </w:pPr>
+            <w:r>
+              <w:rPr>
+                <w:sz w:val="13"/>
+                <w:szCs w:val="13"/>
               </w:rPr>
               <w:t xml:space="preserve">1.418***</w:t>
             </w:r>
@@ -9988,18 +9988,18 @@
         </w:tc>
         <w:tc>
           <w:tcPr>
-            <w:tcW w:type="dxa" w:w="951"/>
-          </w:tcPr>
-          <w:p>
-            <w:pPr>
-              <w:pStyle w:val="Compact"/>
-              <w:spacing w:before="20" w:after="20" w:line="240" w:lineRule="auto"/>
-              <w:keepNext/>
-            </w:pPr>
-            <w:r>
-              <w:rPr>
-                <w:sz w:val="15"/>
-                <w:szCs w:val="15"/>
+            <w:tcW w:type="dxa" w:w="988"/>
+          </w:tcPr>
+          <w:p>
+            <w:pPr>
+              <w:pStyle w:val="Compact"/>
+              <w:spacing w:before="20" w:after="20" w:line="240" w:lineRule="auto"/>
+              <w:keepNext/>
+            </w:pPr>
+            <w:r>
+              <w:rPr>
+                <w:sz w:val="13"/>
+                <w:szCs w:val="13"/>
               </w:rPr>
               <w:t xml:space="preserve">0.908*</w:t>
             </w:r>
@@ -10007,18 +10007,18 @@
         </w:tc>
         <w:tc>
           <w:tcPr>
-            <w:tcW w:type="dxa" w:w="984"/>
-          </w:tcPr>
-          <w:p>
-            <w:pPr>
-              <w:pStyle w:val="Compact"/>
-              <w:spacing w:before="20" w:after="20" w:line="240" w:lineRule="auto"/>
-              <w:keepNext/>
-            </w:pPr>
-            <w:r>
-              <w:rPr>
-                <w:sz w:val="15"/>
-                <w:szCs w:val="15"/>
+            <w:tcW w:type="dxa" w:w="1017"/>
+          </w:tcPr>
+          <w:p>
+            <w:pPr>
+              <w:pStyle w:val="Compact"/>
+              <w:spacing w:before="20" w:after="20" w:line="240" w:lineRule="auto"/>
+              <w:keepNext/>
+            </w:pPr>
+            <w:r>
+              <w:rPr>
+                <w:sz w:val="13"/>
+                <w:szCs w:val="13"/>
               </w:rPr>
               <w:t xml:space="preserve">0.989</w:t>
             </w:r>
@@ -10026,18 +10026,18 @@
         </w:tc>
         <w:tc>
           <w:tcPr>
-            <w:tcW w:type="dxa" w:w="1180"/>
-          </w:tcPr>
-          <w:p>
-            <w:pPr>
-              <w:pStyle w:val="Compact"/>
-              <w:spacing w:before="20" w:after="20" w:line="240" w:lineRule="auto"/>
-              <w:keepNext/>
-            </w:pPr>
-            <w:r>
-              <w:rPr>
-                <w:sz w:val="15"/>
-                <w:szCs w:val="15"/>
+            <w:tcW w:type="dxa" w:w="1215"/>
+          </w:tcPr>
+          <w:p>
+            <w:pPr>
+              <w:pStyle w:val="Compact"/>
+              <w:spacing w:before="20" w:after="20" w:line="240" w:lineRule="auto"/>
+              <w:keepNext/>
+            </w:pPr>
+            <w:r>
+              <w:rPr>
+                <w:sz w:val="13"/>
+                <w:szCs w:val="13"/>
               </w:rPr>
               <w:t xml:space="preserve">0.909***</w:t>
             </w:r>
@@ -10045,18 +10045,18 @@
         </w:tc>
         <w:tc>
           <w:tcPr>
-            <w:tcW w:type="dxa" w:w="779"/>
-          </w:tcPr>
-          <w:p>
-            <w:pPr>
-              <w:pStyle w:val="Compact"/>
-              <w:spacing w:before="20" w:after="20" w:line="240" w:lineRule="auto"/>
-              <w:keepNext/>
-            </w:pPr>
-            <w:r>
-              <w:rPr>
-                <w:sz w:val="15"/>
-                <w:szCs w:val="15"/>
+            <w:tcW w:type="dxa" w:w="809"/>
+          </w:tcPr>
+          <w:p>
+            <w:pPr>
+              <w:pStyle w:val="Compact"/>
+              <w:spacing w:before="20" w:after="20" w:line="240" w:lineRule="auto"/>
+              <w:keepNext/>
+            </w:pPr>
+            <w:r>
+              <w:rPr>
+                <w:sz w:val="13"/>
+                <w:szCs w:val="13"/>
               </w:rPr>
               <w:t xml:space="preserve">1.651</w:t>
             </w:r>
@@ -10064,18 +10064,18 @@
         </w:tc>
         <w:tc>
           <w:tcPr>
-            <w:tcW w:type="dxa" w:w="779"/>
-          </w:tcPr>
-          <w:p>
-            <w:pPr>
-              <w:pStyle w:val="Compact"/>
-              <w:spacing w:before="20" w:after="20" w:line="240" w:lineRule="auto"/>
-              <w:keepNext/>
-            </w:pPr>
-            <w:r>
-              <w:rPr>
-                <w:sz w:val="15"/>
-                <w:szCs w:val="15"/>
+            <w:tcW w:type="dxa" w:w="809"/>
+          </w:tcPr>
+          <w:p>
+            <w:pPr>
+              <w:pStyle w:val="Compact"/>
+              <w:spacing w:before="20" w:after="20" w:line="240" w:lineRule="auto"/>
+              <w:keepNext/>
+            </w:pPr>
+            <w:r>
+              <w:rPr>
+                <w:sz w:val="13"/>
+                <w:szCs w:val="13"/>
               </w:rPr>
               <w:t xml:space="preserve">0.061***</w:t>
             </w:r>
@@ -10083,18 +10083,18 @@
         </w:tc>
         <w:tc>
           <w:tcPr>
-            <w:tcW w:type="dxa" w:w="1141"/>
-          </w:tcPr>
-          <w:p>
-            <w:pPr>
-              <w:pStyle w:val="Compact"/>
-              <w:spacing w:before="20" w:after="20" w:line="240" w:lineRule="auto"/>
-              <w:keepNext/>
-            </w:pPr>
-            <w:r>
-              <w:rPr>
-                <w:sz w:val="15"/>
-                <w:szCs w:val="15"/>
+            <w:tcW w:type="dxa" w:w="1195"/>
+          </w:tcPr>
+          <w:p>
+            <w:pPr>
+              <w:pStyle w:val="Compact"/>
+              <w:spacing w:before="20" w:after="20" w:line="240" w:lineRule="auto"/>
+              <w:keepNext/>
+            </w:pPr>
+            <w:r>
+              <w:rPr>
+                <w:sz w:val="13"/>
+                <w:szCs w:val="13"/>
               </w:rPr>
               <w:t xml:space="preserve">1.022***</w:t>
             </w:r>
@@ -10107,18 +10107,18 @@
         </w:trPr>
         <w:tc>
           <w:tcPr>
-            <w:tcW w:type="dxa" w:w="1850"/>
-          </w:tcPr>
-          <w:p>
-            <w:pPr>
-              <w:pStyle w:val="Compact"/>
-              <w:spacing w:before="20" w:after="20" w:line="240" w:lineRule="auto"/>
-              <w:keepNext/>
-            </w:pPr>
-            <w:r>
-              <w:rPr>
-                <w:sz w:val="15"/>
-                <w:szCs w:val="15"/>
+            <w:tcW w:type="dxa" w:w="1916"/>
+          </w:tcPr>
+          <w:p>
+            <w:pPr>
+              <w:pStyle w:val="Compact"/>
+              <w:spacing w:before="20" w:after="20" w:line="240" w:lineRule="auto"/>
+              <w:keepNext/>
+            </w:pPr>
+            <w:r>
+              <w:rPr>
+                <w:sz w:val="13"/>
+                <w:szCs w:val="13"/>
               </w:rPr>
               <w:t xml:space="preserve">패밀리 중복 제거(제목당 최초 1건)</w:t>
             </w:r>
@@ -10126,7 +10126,7 @@
         </w:tc>
         <w:tc>
           <w:tcPr>
-            <w:tcW w:type="dxa" w:w="666"/>
+            <w:tcW w:type="dxa" w:w="355"/>
           </w:tcPr>
           <w:p>
             <w:pPr>
@@ -10137,8 +10137,8 @@
             </w:pPr>
             <w:r>
               <w:rPr>
-                <w:sz w:val="15"/>
-                <w:szCs w:val="15"/>
+                <w:sz w:val="13"/>
+                <w:szCs w:val="13"/>
               </w:rPr>
               <w:t xml:space="preserve">473</w:t>
             </w:r>
@@ -10146,18 +10146,18 @@
         </w:tc>
         <w:tc>
           <w:tcPr>
-            <w:tcW w:type="dxa" w:w="735"/>
-          </w:tcPr>
-          <w:p>
-            <w:pPr>
-              <w:pStyle w:val="Compact"/>
-              <w:spacing w:before="20" w:after="20" w:line="240" w:lineRule="auto"/>
-              <w:keepNext/>
-            </w:pPr>
-            <w:r>
-              <w:rPr>
-                <w:sz w:val="15"/>
-                <w:szCs w:val="15"/>
+            <w:tcW w:type="dxa" w:w="769"/>
+          </w:tcPr>
+          <w:p>
+            <w:pPr>
+              <w:pStyle w:val="Compact"/>
+              <w:spacing w:before="20" w:after="20" w:line="240" w:lineRule="auto"/>
+              <w:keepNext/>
+            </w:pPr>
+            <w:r>
+              <w:rPr>
+                <w:sz w:val="13"/>
+                <w:szCs w:val="13"/>
               </w:rPr>
               <w:t xml:space="preserve">1.295***</w:t>
             </w:r>
@@ -10165,18 +10165,18 @@
         </w:tc>
         <w:tc>
           <w:tcPr>
-            <w:tcW w:type="dxa" w:w="951"/>
-          </w:tcPr>
-          <w:p>
-            <w:pPr>
-              <w:pStyle w:val="Compact"/>
-              <w:spacing w:before="20" w:after="20" w:line="240" w:lineRule="auto"/>
-              <w:keepNext/>
-            </w:pPr>
-            <w:r>
-              <w:rPr>
-                <w:sz w:val="15"/>
-                <w:szCs w:val="15"/>
+            <w:tcW w:type="dxa" w:w="988"/>
+          </w:tcPr>
+          <w:p>
+            <w:pPr>
+              <w:pStyle w:val="Compact"/>
+              <w:spacing w:before="20" w:after="20" w:line="240" w:lineRule="auto"/>
+              <w:keepNext/>
+            </w:pPr>
+            <w:r>
+              <w:rPr>
+                <w:sz w:val="13"/>
+                <w:szCs w:val="13"/>
               </w:rPr>
               <w:t xml:space="preserve">0.826***</w:t>
             </w:r>
@@ -10184,18 +10184,18 @@
         </w:tc>
         <w:tc>
           <w:tcPr>
-            <w:tcW w:type="dxa" w:w="984"/>
-          </w:tcPr>
-          <w:p>
-            <w:pPr>
-              <w:pStyle w:val="Compact"/>
-              <w:spacing w:before="20" w:after="20" w:line="240" w:lineRule="auto"/>
-              <w:keepNext/>
-            </w:pPr>
-            <w:r>
-              <w:rPr>
-                <w:sz w:val="15"/>
-                <w:szCs w:val="15"/>
+            <w:tcW w:type="dxa" w:w="1017"/>
+          </w:tcPr>
+          <w:p>
+            <w:pPr>
+              <w:pStyle w:val="Compact"/>
+              <w:spacing w:before="20" w:after="20" w:line="240" w:lineRule="auto"/>
+              <w:keepNext/>
+            </w:pPr>
+            <w:r>
+              <w:rPr>
+                <w:sz w:val="13"/>
+                <w:szCs w:val="13"/>
               </w:rPr>
               <w:t xml:space="preserve">0.997</w:t>
             </w:r>
@@ -10203,18 +10203,18 @@
         </w:tc>
         <w:tc>
           <w:tcPr>
-            <w:tcW w:type="dxa" w:w="1180"/>
-          </w:tcPr>
-          <w:p>
-            <w:pPr>
-              <w:pStyle w:val="Compact"/>
-              <w:spacing w:before="20" w:after="20" w:line="240" w:lineRule="auto"/>
-              <w:keepNext/>
-            </w:pPr>
-            <w:r>
-              <w:rPr>
-                <w:sz w:val="15"/>
-                <w:szCs w:val="15"/>
+            <w:tcW w:type="dxa" w:w="1215"/>
+          </w:tcPr>
+          <w:p>
+            <w:pPr>
+              <w:pStyle w:val="Compact"/>
+              <w:spacing w:before="20" w:after="20" w:line="240" w:lineRule="auto"/>
+              <w:keepNext/>
+            </w:pPr>
+            <w:r>
+              <w:rPr>
+                <w:sz w:val="13"/>
+                <w:szCs w:val="13"/>
               </w:rPr>
               <w:t xml:space="preserve">0.935***</w:t>
             </w:r>
@@ -10222,18 +10222,18 @@
         </w:tc>
         <w:tc>
           <w:tcPr>
-            <w:tcW w:type="dxa" w:w="779"/>
-          </w:tcPr>
-          <w:p>
-            <w:pPr>
-              <w:pStyle w:val="Compact"/>
-              <w:spacing w:before="20" w:after="20" w:line="240" w:lineRule="auto"/>
-              <w:keepNext/>
-            </w:pPr>
-            <w:r>
-              <w:rPr>
-                <w:sz w:val="15"/>
-                <w:szCs w:val="15"/>
+            <w:tcW w:type="dxa" w:w="809"/>
+          </w:tcPr>
+          <w:p>
+            <w:pPr>
+              <w:pStyle w:val="Compact"/>
+              <w:spacing w:before="20" w:after="20" w:line="240" w:lineRule="auto"/>
+              <w:keepNext/>
+            </w:pPr>
+            <w:r>
+              <w:rPr>
+                <w:sz w:val="13"/>
+                <w:szCs w:val="13"/>
               </w:rPr>
               <w:t xml:space="preserve">2.721***</w:t>
             </w:r>
@@ -10241,18 +10241,18 @@
         </w:tc>
         <w:tc>
           <w:tcPr>
-            <w:tcW w:type="dxa" w:w="779"/>
-          </w:tcPr>
-          <w:p>
-            <w:pPr>
-              <w:pStyle w:val="Compact"/>
-              <w:spacing w:before="20" w:after="20" w:line="240" w:lineRule="auto"/>
-              <w:keepNext/>
-            </w:pPr>
-            <w:r>
-              <w:rPr>
-                <w:sz w:val="15"/>
-                <w:szCs w:val="15"/>
+            <w:tcW w:type="dxa" w:w="809"/>
+          </w:tcPr>
+          <w:p>
+            <w:pPr>
+              <w:pStyle w:val="Compact"/>
+              <w:spacing w:before="20" w:after="20" w:line="240" w:lineRule="auto"/>
+              <w:keepNext/>
+            </w:pPr>
+            <w:r>
+              <w:rPr>
+                <w:sz w:val="13"/>
+                <w:szCs w:val="13"/>
               </w:rPr>
               <w:t xml:space="preserve">0.061**</w:t>
             </w:r>
@@ -10260,18 +10260,18 @@
         </w:tc>
         <w:tc>
           <w:tcPr>
-            <w:tcW w:type="dxa" w:w="1141"/>
-          </w:tcPr>
-          <w:p>
-            <w:pPr>
-              <w:pStyle w:val="Compact"/>
-              <w:spacing w:before="20" w:after="20" w:line="240" w:lineRule="auto"/>
-              <w:keepNext/>
-            </w:pPr>
-            <w:r>
-              <w:rPr>
-                <w:sz w:val="15"/>
-                <w:szCs w:val="15"/>
+            <w:tcW w:type="dxa" w:w="1195"/>
+          </w:tcPr>
+          <w:p>
+            <w:pPr>
+              <w:pStyle w:val="Compact"/>
+              <w:spacing w:before="20" w:after="20" w:line="240" w:lineRule="auto"/>
+              <w:keepNext/>
+            </w:pPr>
+            <w:r>
+              <w:rPr>
+                <w:sz w:val="13"/>
+                <w:szCs w:val="13"/>
               </w:rPr>
               <w:t xml:space="preserve">1.022***</w:t>
             </w:r>
@@ -10284,18 +10284,18 @@
         </w:trPr>
         <w:tc>
           <w:tcPr>
-            <w:tcW w:type="dxa" w:w="1850"/>
-          </w:tcPr>
-          <w:p>
-            <w:pPr>
-              <w:pStyle w:val="Compact"/>
-              <w:spacing w:before="20" w:after="20" w:line="240" w:lineRule="auto"/>
-              <w:keepNext/>
-            </w:pPr>
-            <w:r>
-              <w:rPr>
-                <w:sz w:val="15"/>
-                <w:szCs w:val="15"/>
+            <w:tcW w:type="dxa" w:w="1916"/>
+          </w:tcPr>
+          <w:p>
+            <w:pPr>
+              <w:pStyle w:val="Compact"/>
+              <w:spacing w:before="20" w:after="20" w:line="240" w:lineRule="auto"/>
+              <w:keepNext/>
+            </w:pPr>
+            <w:r>
+              <w:rPr>
+                <w:sz w:val="13"/>
+                <w:szCs w:val="13"/>
               </w:rPr>
               <w:t xml:space="preserve">엄격 전공정 정의(조립 단계 그룹 제외)</w:t>
             </w:r>
@@ -10303,7 +10303,7 @@
         </w:tc>
         <w:tc>
           <w:tcPr>
-            <w:tcW w:type="dxa" w:w="666"/>
+            <w:tcW w:type="dxa" w:w="355"/>
           </w:tcPr>
           <w:p>
             <w:pPr>
@@ -10314,8 +10314,8 @@
             </w:pPr>
             <w:r>
               <w:rPr>
-                <w:sz w:val="15"/>
-                <w:szCs w:val="15"/>
+                <w:sz w:val="13"/>
+                <w:szCs w:val="13"/>
               </w:rPr>
               <w:t xml:space="preserve">908</w:t>
             </w:r>
@@ -10323,18 +10323,18 @@
         </w:tc>
         <w:tc>
           <w:tcPr>
-            <w:tcW w:type="dxa" w:w="735"/>
-          </w:tcPr>
-          <w:p>
-            <w:pPr>
-              <w:pStyle w:val="Compact"/>
-              <w:spacing w:before="20" w:after="20" w:line="240" w:lineRule="auto"/>
-              <w:keepNext/>
-            </w:pPr>
-            <w:r>
-              <w:rPr>
-                <w:sz w:val="15"/>
-                <w:szCs w:val="15"/>
+            <w:tcW w:type="dxa" w:w="769"/>
+          </w:tcPr>
+          <w:p>
+            <w:pPr>
+              <w:pStyle w:val="Compact"/>
+              <w:spacing w:before="20" w:after="20" w:line="240" w:lineRule="auto"/>
+              <w:keepNext/>
+            </w:pPr>
+            <w:r>
+              <w:rPr>
+                <w:sz w:val="13"/>
+                <w:szCs w:val="13"/>
               </w:rPr>
               <w:t xml:space="preserve">1.352***</w:t>
             </w:r>
@@ -10342,18 +10342,18 @@
         </w:tc>
         <w:tc>
           <w:tcPr>
-            <w:tcW w:type="dxa" w:w="951"/>
-          </w:tcPr>
-          <w:p>
-            <w:pPr>
-              <w:pStyle w:val="Compact"/>
-              <w:spacing w:before="20" w:after="20" w:line="240" w:lineRule="auto"/>
-              <w:keepNext/>
-            </w:pPr>
-            <w:r>
-              <w:rPr>
-                <w:sz w:val="15"/>
-                <w:szCs w:val="15"/>
+            <w:tcW w:type="dxa" w:w="988"/>
+          </w:tcPr>
+          <w:p>
+            <w:pPr>
+              <w:pStyle w:val="Compact"/>
+              <w:spacing w:before="20" w:after="20" w:line="240" w:lineRule="auto"/>
+              <w:keepNext/>
+            </w:pPr>
+            <w:r>
+              <w:rPr>
+                <w:sz w:val="13"/>
+                <w:szCs w:val="13"/>
               </w:rPr>
               <w:t xml:space="preserve">0.923*</w:t>
             </w:r>
@@ -10361,18 +10361,18 @@
         </w:tc>
         <w:tc>
           <w:tcPr>
-            <w:tcW w:type="dxa" w:w="984"/>
-          </w:tcPr>
-          <w:p>
-            <w:pPr>
-              <w:pStyle w:val="Compact"/>
-              <w:spacing w:before="20" w:after="20" w:line="240" w:lineRule="auto"/>
-              <w:keepNext/>
-            </w:pPr>
-            <w:r>
-              <w:rPr>
-                <w:sz w:val="15"/>
-                <w:szCs w:val="15"/>
+            <w:tcW w:type="dxa" w:w="1017"/>
+          </w:tcPr>
+          <w:p>
+            <w:pPr>
+              <w:pStyle w:val="Compact"/>
+              <w:spacing w:before="20" w:after="20" w:line="240" w:lineRule="auto"/>
+              <w:keepNext/>
+            </w:pPr>
+            <w:r>
+              <w:rPr>
+                <w:sz w:val="13"/>
+                <w:szCs w:val="13"/>
               </w:rPr>
               <w:t xml:space="preserve">0.967**</w:t>
             </w:r>
@@ -10380,18 +10380,18 @@
         </w:tc>
         <w:tc>
           <w:tcPr>
-            <w:tcW w:type="dxa" w:w="1180"/>
-          </w:tcPr>
-          <w:p>
-            <w:pPr>
-              <w:pStyle w:val="Compact"/>
-              <w:spacing w:before="20" w:after="20" w:line="240" w:lineRule="auto"/>
-              <w:keepNext/>
-            </w:pPr>
-            <w:r>
-              <w:rPr>
-                <w:sz w:val="15"/>
-                <w:szCs w:val="15"/>
+            <w:tcW w:type="dxa" w:w="1215"/>
+          </w:tcPr>
+          <w:p>
+            <w:pPr>
+              <w:pStyle w:val="Compact"/>
+              <w:spacing w:before="20" w:after="20" w:line="240" w:lineRule="auto"/>
+              <w:keepNext/>
+            </w:pPr>
+            <w:r>
+              <w:rPr>
+                <w:sz w:val="13"/>
+                <w:szCs w:val="13"/>
               </w:rPr>
               <w:t xml:space="preserve">0.898***</w:t>
             </w:r>
@@ -10399,18 +10399,18 @@
         </w:tc>
         <w:tc>
           <w:tcPr>
-            <w:tcW w:type="dxa" w:w="779"/>
-          </w:tcPr>
-          <w:p>
-            <w:pPr>
-              <w:pStyle w:val="Compact"/>
-              <w:spacing w:before="20" w:after="20" w:line="240" w:lineRule="auto"/>
-              <w:keepNext/>
-            </w:pPr>
-            <w:r>
-              <w:rPr>
-                <w:sz w:val="15"/>
-                <w:szCs w:val="15"/>
+            <w:tcW w:type="dxa" w:w="809"/>
+          </w:tcPr>
+          <w:p>
+            <w:pPr>
+              <w:pStyle w:val="Compact"/>
+              <w:spacing w:before="20" w:after="20" w:line="240" w:lineRule="auto"/>
+              <w:keepNext/>
+            </w:pPr>
+            <w:r>
+              <w:rPr>
+                <w:sz w:val="13"/>
+                <w:szCs w:val="13"/>
               </w:rPr>
               <w:t xml:space="preserve">3.299***</w:t>
             </w:r>
@@ -10418,18 +10418,18 @@
         </w:tc>
         <w:tc>
           <w:tcPr>
-            <w:tcW w:type="dxa" w:w="779"/>
-          </w:tcPr>
-          <w:p>
-            <w:pPr>
-              <w:pStyle w:val="Compact"/>
-              <w:spacing w:before="20" w:after="20" w:line="240" w:lineRule="auto"/>
-              <w:keepNext/>
-            </w:pPr>
-            <w:r>
-              <w:rPr>
-                <w:sz w:val="15"/>
-                <w:szCs w:val="15"/>
+            <w:tcW w:type="dxa" w:w="809"/>
+          </w:tcPr>
+          <w:p>
+            <w:pPr>
+              <w:pStyle w:val="Compact"/>
+              <w:spacing w:before="20" w:after="20" w:line="240" w:lineRule="auto"/>
+              <w:keepNext/>
+            </w:pPr>
+            <w:r>
+              <w:rPr>
+                <w:sz w:val="13"/>
+                <w:szCs w:val="13"/>
               </w:rPr>
               <w:t xml:space="preserve">0.103***</w:t>
             </w:r>
@@ -10437,18 +10437,18 @@
         </w:tc>
         <w:tc>
           <w:tcPr>
-            <w:tcW w:type="dxa" w:w="1141"/>
-          </w:tcPr>
-          <w:p>
-            <w:pPr>
-              <w:pStyle w:val="Compact"/>
-              <w:spacing w:before="20" w:after="20" w:line="240" w:lineRule="auto"/>
-              <w:keepNext/>
-            </w:pPr>
-            <w:r>
-              <w:rPr>
-                <w:sz w:val="15"/>
-                <w:szCs w:val="15"/>
+            <w:tcW w:type="dxa" w:w="1195"/>
+          </w:tcPr>
+          <w:p>
+            <w:pPr>
+              <w:pStyle w:val="Compact"/>
+              <w:spacing w:before="20" w:after="20" w:line="240" w:lineRule="auto"/>
+              <w:keepNext/>
+            </w:pPr>
+            <w:r>
+              <w:rPr>
+                <w:sz w:val="13"/>
+                <w:szCs w:val="13"/>
               </w:rPr>
               <w:t xml:space="preserve">—</w:t>
             </w:r>
@@ -10461,18 +10461,18 @@
         </w:trPr>
         <w:tc>
           <w:tcPr>
-            <w:tcW w:type="dxa" w:w="1850"/>
-          </w:tcPr>
-          <w:p>
-            <w:pPr>
-              <w:pStyle w:val="Compact"/>
-              <w:spacing w:before="20" w:after="20" w:line="240" w:lineRule="auto"/>
-              <w:keepNext/>
-            </w:pPr>
-            <w:r>
-              <w:rPr>
-                <w:sz w:val="15"/>
-                <w:szCs w:val="15"/>
+            <w:tcW w:type="dxa" w:w="1916"/>
+          </w:tcPr>
+          <w:p>
+            <w:pPr>
+              <w:pStyle w:val="Compact"/>
+              <w:spacing w:before="20" w:after="20" w:line="240" w:lineRule="auto"/>
+              <w:keepNext/>
+            </w:pPr>
+            <w:r>
+              <w:rPr>
+                <w:sz w:val="13"/>
+                <w:szCs w:val="13"/>
               </w:rPr>
               <w:t xml:space="preserve">무관 용법 제외</w:t>
             </w:r>
@@ -10480,7 +10480,7 @@
         </w:tc>
         <w:tc>
           <w:tcPr>
-            <w:tcW w:type="dxa" w:w="666"/>
+            <w:tcW w:type="dxa" w:w="355"/>
           </w:tcPr>
           <w:p>
             <w:pPr>
@@ -10491,8 +10491,8 @@
             </w:pPr>
             <w:r>
               <w:rPr>
-                <w:sz w:val="15"/>
-                <w:szCs w:val="15"/>
+                <w:sz w:val="13"/>
+                <w:szCs w:val="13"/>
               </w:rPr>
               <w:t xml:space="preserve">860</w:t>
             </w:r>
@@ -10500,18 +10500,18 @@
         </w:tc>
         <w:tc>
           <w:tcPr>
-            <w:tcW w:type="dxa" w:w="735"/>
-          </w:tcPr>
-          <w:p>
-            <w:pPr>
-              <w:pStyle w:val="Compact"/>
-              <w:spacing w:before="20" w:after="20" w:line="240" w:lineRule="auto"/>
-              <w:keepNext/>
-            </w:pPr>
-            <w:r>
-              <w:rPr>
-                <w:sz w:val="15"/>
-                <w:szCs w:val="15"/>
+            <w:tcW w:type="dxa" w:w="769"/>
+          </w:tcPr>
+          <w:p>
+            <w:pPr>
+              <w:pStyle w:val="Compact"/>
+              <w:spacing w:before="20" w:after="20" w:line="240" w:lineRule="auto"/>
+              <w:keepNext/>
+            </w:pPr>
+            <w:r>
+              <w:rPr>
+                <w:sz w:val="13"/>
+                <w:szCs w:val="13"/>
               </w:rPr>
               <w:t xml:space="preserve">1.384***</w:t>
             </w:r>
@@ -10519,18 +10519,18 @@
         </w:tc>
         <w:tc>
           <w:tcPr>
-            <w:tcW w:type="dxa" w:w="951"/>
-          </w:tcPr>
-          <w:p>
-            <w:pPr>
-              <w:pStyle w:val="Compact"/>
-              <w:spacing w:before="20" w:after="20" w:line="240" w:lineRule="auto"/>
-              <w:keepNext/>
-            </w:pPr>
-            <w:r>
-              <w:rPr>
-                <w:sz w:val="15"/>
-                <w:szCs w:val="15"/>
+            <w:tcW w:type="dxa" w:w="988"/>
+          </w:tcPr>
+          <w:p>
+            <w:pPr>
+              <w:pStyle w:val="Compact"/>
+              <w:spacing w:before="20" w:after="20" w:line="240" w:lineRule="auto"/>
+              <w:keepNext/>
+            </w:pPr>
+            <w:r>
+              <w:rPr>
+                <w:sz w:val="13"/>
+                <w:szCs w:val="13"/>
               </w:rPr>
               <w:t xml:space="preserve">0.916*</w:t>
             </w:r>
@@ -10538,18 +10538,18 @@
         </w:tc>
         <w:tc>
           <w:tcPr>
-            <w:tcW w:type="dxa" w:w="984"/>
-          </w:tcPr>
-          <w:p>
-            <w:pPr>
-              <w:pStyle w:val="Compact"/>
-              <w:spacing w:before="20" w:after="20" w:line="240" w:lineRule="auto"/>
-              <w:keepNext/>
-            </w:pPr>
-            <w:r>
-              <w:rPr>
-                <w:sz w:val="15"/>
-                <w:szCs w:val="15"/>
+            <w:tcW w:type="dxa" w:w="1017"/>
+          </w:tcPr>
+          <w:p>
+            <w:pPr>
+              <w:pStyle w:val="Compact"/>
+              <w:spacing w:before="20" w:after="20" w:line="240" w:lineRule="auto"/>
+              <w:keepNext/>
+            </w:pPr>
+            <w:r>
+              <w:rPr>
+                <w:sz w:val="13"/>
+                <w:szCs w:val="13"/>
               </w:rPr>
               <w:t xml:space="preserve">0.949**</w:t>
             </w:r>
@@ -10557,18 +10557,18 @@
         </w:tc>
         <w:tc>
           <w:tcPr>
-            <w:tcW w:type="dxa" w:w="1180"/>
-          </w:tcPr>
-          <w:p>
-            <w:pPr>
-              <w:pStyle w:val="Compact"/>
-              <w:spacing w:before="20" w:after="20" w:line="240" w:lineRule="auto"/>
-              <w:keepNext/>
-            </w:pPr>
-            <w:r>
-              <w:rPr>
-                <w:sz w:val="15"/>
-                <w:szCs w:val="15"/>
+            <w:tcW w:type="dxa" w:w="1215"/>
+          </w:tcPr>
+          <w:p>
+            <w:pPr>
+              <w:pStyle w:val="Compact"/>
+              <w:spacing w:before="20" w:after="20" w:line="240" w:lineRule="auto"/>
+              <w:keepNext/>
+            </w:pPr>
+            <w:r>
+              <w:rPr>
+                <w:sz w:val="13"/>
+                <w:szCs w:val="13"/>
               </w:rPr>
               <w:t xml:space="preserve">0.820***</w:t>
             </w:r>
@@ -10576,18 +10576,18 @@
         </w:tc>
         <w:tc>
           <w:tcPr>
-            <w:tcW w:type="dxa" w:w="779"/>
-          </w:tcPr>
-          <w:p>
-            <w:pPr>
-              <w:pStyle w:val="Compact"/>
-              <w:spacing w:before="20" w:after="20" w:line="240" w:lineRule="auto"/>
-              <w:keepNext/>
-            </w:pPr>
-            <w:r>
-              <w:rPr>
-                <w:sz w:val="15"/>
-                <w:szCs w:val="15"/>
+            <w:tcW w:type="dxa" w:w="809"/>
+          </w:tcPr>
+          <w:p>
+            <w:pPr>
+              <w:pStyle w:val="Compact"/>
+              <w:spacing w:before="20" w:after="20" w:line="240" w:lineRule="auto"/>
+              <w:keepNext/>
+            </w:pPr>
+            <w:r>
+              <w:rPr>
+                <w:sz w:val="13"/>
+                <w:szCs w:val="13"/>
               </w:rPr>
               <w:t xml:space="preserve">3.235***</w:t>
             </w:r>
@@ -10595,18 +10595,18 @@
         </w:tc>
         <w:tc>
           <w:tcPr>
-            <w:tcW w:type="dxa" w:w="779"/>
-          </w:tcPr>
-          <w:p>
-            <w:pPr>
-              <w:pStyle w:val="Compact"/>
-              <w:spacing w:before="20" w:after="20" w:line="240" w:lineRule="auto"/>
-              <w:keepNext/>
-            </w:pPr>
-            <w:r>
-              <w:rPr>
-                <w:sz w:val="15"/>
-                <w:szCs w:val="15"/>
+            <w:tcW w:type="dxa" w:w="809"/>
+          </w:tcPr>
+          <w:p>
+            <w:pPr>
+              <w:pStyle w:val="Compact"/>
+              <w:spacing w:before="20" w:after="20" w:line="240" w:lineRule="auto"/>
+              <w:keepNext/>
+            </w:pPr>
+            <w:r>
+              <w:rPr>
+                <w:sz w:val="13"/>
+                <w:szCs w:val="13"/>
               </w:rPr>
               <w:t xml:space="preserve">0.015***</w:t>
             </w:r>
@@ -10614,18 +10614,18 @@
         </w:tc>
         <w:tc>
           <w:tcPr>
-            <w:tcW w:type="dxa" w:w="1141"/>
-          </w:tcPr>
-          <w:p>
-            <w:pPr>
-              <w:pStyle w:val="Compact"/>
-              <w:spacing w:before="20" w:after="20" w:line="240" w:lineRule="auto"/>
-              <w:keepNext/>
-            </w:pPr>
-            <w:r>
-              <w:rPr>
-                <w:sz w:val="15"/>
-                <w:szCs w:val="15"/>
+            <w:tcW w:type="dxa" w:w="1195"/>
+          </w:tcPr>
+          <w:p>
+            <w:pPr>
+              <w:pStyle w:val="Compact"/>
+              <w:spacing w:before="20" w:after="20" w:line="240" w:lineRule="auto"/>
+              <w:keepNext/>
+            </w:pPr>
+            <w:r>
+              <w:rPr>
+                <w:sz w:val="13"/>
+                <w:szCs w:val="13"/>
               </w:rPr>
               <w:t xml:space="preserve">1.001</w:t>
             </w:r>

</xml_diff>

<commit_message>
journal: widen minimum table column widths; rebuild v9 and supplements
Co-Authored-By: Claude Fable 5.1 <noreply@anthropic.com>
Claude-Session: https://claude.ai/code/session_01SvckvZxt3hAXTDPnm8YPEC
</commit_message>
<xml_diff>
--- a/journal/manuscript_v9_ko.docx
+++ b/journal/manuscript_v9_ko.docx
@@ -765,8 +765,8 @@
             </w:pPr>
             <w:r>
               <w:rPr>
-                <w:sz w:val="18"/>
-                <w:szCs w:val="18"/>
+                <w:sz w:val="15"/>
+                <w:szCs w:val="15"/>
               </w:rPr>
               <w:t xml:space="preserve">검색 순서</w:t>
             </w:r>
@@ -787,8 +787,8 @@
             </w:pPr>
             <w:r>
               <w:rPr>
-                <w:sz w:val="18"/>
-                <w:szCs w:val="18"/>
+                <w:sz w:val="15"/>
+                <w:szCs w:val="15"/>
               </w:rPr>
               <w:t xml:space="preserve">CPC 코드</w:t>
             </w:r>
@@ -809,8 +809,8 @@
             </w:pPr>
             <w:r>
               <w:rPr>
-                <w:sz w:val="18"/>
-                <w:szCs w:val="18"/>
+                <w:sz w:val="15"/>
+                <w:szCs w:val="15"/>
               </w:rPr>
               <w:t xml:space="preserve">설명</w:t>
             </w:r>
@@ -831,8 +831,8 @@
             </w:pPr>
             <w:r>
               <w:rPr>
-                <w:sz w:val="18"/>
-                <w:szCs w:val="18"/>
+                <w:sz w:val="15"/>
+                <w:szCs w:val="15"/>
               </w:rPr>
               <w:t xml:space="preserve">주요 기술</w:t>
             </w:r>
@@ -855,8 +855,8 @@
             </w:pPr>
             <w:r>
               <w:rPr>
-                <w:sz w:val="18"/>
-                <w:szCs w:val="18"/>
+                <w:sz w:val="15"/>
+                <w:szCs w:val="15"/>
               </w:rPr>
               <w:t xml:space="preserve">1차 분류</w:t>
             </w:r>
@@ -874,8 +874,8 @@
             </w:pPr>
             <w:r>
               <w:rPr>
-                <w:sz w:val="18"/>
-                <w:szCs w:val="18"/>
+                <w:sz w:val="15"/>
+                <w:szCs w:val="15"/>
               </w:rPr>
               <w:t xml:space="preserve">H01L21</w:t>
             </w:r>
@@ -893,8 +893,8 @@
             </w:pPr>
             <w:r>
               <w:rPr>
-                <w:sz w:val="18"/>
-                <w:szCs w:val="18"/>
+                <w:sz w:val="15"/>
+                <w:szCs w:val="15"/>
               </w:rPr>
               <w:t xml:space="preserve">반도체 장치 또는 부품의 제조 또는 처리에 특별히 적합한 공정 및 장치</w:t>
             </w:r>
@@ -914,15 +914,15 @@
               <w:rPr>
                 <w:b/>
                 <w:bCs/>
-                <w:sz w:val="18"/>
-                <w:szCs w:val="18"/>
+                <w:sz w:val="15"/>
+                <w:szCs w:val="15"/>
               </w:rPr>
               <w:t xml:space="preserve">반도체 제조공정 기술</w:t>
             </w:r>
             <w:r>
               <w:rPr>
-                <w:sz w:val="18"/>
-                <w:szCs w:val="18"/>
+                <w:sz w:val="15"/>
+                <w:szCs w:val="15"/>
               </w:rPr>
               <w:t xml:space="preserve">: 웨이퍼 직접 접합(21/18, 21/20), 소자 분리·SOI·BEOL 배선·TSV(21/76), 기판·절연층 처리(21/02), 화학적 기계연마·후처리(21/30–21/32) 등 웨이퍼 제조공정이 중심이나, 조립 단계 제조공정(21/48, 21/50–21/58, 21/60, 21/78)과 공정 장치(21/67–21/68)도 포함(표본 내 구성은 제4.2절)</w:t>
             </w:r>
@@ -945,8 +945,8 @@
             </w:pPr>
             <w:r>
               <w:rPr>
-                <w:sz w:val="18"/>
-                <w:szCs w:val="18"/>
+                <w:sz w:val="15"/>
+                <w:szCs w:val="15"/>
               </w:rPr>
               <w:t xml:space="preserve">1차 분류</w:t>
             </w:r>
@@ -964,8 +964,8 @@
             </w:pPr>
             <w:r>
               <w:rPr>
-                <w:sz w:val="18"/>
-                <w:szCs w:val="18"/>
+                <w:sz w:val="15"/>
+                <w:szCs w:val="15"/>
               </w:rPr>
               <w:t xml:space="preserve">H01L24</w:t>
             </w:r>
@@ -983,8 +983,8 @@
             </w:pPr>
             <w:r>
               <w:rPr>
-                <w:sz w:val="18"/>
-                <w:szCs w:val="18"/>
+                <w:sz w:val="15"/>
+                <w:szCs w:val="15"/>
               </w:rPr>
               <w:t xml:space="preserve">반도체 바디(body)의 전기적 연결 또는 분리를 위한 장치 및 방법</w:t>
             </w:r>
@@ -1004,15 +1004,15 @@
               <w:rPr>
                 <w:b/>
                 <w:bCs/>
-                <w:sz w:val="18"/>
-                <w:szCs w:val="18"/>
+                <w:sz w:val="15"/>
+                <w:szCs w:val="15"/>
               </w:rPr>
               <w:t xml:space="preserve">패키징 인터커넥션 핵심 기술</w:t>
             </w:r>
             <w:r>
               <w:rPr>
-                <w:sz w:val="18"/>
-                <w:szCs w:val="18"/>
+                <w:sz w:val="15"/>
+                <w:szCs w:val="15"/>
               </w:rPr>
               <w:t xml:space="preserve">: 와이어 본딩, 플립칩 본딩, TSV, 하이브리드 본딩, 솔더 범프/볼 형성, 재배선 공정</w:t>
             </w:r>
@@ -1035,8 +1035,8 @@
             </w:pPr>
             <w:r>
               <w:rPr>
-                <w:sz w:val="18"/>
-                <w:szCs w:val="18"/>
+                <w:sz w:val="15"/>
+                <w:szCs w:val="15"/>
               </w:rPr>
               <w:t xml:space="preserve">2차 분류</w:t>
             </w:r>
@@ -1054,8 +1054,8 @@
             </w:pPr>
             <w:r>
               <w:rPr>
-                <w:sz w:val="18"/>
-                <w:szCs w:val="18"/>
+                <w:sz w:val="15"/>
+                <w:szCs w:val="15"/>
               </w:rPr>
               <w:t xml:space="preserve">키워드</w:t>
             </w:r>
@@ -1075,22 +1075,22 @@
               <w:rPr>
                 <w:i/>
                 <w:iCs/>
-                <w:sz w:val="18"/>
-                <w:szCs w:val="18"/>
+                <w:sz w:val="15"/>
+                <w:szCs w:val="15"/>
               </w:rPr>
               <w:t xml:space="preserve">hybrid bonding</w:t>
             </w:r>
             <w:r>
               <w:rPr>
-                <w:sz w:val="18"/>
-                <w:szCs w:val="18"/>
+                <w:sz w:val="15"/>
+                <w:szCs w:val="15"/>
               </w:rPr>
               <w:t xml:space="preserve">,</w:t>
             </w:r>
             <w:r>
               <w:rPr>
-                <w:sz w:val="18"/>
-                <w:szCs w:val="18"/>
+                <w:sz w:val="15"/>
+                <w:szCs w:val="15"/>
               </w:rPr>
               <w:t xml:space="preserve"> </w:t>
             </w:r>
@@ -1098,22 +1098,22 @@
               <w:rPr>
                 <w:i/>
                 <w:iCs/>
-                <w:sz w:val="18"/>
-                <w:szCs w:val="18"/>
+                <w:sz w:val="15"/>
+                <w:szCs w:val="15"/>
               </w:rPr>
               <w:t xml:space="preserve">direct bonding</w:t>
             </w:r>
             <w:r>
               <w:rPr>
-                <w:sz w:val="18"/>
-                <w:szCs w:val="18"/>
+                <w:sz w:val="15"/>
+                <w:szCs w:val="15"/>
               </w:rPr>
               <w:t xml:space="preserve">,</w:t>
             </w:r>
             <w:r>
               <w:rPr>
-                <w:sz w:val="18"/>
-                <w:szCs w:val="18"/>
+                <w:sz w:val="15"/>
+                <w:szCs w:val="15"/>
               </w:rPr>
               <w:t xml:space="preserve"> </w:t>
             </w:r>
@@ -1121,22 +1121,22 @@
               <w:rPr>
                 <w:i/>
                 <w:iCs/>
-                <w:sz w:val="18"/>
-                <w:szCs w:val="18"/>
+                <w:sz w:val="15"/>
+                <w:szCs w:val="15"/>
               </w:rPr>
               <w:t xml:space="preserve">Cu–Cu</w:t>
             </w:r>
             <w:r>
               <w:rPr>
-                <w:sz w:val="18"/>
-                <w:szCs w:val="18"/>
+                <w:sz w:val="15"/>
+                <w:szCs w:val="15"/>
               </w:rPr>
               <w:t xml:space="preserve">,</w:t>
             </w:r>
             <w:r>
               <w:rPr>
-                <w:sz w:val="18"/>
-                <w:szCs w:val="18"/>
+                <w:sz w:val="15"/>
+                <w:szCs w:val="15"/>
               </w:rPr>
               <w:t xml:space="preserve"> </w:t>
             </w:r>
@@ -1144,22 +1144,22 @@
               <w:rPr>
                 <w:i/>
                 <w:iCs/>
-                <w:sz w:val="18"/>
-                <w:szCs w:val="18"/>
+                <w:sz w:val="15"/>
+                <w:szCs w:val="15"/>
               </w:rPr>
               <w:t xml:space="preserve">copper to copper</w:t>
             </w:r>
             <w:r>
               <w:rPr>
-                <w:sz w:val="18"/>
-                <w:szCs w:val="18"/>
+                <w:sz w:val="15"/>
+                <w:szCs w:val="15"/>
               </w:rPr>
               <w:t xml:space="preserve">,</w:t>
             </w:r>
             <w:r>
               <w:rPr>
-                <w:sz w:val="18"/>
-                <w:szCs w:val="18"/>
+                <w:sz w:val="15"/>
+                <w:szCs w:val="15"/>
               </w:rPr>
               <w:t xml:space="preserve"> </w:t>
             </w:r>
@@ -1167,22 +1167,22 @@
               <w:rPr>
                 <w:i/>
                 <w:iCs/>
-                <w:sz w:val="18"/>
-                <w:szCs w:val="18"/>
+                <w:sz w:val="15"/>
+                <w:szCs w:val="15"/>
               </w:rPr>
               <w:t xml:space="preserve">metal-oxide bond</w:t>
             </w:r>
             <w:r>
               <w:rPr>
-                <w:sz w:val="18"/>
-                <w:szCs w:val="18"/>
+                <w:sz w:val="15"/>
+                <w:szCs w:val="15"/>
               </w:rPr>
               <w:t xml:space="preserve"> </w:t>
             </w:r>
             <w:r>
               <w:rPr>
-                <w:sz w:val="18"/>
-                <w:szCs w:val="18"/>
+                <w:sz w:val="15"/>
+                <w:szCs w:val="15"/>
               </w:rPr>
               <w:t xml:space="preserve">(키워드 간 OR; 1차 분류와 AND)</w:t>
             </w:r>
@@ -1200,8 +1200,8 @@
             </w:pPr>
             <w:r>
               <w:rPr>
-                <w:sz w:val="18"/>
-                <w:szCs w:val="18"/>
+                <w:sz w:val="15"/>
+                <w:szCs w:val="15"/>
               </w:rPr>
               <w:t xml:space="preserve">위양성 제거</w:t>
             </w:r>
@@ -1855,7 +1855,7 @@
     <w:tbl>
       <w:tblPr>
         <w:tblStyle w:val="Table"/>
-        <w:tblW w:type="dxa" w:w="9066"/>
+        <w:tblW w:type="dxa" w:w="9075"/>
         <w:tblLayout w:type="fixed"/>
         <w:tblLook w:firstRow="1" w:lastRow="0" w:firstColumn="0" w:lastColumn="0" w:noHBand="0" w:noVBand="0" w:val="0020"/>
         <w:tblCellMar>
@@ -1874,14 +1874,14 @@
         </w:tblBorders>
       </w:tblPr>
       <w:tblGrid>
-        <w:gridCol w:w="952"/>
-        <w:gridCol w:w="408"/>
-        <w:gridCol w:w="1225"/>
-        <w:gridCol w:w="1429"/>
-        <w:gridCol w:w="1225"/>
-        <w:gridCol w:w="935"/>
-        <w:gridCol w:w="1769"/>
-        <w:gridCol w:w="1123"/>
+        <w:gridCol w:w="949"/>
+        <w:gridCol w:w="461"/>
+        <w:gridCol w:w="1216"/>
+        <w:gridCol w:w="1423"/>
+        <w:gridCol w:w="1216"/>
+        <w:gridCol w:w="931"/>
+        <w:gridCol w:w="1760"/>
+        <w:gridCol w:w="1119"/>
       </w:tblGrid>
       <w:tr>
         <w:trPr>
@@ -1890,7 +1890,7 @@
         </w:trPr>
         <w:tc>
           <w:tcPr>
-            <w:tcW w:type="dxa" w:w="952"/>
+            <w:tcW w:type="dxa" w:w="949"/>
             <w:tcBorders>
               <w:bottom w:val="single" w:sz="4" w:space="0" w:color="000000"/>
             </w:tcBorders>
@@ -1903,8 +1903,8 @@
             </w:pPr>
             <w:r>
               <w:rPr>
-                <w:sz w:val="16"/>
-                <w:szCs w:val="16"/>
+                <w:sz w:val="13"/>
+                <w:szCs w:val="13"/>
               </w:rPr>
               <w:t xml:space="preserve">출원청</w:t>
             </w:r>
@@ -1912,7 +1912,7 @@
         </w:tc>
         <w:tc>
           <w:tcPr>
-            <w:tcW w:type="dxa" w:w="408"/>
+            <w:tcW w:type="dxa" w:w="461"/>
             <w:tcBorders>
               <w:bottom w:val="single" w:sz="4" w:space="0" w:color="000000"/>
             </w:tcBorders>
@@ -1926,8 +1926,8 @@
             </w:pPr>
             <w:r>
               <w:rPr>
-                <w:sz w:val="16"/>
-                <w:szCs w:val="16"/>
+                <w:sz w:val="13"/>
+                <w:szCs w:val="13"/>
               </w:rPr>
               <w:t xml:space="preserve">N</w:t>
             </w:r>
@@ -1935,7 +1935,7 @@
         </w:tc>
         <w:tc>
           <w:tcPr>
-            <w:tcW w:type="dxa" w:w="1225"/>
+            <w:tcW w:type="dxa" w:w="1216"/>
             <w:tcBorders>
               <w:bottom w:val="single" w:sz="4" w:space="0" w:color="000000"/>
             </w:tcBorders>
@@ -1948,8 +1948,8 @@
             </w:pPr>
             <w:r>
               <w:rPr>
-                <w:sz w:val="16"/>
-                <w:szCs w:val="16"/>
+                <w:sz w:val="13"/>
+                <w:szCs w:val="13"/>
               </w:rPr>
               <w:t xml:space="preserve">조립 단독형</w:t>
             </w:r>
@@ -1957,7 +1957,7 @@
         </w:tc>
         <w:tc>
           <w:tcPr>
-            <w:tcW w:type="dxa" w:w="1429"/>
+            <w:tcW w:type="dxa" w:w="1423"/>
             <w:tcBorders>
               <w:bottom w:val="single" w:sz="4" w:space="0" w:color="000000"/>
             </w:tcBorders>
@@ -1970,8 +1970,8 @@
             </w:pPr>
             <w:r>
               <w:rPr>
-                <w:sz w:val="16"/>
-                <w:szCs w:val="16"/>
+                <w:sz w:val="13"/>
+                <w:szCs w:val="13"/>
               </w:rPr>
               <w:t xml:space="preserve">통합형(경계 넘기)</w:t>
             </w:r>
@@ -1979,7 +1979,7 @@
         </w:tc>
         <w:tc>
           <w:tcPr>
-            <w:tcW w:type="dxa" w:w="1225"/>
+            <w:tcW w:type="dxa" w:w="1216"/>
             <w:tcBorders>
               <w:bottom w:val="single" w:sz="4" w:space="0" w:color="000000"/>
             </w:tcBorders>
@@ -1992,8 +1992,8 @@
             </w:pPr>
             <w:r>
               <w:rPr>
-                <w:sz w:val="16"/>
-                <w:szCs w:val="16"/>
+                <w:sz w:val="13"/>
+                <w:szCs w:val="13"/>
               </w:rPr>
               <w:t xml:space="preserve">공정 단독형</w:t>
             </w:r>
@@ -2001,7 +2001,7 @@
         </w:tc>
         <w:tc>
           <w:tcPr>
-            <w:tcW w:type="dxa" w:w="935"/>
+            <w:tcW w:type="dxa" w:w="931"/>
             <w:tcBorders>
               <w:bottom w:val="single" w:sz="4" w:space="0" w:color="000000"/>
             </w:tcBorders>
@@ -2015,8 +2015,8 @@
             </w:pPr>
             <w:r>
               <w:rPr>
-                <w:sz w:val="16"/>
-                <w:szCs w:val="16"/>
+                <w:sz w:val="13"/>
+                <w:szCs w:val="13"/>
               </w:rPr>
               <w:t xml:space="preserve">전공정 지향(%)</w:t>
             </w:r>
@@ -2024,7 +2024,7 @@
         </w:tc>
         <w:tc>
           <w:tcPr>
-            <w:tcW w:type="dxa" w:w="1769"/>
+            <w:tcW w:type="dxa" w:w="1760"/>
             <w:tcBorders>
               <w:bottom w:val="single" w:sz="4" w:space="0" w:color="000000"/>
             </w:tcBorders>
@@ -2037,8 +2037,8 @@
             </w:pPr>
             <w:r>
               <w:rPr>
-                <w:sz w:val="16"/>
-                <w:szCs w:val="16"/>
+                <w:sz w:val="13"/>
+                <w:szCs w:val="13"/>
               </w:rPr>
               <w:t xml:space="preserve">기술범위 평균(표준편차)</w:t>
             </w:r>
@@ -2046,7 +2046,7 @@
         </w:tc>
         <w:tc>
           <w:tcPr>
-            <w:tcW w:type="dxa" w:w="1123"/>
+            <w:tcW w:type="dxa" w:w="1119"/>
             <w:tcBorders>
               <w:bottom w:val="single" w:sz="4" w:space="0" w:color="000000"/>
             </w:tcBorders>
@@ -2060,8 +2060,8 @@
             </w:pPr>
             <w:r>
               <w:rPr>
-                <w:sz w:val="16"/>
-                <w:szCs w:val="16"/>
+                <w:sz w:val="13"/>
+                <w:szCs w:val="13"/>
               </w:rPr>
               <w:t xml:space="preserve">출원연도 중앙값</w:t>
             </w:r>
@@ -2074,18 +2074,18 @@
         </w:trPr>
         <w:tc>
           <w:tcPr>
-            <w:tcW w:type="dxa" w:w="952"/>
-          </w:tcPr>
-          <w:p>
-            <w:pPr>
-              <w:pStyle w:val="Compact"/>
-              <w:spacing w:before="20" w:after="20" w:line="240" w:lineRule="auto"/>
-              <w:keepNext/>
-            </w:pPr>
-            <w:r>
-              <w:rPr>
-                <w:sz w:val="16"/>
-                <w:szCs w:val="16"/>
+            <w:tcW w:type="dxa" w:w="949"/>
+          </w:tcPr>
+          <w:p>
+            <w:pPr>
+              <w:pStyle w:val="Compact"/>
+              <w:spacing w:before="20" w:after="20" w:line="240" w:lineRule="auto"/>
+              <w:keepNext/>
+            </w:pPr>
+            <w:r>
+              <w:rPr>
+                <w:sz w:val="13"/>
+                <w:szCs w:val="13"/>
               </w:rPr>
               <w:t xml:space="preserve">미국(US)</w:t>
             </w:r>
@@ -2093,7 +2093,7 @@
         </w:tc>
         <w:tc>
           <w:tcPr>
-            <w:tcW w:type="dxa" w:w="408"/>
+            <w:tcW w:type="dxa" w:w="461"/>
           </w:tcPr>
           <w:p>
             <w:pPr>
@@ -2104,8 +2104,8 @@
             </w:pPr>
             <w:r>
               <w:rPr>
-                <w:sz w:val="16"/>
-                <w:szCs w:val="16"/>
+                <w:sz w:val="13"/>
+                <w:szCs w:val="13"/>
               </w:rPr>
               <w:t xml:space="preserve">382</w:t>
             </w:r>
@@ -2113,18 +2113,18 @@
         </w:tc>
         <w:tc>
           <w:tcPr>
-            <w:tcW w:type="dxa" w:w="1225"/>
-          </w:tcPr>
-          <w:p>
-            <w:pPr>
-              <w:pStyle w:val="Compact"/>
-              <w:spacing w:before="20" w:after="20" w:line="240" w:lineRule="auto"/>
-              <w:keepNext/>
-            </w:pPr>
-            <w:r>
-              <w:rPr>
-                <w:sz w:val="16"/>
-                <w:szCs w:val="16"/>
+            <w:tcW w:type="dxa" w:w="1216"/>
+          </w:tcPr>
+          <w:p>
+            <w:pPr>
+              <w:pStyle w:val="Compact"/>
+              <w:spacing w:before="20" w:after="20" w:line="240" w:lineRule="auto"/>
+              <w:keepNext/>
+            </w:pPr>
+            <w:r>
+              <w:rPr>
+                <w:sz w:val="13"/>
+                <w:szCs w:val="13"/>
               </w:rPr>
               <w:t xml:space="preserve">148 (38.7%)</w:t>
             </w:r>
@@ -2132,18 +2132,18 @@
         </w:tc>
         <w:tc>
           <w:tcPr>
-            <w:tcW w:type="dxa" w:w="1429"/>
-          </w:tcPr>
-          <w:p>
-            <w:pPr>
-              <w:pStyle w:val="Compact"/>
-              <w:spacing w:before="20" w:after="20" w:line="240" w:lineRule="auto"/>
-              <w:keepNext/>
-            </w:pPr>
-            <w:r>
-              <w:rPr>
-                <w:sz w:val="16"/>
-                <w:szCs w:val="16"/>
+            <w:tcW w:type="dxa" w:w="1423"/>
+          </w:tcPr>
+          <w:p>
+            <w:pPr>
+              <w:pStyle w:val="Compact"/>
+              <w:spacing w:before="20" w:after="20" w:line="240" w:lineRule="auto"/>
+              <w:keepNext/>
+            </w:pPr>
+            <w:r>
+              <w:rPr>
+                <w:sz w:val="13"/>
+                <w:szCs w:val="13"/>
               </w:rPr>
               <w:t xml:space="preserve">181 (47.4%)</w:t>
             </w:r>
@@ -2151,18 +2151,18 @@
         </w:tc>
         <w:tc>
           <w:tcPr>
-            <w:tcW w:type="dxa" w:w="1225"/>
-          </w:tcPr>
-          <w:p>
-            <w:pPr>
-              <w:pStyle w:val="Compact"/>
-              <w:spacing w:before="20" w:after="20" w:line="240" w:lineRule="auto"/>
-              <w:keepNext/>
-            </w:pPr>
-            <w:r>
-              <w:rPr>
-                <w:sz w:val="16"/>
-                <w:szCs w:val="16"/>
+            <w:tcW w:type="dxa" w:w="1216"/>
+          </w:tcPr>
+          <w:p>
+            <w:pPr>
+              <w:pStyle w:val="Compact"/>
+              <w:spacing w:before="20" w:after="20" w:line="240" w:lineRule="auto"/>
+              <w:keepNext/>
+            </w:pPr>
+            <w:r>
+              <w:rPr>
+                <w:sz w:val="13"/>
+                <w:szCs w:val="13"/>
               </w:rPr>
               <w:t xml:space="preserve">53 (13.9%)</w:t>
             </w:r>
@@ -2170,7 +2170,7 @@
         </w:tc>
         <w:tc>
           <w:tcPr>
-            <w:tcW w:type="dxa" w:w="935"/>
+            <w:tcW w:type="dxa" w:w="931"/>
           </w:tcPr>
           <w:p>
             <w:pPr>
@@ -2181,8 +2181,8 @@
             </w:pPr>
             <w:r>
               <w:rPr>
-                <w:sz w:val="16"/>
-                <w:szCs w:val="16"/>
+                <w:sz w:val="13"/>
+                <w:szCs w:val="13"/>
               </w:rPr>
               <w:t xml:space="preserve">61.3</w:t>
             </w:r>
@@ -2190,18 +2190,18 @@
         </w:tc>
         <w:tc>
           <w:tcPr>
-            <w:tcW w:type="dxa" w:w="1769"/>
-          </w:tcPr>
-          <w:p>
-            <w:pPr>
-              <w:pStyle w:val="Compact"/>
-              <w:spacing w:before="20" w:after="20" w:line="240" w:lineRule="auto"/>
-              <w:keepNext/>
-            </w:pPr>
-            <w:r>
-              <w:rPr>
-                <w:sz w:val="16"/>
-                <w:szCs w:val="16"/>
+            <w:tcW w:type="dxa" w:w="1760"/>
+          </w:tcPr>
+          <w:p>
+            <w:pPr>
+              <w:pStyle w:val="Compact"/>
+              <w:spacing w:before="20" w:after="20" w:line="240" w:lineRule="auto"/>
+              <w:keepNext/>
+            </w:pPr>
+            <w:r>
+              <w:rPr>
+                <w:sz w:val="13"/>
+                <w:szCs w:val="13"/>
               </w:rPr>
               <w:t xml:space="preserve">5.99 (4.02)</w:t>
             </w:r>
@@ -2209,7 +2209,7 @@
         </w:tc>
         <w:tc>
           <w:tcPr>
-            <w:tcW w:type="dxa" w:w="1123"/>
+            <w:tcW w:type="dxa" w:w="1119"/>
           </w:tcPr>
           <w:p>
             <w:pPr>
@@ -2220,8 +2220,8 @@
             </w:pPr>
             <w:r>
               <w:rPr>
-                <w:sz w:val="16"/>
-                <w:szCs w:val="16"/>
+                <w:sz w:val="13"/>
+                <w:szCs w:val="13"/>
               </w:rPr>
               <w:t xml:space="preserve">2020</w:t>
             </w:r>
@@ -2234,18 +2234,18 @@
         </w:trPr>
         <w:tc>
           <w:tcPr>
-            <w:tcW w:type="dxa" w:w="952"/>
-          </w:tcPr>
-          <w:p>
-            <w:pPr>
-              <w:pStyle w:val="Compact"/>
-              <w:spacing w:before="20" w:after="20" w:line="240" w:lineRule="auto"/>
-              <w:keepNext/>
-            </w:pPr>
-            <w:r>
-              <w:rPr>
-                <w:sz w:val="16"/>
-                <w:szCs w:val="16"/>
+            <w:tcW w:type="dxa" w:w="949"/>
+          </w:tcPr>
+          <w:p>
+            <w:pPr>
+              <w:pStyle w:val="Compact"/>
+              <w:spacing w:before="20" w:after="20" w:line="240" w:lineRule="auto"/>
+              <w:keepNext/>
+            </w:pPr>
+            <w:r>
+              <w:rPr>
+                <w:sz w:val="13"/>
+                <w:szCs w:val="13"/>
               </w:rPr>
               <w:t xml:space="preserve">중국(CN)</w:t>
             </w:r>
@@ -2253,7 +2253,7 @@
         </w:tc>
         <w:tc>
           <w:tcPr>
-            <w:tcW w:type="dxa" w:w="408"/>
+            <w:tcW w:type="dxa" w:w="461"/>
           </w:tcPr>
           <w:p>
             <w:pPr>
@@ -2264,8 +2264,8 @@
             </w:pPr>
             <w:r>
               <w:rPr>
-                <w:sz w:val="16"/>
-                <w:szCs w:val="16"/>
+                <w:sz w:val="13"/>
+                <w:szCs w:val="13"/>
               </w:rPr>
               <w:t xml:space="preserve">175</w:t>
             </w:r>
@@ -2273,18 +2273,18 @@
         </w:tc>
         <w:tc>
           <w:tcPr>
-            <w:tcW w:type="dxa" w:w="1225"/>
-          </w:tcPr>
-          <w:p>
-            <w:pPr>
-              <w:pStyle w:val="Compact"/>
-              <w:spacing w:before="20" w:after="20" w:line="240" w:lineRule="auto"/>
-              <w:keepNext/>
-            </w:pPr>
-            <w:r>
-              <w:rPr>
-                <w:sz w:val="16"/>
-                <w:szCs w:val="16"/>
+            <w:tcW w:type="dxa" w:w="1216"/>
+          </w:tcPr>
+          <w:p>
+            <w:pPr>
+              <w:pStyle w:val="Compact"/>
+              <w:spacing w:before="20" w:after="20" w:line="240" w:lineRule="auto"/>
+              <w:keepNext/>
+            </w:pPr>
+            <w:r>
+              <w:rPr>
+                <w:sz w:val="13"/>
+                <w:szCs w:val="13"/>
               </w:rPr>
               <w:t xml:space="preserve">63 (36.0%)</w:t>
             </w:r>
@@ -2292,18 +2292,18 @@
         </w:tc>
         <w:tc>
           <w:tcPr>
-            <w:tcW w:type="dxa" w:w="1429"/>
-          </w:tcPr>
-          <w:p>
-            <w:pPr>
-              <w:pStyle w:val="Compact"/>
-              <w:spacing w:before="20" w:after="20" w:line="240" w:lineRule="auto"/>
-              <w:keepNext/>
-            </w:pPr>
-            <w:r>
-              <w:rPr>
-                <w:sz w:val="16"/>
-                <w:szCs w:val="16"/>
+            <w:tcW w:type="dxa" w:w="1423"/>
+          </w:tcPr>
+          <w:p>
+            <w:pPr>
+              <w:pStyle w:val="Compact"/>
+              <w:spacing w:before="20" w:after="20" w:line="240" w:lineRule="auto"/>
+              <w:keepNext/>
+            </w:pPr>
+            <w:r>
+              <w:rPr>
+                <w:sz w:val="13"/>
+                <w:szCs w:val="13"/>
               </w:rPr>
               <w:t xml:space="preserve">69 (39.4%)</w:t>
             </w:r>
@@ -2311,18 +2311,18 @@
         </w:tc>
         <w:tc>
           <w:tcPr>
-            <w:tcW w:type="dxa" w:w="1225"/>
-          </w:tcPr>
-          <w:p>
-            <w:pPr>
-              <w:pStyle w:val="Compact"/>
-              <w:spacing w:before="20" w:after="20" w:line="240" w:lineRule="auto"/>
-              <w:keepNext/>
-            </w:pPr>
-            <w:r>
-              <w:rPr>
-                <w:sz w:val="16"/>
-                <w:szCs w:val="16"/>
+            <w:tcW w:type="dxa" w:w="1216"/>
+          </w:tcPr>
+          <w:p>
+            <w:pPr>
+              <w:pStyle w:val="Compact"/>
+              <w:spacing w:before="20" w:after="20" w:line="240" w:lineRule="auto"/>
+              <w:keepNext/>
+            </w:pPr>
+            <w:r>
+              <w:rPr>
+                <w:sz w:val="13"/>
+                <w:szCs w:val="13"/>
               </w:rPr>
               <w:t xml:space="preserve">43 (24.6%)</w:t>
             </w:r>
@@ -2330,7 +2330,7 @@
         </w:tc>
         <w:tc>
           <w:tcPr>
-            <w:tcW w:type="dxa" w:w="935"/>
+            <w:tcW w:type="dxa" w:w="931"/>
           </w:tcPr>
           <w:p>
             <w:pPr>
@@ -2341,8 +2341,8 @@
             </w:pPr>
             <w:r>
               <w:rPr>
-                <w:sz w:val="16"/>
-                <w:szCs w:val="16"/>
+                <w:sz w:val="13"/>
+                <w:szCs w:val="13"/>
               </w:rPr>
               <w:t xml:space="preserve">64.0</w:t>
             </w:r>
@@ -2350,18 +2350,18 @@
         </w:tc>
         <w:tc>
           <w:tcPr>
-            <w:tcW w:type="dxa" w:w="1769"/>
-          </w:tcPr>
-          <w:p>
-            <w:pPr>
-              <w:pStyle w:val="Compact"/>
-              <w:spacing w:before="20" w:after="20" w:line="240" w:lineRule="auto"/>
-              <w:keepNext/>
-            </w:pPr>
-            <w:r>
-              <w:rPr>
-                <w:sz w:val="16"/>
-                <w:szCs w:val="16"/>
+            <w:tcW w:type="dxa" w:w="1760"/>
+          </w:tcPr>
+          <w:p>
+            <w:pPr>
+              <w:pStyle w:val="Compact"/>
+              <w:spacing w:before="20" w:after="20" w:line="240" w:lineRule="auto"/>
+              <w:keepNext/>
+            </w:pPr>
+            <w:r>
+              <w:rPr>
+                <w:sz w:val="13"/>
+                <w:szCs w:val="13"/>
               </w:rPr>
               <w:t xml:space="preserve">4.83 (3.39)</w:t>
             </w:r>
@@ -2369,7 +2369,7 @@
         </w:tc>
         <w:tc>
           <w:tcPr>
-            <w:tcW w:type="dxa" w:w="1123"/>
+            <w:tcW w:type="dxa" w:w="1119"/>
           </w:tcPr>
           <w:p>
             <w:pPr>
@@ -2380,8 +2380,8 @@
             </w:pPr>
             <w:r>
               <w:rPr>
-                <w:sz w:val="16"/>
-                <w:szCs w:val="16"/>
+                <w:sz w:val="13"/>
+                <w:szCs w:val="13"/>
               </w:rPr>
               <w:t xml:space="preserve">2021</w:t>
             </w:r>
@@ -2394,18 +2394,18 @@
         </w:trPr>
         <w:tc>
           <w:tcPr>
-            <w:tcW w:type="dxa" w:w="952"/>
-          </w:tcPr>
-          <w:p>
-            <w:pPr>
-              <w:pStyle w:val="Compact"/>
-              <w:spacing w:before="20" w:after="20" w:line="240" w:lineRule="auto"/>
-              <w:keepNext/>
-            </w:pPr>
-            <w:r>
-              <w:rPr>
-                <w:sz w:val="16"/>
-                <w:szCs w:val="16"/>
+            <w:tcW w:type="dxa" w:w="949"/>
+          </w:tcPr>
+          <w:p>
+            <w:pPr>
+              <w:pStyle w:val="Compact"/>
+              <w:spacing w:before="20" w:after="20" w:line="240" w:lineRule="auto"/>
+              <w:keepNext/>
+            </w:pPr>
+            <w:r>
+              <w:rPr>
+                <w:sz w:val="13"/>
+                <w:szCs w:val="13"/>
               </w:rPr>
               <w:t xml:space="preserve">PCT(WO)</w:t>
             </w:r>
@@ -2413,7 +2413,7 @@
         </w:tc>
         <w:tc>
           <w:tcPr>
-            <w:tcW w:type="dxa" w:w="408"/>
+            <w:tcW w:type="dxa" w:w="461"/>
           </w:tcPr>
           <w:p>
             <w:pPr>
@@ -2424,8 +2424,8 @@
             </w:pPr>
             <w:r>
               <w:rPr>
-                <w:sz w:val="16"/>
-                <w:szCs w:val="16"/>
+                <w:sz w:val="13"/>
+                <w:szCs w:val="13"/>
               </w:rPr>
               <w:t xml:space="preserve">113</w:t>
             </w:r>
@@ -2433,18 +2433,18 @@
         </w:tc>
         <w:tc>
           <w:tcPr>
-            <w:tcW w:type="dxa" w:w="1225"/>
-          </w:tcPr>
-          <w:p>
-            <w:pPr>
-              <w:pStyle w:val="Compact"/>
-              <w:spacing w:before="20" w:after="20" w:line="240" w:lineRule="auto"/>
-              <w:keepNext/>
-            </w:pPr>
-            <w:r>
-              <w:rPr>
-                <w:sz w:val="16"/>
-                <w:szCs w:val="16"/>
+            <w:tcW w:type="dxa" w:w="1216"/>
+          </w:tcPr>
+          <w:p>
+            <w:pPr>
+              <w:pStyle w:val="Compact"/>
+              <w:spacing w:before="20" w:after="20" w:line="240" w:lineRule="auto"/>
+              <w:keepNext/>
+            </w:pPr>
+            <w:r>
+              <w:rPr>
+                <w:sz w:val="13"/>
+                <w:szCs w:val="13"/>
               </w:rPr>
               <w:t xml:space="preserve">43 (38.1%)</w:t>
             </w:r>
@@ -2452,18 +2452,18 @@
         </w:tc>
         <w:tc>
           <w:tcPr>
-            <w:tcW w:type="dxa" w:w="1429"/>
-          </w:tcPr>
-          <w:p>
-            <w:pPr>
-              <w:pStyle w:val="Compact"/>
-              <w:spacing w:before="20" w:after="20" w:line="240" w:lineRule="auto"/>
-              <w:keepNext/>
-            </w:pPr>
-            <w:r>
-              <w:rPr>
-                <w:sz w:val="16"/>
-                <w:szCs w:val="16"/>
+            <w:tcW w:type="dxa" w:w="1423"/>
+          </w:tcPr>
+          <w:p>
+            <w:pPr>
+              <w:pStyle w:val="Compact"/>
+              <w:spacing w:before="20" w:after="20" w:line="240" w:lineRule="auto"/>
+              <w:keepNext/>
+            </w:pPr>
+            <w:r>
+              <w:rPr>
+                <w:sz w:val="13"/>
+                <w:szCs w:val="13"/>
               </w:rPr>
               <w:t xml:space="preserve">46 (40.7%)</w:t>
             </w:r>
@@ -2471,18 +2471,18 @@
         </w:tc>
         <w:tc>
           <w:tcPr>
-            <w:tcW w:type="dxa" w:w="1225"/>
-          </w:tcPr>
-          <w:p>
-            <w:pPr>
-              <w:pStyle w:val="Compact"/>
-              <w:spacing w:before="20" w:after="20" w:line="240" w:lineRule="auto"/>
-              <w:keepNext/>
-            </w:pPr>
-            <w:r>
-              <w:rPr>
-                <w:sz w:val="16"/>
-                <w:szCs w:val="16"/>
+            <w:tcW w:type="dxa" w:w="1216"/>
+          </w:tcPr>
+          <w:p>
+            <w:pPr>
+              <w:pStyle w:val="Compact"/>
+              <w:spacing w:before="20" w:after="20" w:line="240" w:lineRule="auto"/>
+              <w:keepNext/>
+            </w:pPr>
+            <w:r>
+              <w:rPr>
+                <w:sz w:val="13"/>
+                <w:szCs w:val="13"/>
               </w:rPr>
               <w:t xml:space="preserve">24 (21.2%)</w:t>
             </w:r>
@@ -2490,7 +2490,7 @@
         </w:tc>
         <w:tc>
           <w:tcPr>
-            <w:tcW w:type="dxa" w:w="935"/>
+            <w:tcW w:type="dxa" w:w="931"/>
           </w:tcPr>
           <w:p>
             <w:pPr>
@@ -2501,8 +2501,8 @@
             </w:pPr>
             <w:r>
               <w:rPr>
-                <w:sz w:val="16"/>
-                <w:szCs w:val="16"/>
+                <w:sz w:val="13"/>
+                <w:szCs w:val="13"/>
               </w:rPr>
               <w:t xml:space="preserve">61.9</w:t>
             </w:r>
@@ -2510,18 +2510,18 @@
         </w:tc>
         <w:tc>
           <w:tcPr>
-            <w:tcW w:type="dxa" w:w="1769"/>
-          </w:tcPr>
-          <w:p>
-            <w:pPr>
-              <w:pStyle w:val="Compact"/>
-              <w:spacing w:before="20" w:after="20" w:line="240" w:lineRule="auto"/>
-              <w:keepNext/>
-            </w:pPr>
-            <w:r>
-              <w:rPr>
-                <w:sz w:val="16"/>
-                <w:szCs w:val="16"/>
+            <w:tcW w:type="dxa" w:w="1760"/>
+          </w:tcPr>
+          <w:p>
+            <w:pPr>
+              <w:pStyle w:val="Compact"/>
+              <w:spacing w:before="20" w:after="20" w:line="240" w:lineRule="auto"/>
+              <w:keepNext/>
+            </w:pPr>
+            <w:r>
+              <w:rPr>
+                <w:sz w:val="13"/>
+                <w:szCs w:val="13"/>
               </w:rPr>
               <w:t xml:space="preserve">5.04 (3.57)</w:t>
             </w:r>
@@ -2529,7 +2529,7 @@
         </w:tc>
         <w:tc>
           <w:tcPr>
-            <w:tcW w:type="dxa" w:w="1123"/>
+            <w:tcW w:type="dxa" w:w="1119"/>
           </w:tcPr>
           <w:p>
             <w:pPr>
@@ -2540,8 +2540,8 @@
             </w:pPr>
             <w:r>
               <w:rPr>
-                <w:sz w:val="16"/>
-                <w:szCs w:val="16"/>
+                <w:sz w:val="13"/>
+                <w:szCs w:val="13"/>
               </w:rPr>
               <w:t xml:space="preserve">2022</w:t>
             </w:r>
@@ -2554,18 +2554,18 @@
         </w:trPr>
         <w:tc>
           <w:tcPr>
-            <w:tcW w:type="dxa" w:w="952"/>
-          </w:tcPr>
-          <w:p>
-            <w:pPr>
-              <w:pStyle w:val="Compact"/>
-              <w:spacing w:before="20" w:after="20" w:line="240" w:lineRule="auto"/>
-              <w:keepNext/>
-            </w:pPr>
-            <w:r>
-              <w:rPr>
-                <w:sz w:val="16"/>
-                <w:szCs w:val="16"/>
+            <w:tcW w:type="dxa" w:w="949"/>
+          </w:tcPr>
+          <w:p>
+            <w:pPr>
+              <w:pStyle w:val="Compact"/>
+              <w:spacing w:before="20" w:after="20" w:line="240" w:lineRule="auto"/>
+              <w:keepNext/>
+            </w:pPr>
+            <w:r>
+              <w:rPr>
+                <w:sz w:val="13"/>
+                <w:szCs w:val="13"/>
               </w:rPr>
               <w:t xml:space="preserve">EPO(EP)</w:t>
             </w:r>
@@ -2573,7 +2573,7 @@
         </w:tc>
         <w:tc>
           <w:tcPr>
-            <w:tcW w:type="dxa" w:w="408"/>
+            <w:tcW w:type="dxa" w:w="461"/>
           </w:tcPr>
           <w:p>
             <w:pPr>
@@ -2584,8 +2584,8 @@
             </w:pPr>
             <w:r>
               <w:rPr>
-                <w:sz w:val="16"/>
-                <w:szCs w:val="16"/>
+                <w:sz w:val="13"/>
+                <w:szCs w:val="13"/>
               </w:rPr>
               <w:t xml:space="preserve">83</w:t>
             </w:r>
@@ -2593,18 +2593,18 @@
         </w:tc>
         <w:tc>
           <w:tcPr>
-            <w:tcW w:type="dxa" w:w="1225"/>
-          </w:tcPr>
-          <w:p>
-            <w:pPr>
-              <w:pStyle w:val="Compact"/>
-              <w:spacing w:before="20" w:after="20" w:line="240" w:lineRule="auto"/>
-              <w:keepNext/>
-            </w:pPr>
-            <w:r>
-              <w:rPr>
-                <w:sz w:val="16"/>
-                <w:szCs w:val="16"/>
+            <w:tcW w:type="dxa" w:w="1216"/>
+          </w:tcPr>
+          <w:p>
+            <w:pPr>
+              <w:pStyle w:val="Compact"/>
+              <w:spacing w:before="20" w:after="20" w:line="240" w:lineRule="auto"/>
+              <w:keepNext/>
+            </w:pPr>
+            <w:r>
+              <w:rPr>
+                <w:sz w:val="13"/>
+                <w:szCs w:val="13"/>
               </w:rPr>
               <w:t xml:space="preserve">29 (34.9%)</w:t>
             </w:r>
@@ -2612,18 +2612,18 @@
         </w:tc>
         <w:tc>
           <w:tcPr>
-            <w:tcW w:type="dxa" w:w="1429"/>
-          </w:tcPr>
-          <w:p>
-            <w:pPr>
-              <w:pStyle w:val="Compact"/>
-              <w:spacing w:before="20" w:after="20" w:line="240" w:lineRule="auto"/>
-              <w:keepNext/>
-            </w:pPr>
-            <w:r>
-              <w:rPr>
-                <w:sz w:val="16"/>
-                <w:szCs w:val="16"/>
+            <w:tcW w:type="dxa" w:w="1423"/>
+          </w:tcPr>
+          <w:p>
+            <w:pPr>
+              <w:pStyle w:val="Compact"/>
+              <w:spacing w:before="20" w:after="20" w:line="240" w:lineRule="auto"/>
+              <w:keepNext/>
+            </w:pPr>
+            <w:r>
+              <w:rPr>
+                <w:sz w:val="13"/>
+                <w:szCs w:val="13"/>
               </w:rPr>
               <w:t xml:space="preserve">44 (53.0%)</w:t>
             </w:r>
@@ -2631,18 +2631,18 @@
         </w:tc>
         <w:tc>
           <w:tcPr>
-            <w:tcW w:type="dxa" w:w="1225"/>
-          </w:tcPr>
-          <w:p>
-            <w:pPr>
-              <w:pStyle w:val="Compact"/>
-              <w:spacing w:before="20" w:after="20" w:line="240" w:lineRule="auto"/>
-              <w:keepNext/>
-            </w:pPr>
-            <w:r>
-              <w:rPr>
-                <w:sz w:val="16"/>
-                <w:szCs w:val="16"/>
+            <w:tcW w:type="dxa" w:w="1216"/>
+          </w:tcPr>
+          <w:p>
+            <w:pPr>
+              <w:pStyle w:val="Compact"/>
+              <w:spacing w:before="20" w:after="20" w:line="240" w:lineRule="auto"/>
+              <w:keepNext/>
+            </w:pPr>
+            <w:r>
+              <w:rPr>
+                <w:sz w:val="13"/>
+                <w:szCs w:val="13"/>
               </w:rPr>
               <w:t xml:space="preserve">10 (12.0%)</w:t>
             </w:r>
@@ -2650,7 +2650,7 @@
         </w:tc>
         <w:tc>
           <w:tcPr>
-            <w:tcW w:type="dxa" w:w="935"/>
+            <w:tcW w:type="dxa" w:w="931"/>
           </w:tcPr>
           <w:p>
             <w:pPr>
@@ -2661,8 +2661,8 @@
             </w:pPr>
             <w:r>
               <w:rPr>
-                <w:sz w:val="16"/>
-                <w:szCs w:val="16"/>
+                <w:sz w:val="13"/>
+                <w:szCs w:val="13"/>
               </w:rPr>
               <w:t xml:space="preserve">65.1</w:t>
             </w:r>
@@ -2670,18 +2670,18 @@
         </w:tc>
         <w:tc>
           <w:tcPr>
-            <w:tcW w:type="dxa" w:w="1769"/>
-          </w:tcPr>
-          <w:p>
-            <w:pPr>
-              <w:pStyle w:val="Compact"/>
-              <w:spacing w:before="20" w:after="20" w:line="240" w:lineRule="auto"/>
-              <w:keepNext/>
-            </w:pPr>
-            <w:r>
-              <w:rPr>
-                <w:sz w:val="16"/>
-                <w:szCs w:val="16"/>
+            <w:tcW w:type="dxa" w:w="1760"/>
+          </w:tcPr>
+          <w:p>
+            <w:pPr>
+              <w:pStyle w:val="Compact"/>
+              <w:spacing w:before="20" w:after="20" w:line="240" w:lineRule="auto"/>
+              <w:keepNext/>
+            </w:pPr>
+            <w:r>
+              <w:rPr>
+                <w:sz w:val="13"/>
+                <w:szCs w:val="13"/>
               </w:rPr>
               <w:t xml:space="preserve">5.94 (3.75)</w:t>
             </w:r>
@@ -2689,7 +2689,7 @@
         </w:tc>
         <w:tc>
           <w:tcPr>
-            <w:tcW w:type="dxa" w:w="1123"/>
+            <w:tcW w:type="dxa" w:w="1119"/>
           </w:tcPr>
           <w:p>
             <w:pPr>
@@ -2700,8 +2700,8 @@
             </w:pPr>
             <w:r>
               <w:rPr>
-                <w:sz w:val="16"/>
-                <w:szCs w:val="16"/>
+                <w:sz w:val="13"/>
+                <w:szCs w:val="13"/>
               </w:rPr>
               <w:t xml:space="preserve">2021</w:t>
             </w:r>
@@ -2714,18 +2714,18 @@
         </w:trPr>
         <w:tc>
           <w:tcPr>
-            <w:tcW w:type="dxa" w:w="952"/>
-          </w:tcPr>
-          <w:p>
-            <w:pPr>
-              <w:pStyle w:val="Compact"/>
-              <w:spacing w:before="20" w:after="20" w:line="240" w:lineRule="auto"/>
-              <w:keepNext/>
-            </w:pPr>
-            <w:r>
-              <w:rPr>
-                <w:sz w:val="16"/>
-                <w:szCs w:val="16"/>
+            <w:tcW w:type="dxa" w:w="949"/>
+          </w:tcPr>
+          <w:p>
+            <w:pPr>
+              <w:pStyle w:val="Compact"/>
+              <w:spacing w:before="20" w:after="20" w:line="240" w:lineRule="auto"/>
+              <w:keepNext/>
+            </w:pPr>
+            <w:r>
+              <w:rPr>
+                <w:sz w:val="13"/>
+                <w:szCs w:val="13"/>
               </w:rPr>
               <w:t xml:space="preserve">대만(TW)</w:t>
             </w:r>
@@ -2733,7 +2733,7 @@
         </w:tc>
         <w:tc>
           <w:tcPr>
-            <w:tcW w:type="dxa" w:w="408"/>
+            <w:tcW w:type="dxa" w:w="461"/>
           </w:tcPr>
           <w:p>
             <w:pPr>
@@ -2744,8 +2744,8 @@
             </w:pPr>
             <w:r>
               <w:rPr>
-                <w:sz w:val="16"/>
-                <w:szCs w:val="16"/>
+                <w:sz w:val="13"/>
+                <w:szCs w:val="13"/>
               </w:rPr>
               <w:t xml:space="preserve">75</w:t>
             </w:r>
@@ -2753,18 +2753,18 @@
         </w:tc>
         <w:tc>
           <w:tcPr>
-            <w:tcW w:type="dxa" w:w="1225"/>
-          </w:tcPr>
-          <w:p>
-            <w:pPr>
-              <w:pStyle w:val="Compact"/>
-              <w:spacing w:before="20" w:after="20" w:line="240" w:lineRule="auto"/>
-              <w:keepNext/>
-            </w:pPr>
-            <w:r>
-              <w:rPr>
-                <w:sz w:val="16"/>
-                <w:szCs w:val="16"/>
+            <w:tcW w:type="dxa" w:w="1216"/>
+          </w:tcPr>
+          <w:p>
+            <w:pPr>
+              <w:pStyle w:val="Compact"/>
+              <w:spacing w:before="20" w:after="20" w:line="240" w:lineRule="auto"/>
+              <w:keepNext/>
+            </w:pPr>
+            <w:r>
+              <w:rPr>
+                <w:sz w:val="13"/>
+                <w:szCs w:val="13"/>
               </w:rPr>
               <w:t xml:space="preserve">24 (32.0%)</w:t>
             </w:r>
@@ -2772,18 +2772,18 @@
         </w:tc>
         <w:tc>
           <w:tcPr>
-            <w:tcW w:type="dxa" w:w="1429"/>
-          </w:tcPr>
-          <w:p>
-            <w:pPr>
-              <w:pStyle w:val="Compact"/>
-              <w:spacing w:before="20" w:after="20" w:line="240" w:lineRule="auto"/>
-              <w:keepNext/>
-            </w:pPr>
-            <w:r>
-              <w:rPr>
-                <w:sz w:val="16"/>
-                <w:szCs w:val="16"/>
+            <w:tcW w:type="dxa" w:w="1423"/>
+          </w:tcPr>
+          <w:p>
+            <w:pPr>
+              <w:pStyle w:val="Compact"/>
+              <w:spacing w:before="20" w:after="20" w:line="240" w:lineRule="auto"/>
+              <w:keepNext/>
+            </w:pPr>
+            <w:r>
+              <w:rPr>
+                <w:sz w:val="13"/>
+                <w:szCs w:val="13"/>
               </w:rPr>
               <w:t xml:space="preserve">39 (52.0%)</w:t>
             </w:r>
@@ -2791,18 +2791,18 @@
         </w:tc>
         <w:tc>
           <w:tcPr>
-            <w:tcW w:type="dxa" w:w="1225"/>
-          </w:tcPr>
-          <w:p>
-            <w:pPr>
-              <w:pStyle w:val="Compact"/>
-              <w:spacing w:before="20" w:after="20" w:line="240" w:lineRule="auto"/>
-              <w:keepNext/>
-            </w:pPr>
-            <w:r>
-              <w:rPr>
-                <w:sz w:val="16"/>
-                <w:szCs w:val="16"/>
+            <w:tcW w:type="dxa" w:w="1216"/>
+          </w:tcPr>
+          <w:p>
+            <w:pPr>
+              <w:pStyle w:val="Compact"/>
+              <w:spacing w:before="20" w:after="20" w:line="240" w:lineRule="auto"/>
+              <w:keepNext/>
+            </w:pPr>
+            <w:r>
+              <w:rPr>
+                <w:sz w:val="13"/>
+                <w:szCs w:val="13"/>
               </w:rPr>
               <w:t xml:space="preserve">12 (16.0%)</w:t>
             </w:r>
@@ -2810,7 +2810,7 @@
         </w:tc>
         <w:tc>
           <w:tcPr>
-            <w:tcW w:type="dxa" w:w="935"/>
+            <w:tcW w:type="dxa" w:w="931"/>
           </w:tcPr>
           <w:p>
             <w:pPr>
@@ -2821,8 +2821,8 @@
             </w:pPr>
             <w:r>
               <w:rPr>
-                <w:sz w:val="16"/>
-                <w:szCs w:val="16"/>
+                <w:sz w:val="13"/>
+                <w:szCs w:val="13"/>
               </w:rPr>
               <w:t xml:space="preserve">68.0</w:t>
             </w:r>
@@ -2830,18 +2830,18 @@
         </w:tc>
         <w:tc>
           <w:tcPr>
-            <w:tcW w:type="dxa" w:w="1769"/>
-          </w:tcPr>
-          <w:p>
-            <w:pPr>
-              <w:pStyle w:val="Compact"/>
-              <w:spacing w:before="20" w:after="20" w:line="240" w:lineRule="auto"/>
-              <w:keepNext/>
-            </w:pPr>
-            <w:r>
-              <w:rPr>
-                <w:sz w:val="16"/>
-                <w:szCs w:val="16"/>
+            <w:tcW w:type="dxa" w:w="1760"/>
+          </w:tcPr>
+          <w:p>
+            <w:pPr>
+              <w:pStyle w:val="Compact"/>
+              <w:spacing w:before="20" w:after="20" w:line="240" w:lineRule="auto"/>
+              <w:keepNext/>
+            </w:pPr>
+            <w:r>
+              <w:rPr>
+                <w:sz w:val="13"/>
+                <w:szCs w:val="13"/>
               </w:rPr>
               <w:t xml:space="preserve">6.27 (4.23)</w:t>
             </w:r>
@@ -2849,7 +2849,7 @@
         </w:tc>
         <w:tc>
           <w:tcPr>
-            <w:tcW w:type="dxa" w:w="1123"/>
+            <w:tcW w:type="dxa" w:w="1119"/>
           </w:tcPr>
           <w:p>
             <w:pPr>
@@ -2860,8 +2860,8 @@
             </w:pPr>
             <w:r>
               <w:rPr>
-                <w:sz w:val="16"/>
-                <w:szCs w:val="16"/>
+                <w:sz w:val="13"/>
+                <w:szCs w:val="13"/>
               </w:rPr>
               <w:t xml:space="preserve">2021</w:t>
             </w:r>
@@ -2874,18 +2874,18 @@
         </w:trPr>
         <w:tc>
           <w:tcPr>
-            <w:tcW w:type="dxa" w:w="952"/>
-          </w:tcPr>
-          <w:p>
-            <w:pPr>
-              <w:pStyle w:val="Compact"/>
-              <w:spacing w:before="20" w:after="20" w:line="240" w:lineRule="auto"/>
-              <w:keepNext/>
-            </w:pPr>
-            <w:r>
-              <w:rPr>
-                <w:sz w:val="16"/>
-                <w:szCs w:val="16"/>
+            <w:tcW w:type="dxa" w:w="949"/>
+          </w:tcPr>
+          <w:p>
+            <w:pPr>
+              <w:pStyle w:val="Compact"/>
+              <w:spacing w:before="20" w:after="20" w:line="240" w:lineRule="auto"/>
+              <w:keepNext/>
+            </w:pPr>
+            <w:r>
+              <w:rPr>
+                <w:sz w:val="13"/>
+                <w:szCs w:val="13"/>
               </w:rPr>
               <w:t xml:space="preserve">한국(KR)</w:t>
             </w:r>
@@ -2893,7 +2893,7 @@
         </w:tc>
         <w:tc>
           <w:tcPr>
-            <w:tcW w:type="dxa" w:w="408"/>
+            <w:tcW w:type="dxa" w:w="461"/>
           </w:tcPr>
           <w:p>
             <w:pPr>
@@ -2904,8 +2904,8 @@
             </w:pPr>
             <w:r>
               <w:rPr>
-                <w:sz w:val="16"/>
-                <w:szCs w:val="16"/>
+                <w:sz w:val="13"/>
+                <w:szCs w:val="13"/>
               </w:rPr>
               <w:t xml:space="preserve">58</w:t>
             </w:r>
@@ -2913,18 +2913,18 @@
         </w:tc>
         <w:tc>
           <w:tcPr>
-            <w:tcW w:type="dxa" w:w="1225"/>
-          </w:tcPr>
-          <w:p>
-            <w:pPr>
-              <w:pStyle w:val="Compact"/>
-              <w:spacing w:before="20" w:after="20" w:line="240" w:lineRule="auto"/>
-              <w:keepNext/>
-            </w:pPr>
-            <w:r>
-              <w:rPr>
-                <w:sz w:val="16"/>
-                <w:szCs w:val="16"/>
+            <w:tcW w:type="dxa" w:w="1216"/>
+          </w:tcPr>
+          <w:p>
+            <w:pPr>
+              <w:pStyle w:val="Compact"/>
+              <w:spacing w:before="20" w:after="20" w:line="240" w:lineRule="auto"/>
+              <w:keepNext/>
+            </w:pPr>
+            <w:r>
+              <w:rPr>
+                <w:sz w:val="13"/>
+                <w:szCs w:val="13"/>
               </w:rPr>
               <w:t xml:space="preserve">17 (29.3%)</w:t>
             </w:r>
@@ -2932,18 +2932,18 @@
         </w:tc>
         <w:tc>
           <w:tcPr>
-            <w:tcW w:type="dxa" w:w="1429"/>
-          </w:tcPr>
-          <w:p>
-            <w:pPr>
-              <w:pStyle w:val="Compact"/>
-              <w:spacing w:before="20" w:after="20" w:line="240" w:lineRule="auto"/>
-              <w:keepNext/>
-            </w:pPr>
-            <w:r>
-              <w:rPr>
-                <w:sz w:val="16"/>
-                <w:szCs w:val="16"/>
+            <w:tcW w:type="dxa" w:w="1423"/>
+          </w:tcPr>
+          <w:p>
+            <w:pPr>
+              <w:pStyle w:val="Compact"/>
+              <w:spacing w:before="20" w:after="20" w:line="240" w:lineRule="auto"/>
+              <w:keepNext/>
+            </w:pPr>
+            <w:r>
+              <w:rPr>
+                <w:sz w:val="13"/>
+                <w:szCs w:val="13"/>
               </w:rPr>
               <w:t xml:space="preserve">25 (43.1%)</w:t>
             </w:r>
@@ -2951,18 +2951,18 @@
         </w:tc>
         <w:tc>
           <w:tcPr>
-            <w:tcW w:type="dxa" w:w="1225"/>
-          </w:tcPr>
-          <w:p>
-            <w:pPr>
-              <w:pStyle w:val="Compact"/>
-              <w:spacing w:before="20" w:after="20" w:line="240" w:lineRule="auto"/>
-              <w:keepNext/>
-            </w:pPr>
-            <w:r>
-              <w:rPr>
-                <w:sz w:val="16"/>
-                <w:szCs w:val="16"/>
+            <w:tcW w:type="dxa" w:w="1216"/>
+          </w:tcPr>
+          <w:p>
+            <w:pPr>
+              <w:pStyle w:val="Compact"/>
+              <w:spacing w:before="20" w:after="20" w:line="240" w:lineRule="auto"/>
+              <w:keepNext/>
+            </w:pPr>
+            <w:r>
+              <w:rPr>
+                <w:sz w:val="13"/>
+                <w:szCs w:val="13"/>
               </w:rPr>
               <w:t xml:space="preserve">16 (27.6%)</w:t>
             </w:r>
@@ -2970,7 +2970,7 @@
         </w:tc>
         <w:tc>
           <w:tcPr>
-            <w:tcW w:type="dxa" w:w="935"/>
+            <w:tcW w:type="dxa" w:w="931"/>
           </w:tcPr>
           <w:p>
             <w:pPr>
@@ -2981,8 +2981,8 @@
             </w:pPr>
             <w:r>
               <w:rPr>
-                <w:sz w:val="16"/>
-                <w:szCs w:val="16"/>
+                <w:sz w:val="13"/>
+                <w:szCs w:val="13"/>
               </w:rPr>
               <w:t xml:space="preserve">70.7</w:t>
             </w:r>
@@ -2990,18 +2990,18 @@
         </w:tc>
         <w:tc>
           <w:tcPr>
-            <w:tcW w:type="dxa" w:w="1769"/>
-          </w:tcPr>
-          <w:p>
-            <w:pPr>
-              <w:pStyle w:val="Compact"/>
-              <w:spacing w:before="20" w:after="20" w:line="240" w:lineRule="auto"/>
-              <w:keepNext/>
-            </w:pPr>
-            <w:r>
-              <w:rPr>
-                <w:sz w:val="16"/>
-                <w:szCs w:val="16"/>
+            <w:tcW w:type="dxa" w:w="1760"/>
+          </w:tcPr>
+          <w:p>
+            <w:pPr>
+              <w:pStyle w:val="Compact"/>
+              <w:spacing w:before="20" w:after="20" w:line="240" w:lineRule="auto"/>
+              <w:keepNext/>
+            </w:pPr>
+            <w:r>
+              <w:rPr>
+                <w:sz w:val="13"/>
+                <w:szCs w:val="13"/>
               </w:rPr>
               <w:t xml:space="preserve">5.84 (4.64)</w:t>
             </w:r>
@@ -3009,7 +3009,7 @@
         </w:tc>
         <w:tc>
           <w:tcPr>
-            <w:tcW w:type="dxa" w:w="1123"/>
+            <w:tcW w:type="dxa" w:w="1119"/>
           </w:tcPr>
           <w:p>
             <w:pPr>
@@ -3020,8 +3020,8 @@
             </w:pPr>
             <w:r>
               <w:rPr>
-                <w:sz w:val="16"/>
-                <w:szCs w:val="16"/>
+                <w:sz w:val="13"/>
+                <w:szCs w:val="13"/>
               </w:rPr>
               <w:t xml:space="preserve">2018</w:t>
             </w:r>
@@ -3034,18 +3034,18 @@
         </w:trPr>
         <w:tc>
           <w:tcPr>
-            <w:tcW w:type="dxa" w:w="952"/>
-          </w:tcPr>
-          <w:p>
-            <w:pPr>
-              <w:pStyle w:val="Compact"/>
-              <w:spacing w:before="20" w:after="20" w:line="240" w:lineRule="auto"/>
-              <w:keepNext/>
-            </w:pPr>
-            <w:r>
-              <w:rPr>
-                <w:sz w:val="16"/>
-                <w:szCs w:val="16"/>
+            <w:tcW w:type="dxa" w:w="949"/>
+          </w:tcPr>
+          <w:p>
+            <w:pPr>
+              <w:pStyle w:val="Compact"/>
+              <w:spacing w:before="20" w:after="20" w:line="240" w:lineRule="auto"/>
+              <w:keepNext/>
+            </w:pPr>
+            <w:r>
+              <w:rPr>
+                <w:sz w:val="13"/>
+                <w:szCs w:val="13"/>
               </w:rPr>
               <w:t xml:space="preserve">일본(JP)</w:t>
             </w:r>
@@ -3053,7 +3053,7 @@
         </w:tc>
         <w:tc>
           <w:tcPr>
-            <w:tcW w:type="dxa" w:w="408"/>
+            <w:tcW w:type="dxa" w:w="461"/>
           </w:tcPr>
           <w:p>
             <w:pPr>
@@ -3064,8 +3064,8 @@
             </w:pPr>
             <w:r>
               <w:rPr>
-                <w:sz w:val="16"/>
-                <w:szCs w:val="16"/>
+                <w:sz w:val="13"/>
+                <w:szCs w:val="13"/>
               </w:rPr>
               <w:t xml:space="preserve">26</w:t>
             </w:r>
@@ -3073,18 +3073,18 @@
         </w:tc>
         <w:tc>
           <w:tcPr>
-            <w:tcW w:type="dxa" w:w="1225"/>
-          </w:tcPr>
-          <w:p>
-            <w:pPr>
-              <w:pStyle w:val="Compact"/>
-              <w:spacing w:before="20" w:after="20" w:line="240" w:lineRule="auto"/>
-              <w:keepNext/>
-            </w:pPr>
-            <w:r>
-              <w:rPr>
-                <w:sz w:val="16"/>
-                <w:szCs w:val="16"/>
+            <w:tcW w:type="dxa" w:w="1216"/>
+          </w:tcPr>
+          <w:p>
+            <w:pPr>
+              <w:pStyle w:val="Compact"/>
+              <w:spacing w:before="20" w:after="20" w:line="240" w:lineRule="auto"/>
+              <w:keepNext/>
+            </w:pPr>
+            <w:r>
+              <w:rPr>
+                <w:sz w:val="13"/>
+                <w:szCs w:val="13"/>
               </w:rPr>
               <w:t xml:space="preserve">10 (38.5%)</w:t>
             </w:r>
@@ -3092,18 +3092,18 @@
         </w:tc>
         <w:tc>
           <w:tcPr>
-            <w:tcW w:type="dxa" w:w="1429"/>
-          </w:tcPr>
-          <w:p>
-            <w:pPr>
-              <w:pStyle w:val="Compact"/>
-              <w:spacing w:before="20" w:after="20" w:line="240" w:lineRule="auto"/>
-              <w:keepNext/>
-            </w:pPr>
-            <w:r>
-              <w:rPr>
-                <w:sz w:val="16"/>
-                <w:szCs w:val="16"/>
+            <w:tcW w:type="dxa" w:w="1423"/>
+          </w:tcPr>
+          <w:p>
+            <w:pPr>
+              <w:pStyle w:val="Compact"/>
+              <w:spacing w:before="20" w:after="20" w:line="240" w:lineRule="auto"/>
+              <w:keepNext/>
+            </w:pPr>
+            <w:r>
+              <w:rPr>
+                <w:sz w:val="13"/>
+                <w:szCs w:val="13"/>
               </w:rPr>
               <w:t xml:space="preserve">13 (50.0%)</w:t>
             </w:r>
@@ -3111,18 +3111,18 @@
         </w:tc>
         <w:tc>
           <w:tcPr>
-            <w:tcW w:type="dxa" w:w="1225"/>
-          </w:tcPr>
-          <w:p>
-            <w:pPr>
-              <w:pStyle w:val="Compact"/>
-              <w:spacing w:before="20" w:after="20" w:line="240" w:lineRule="auto"/>
-              <w:keepNext/>
-            </w:pPr>
-            <w:r>
-              <w:rPr>
-                <w:sz w:val="16"/>
-                <w:szCs w:val="16"/>
+            <w:tcW w:type="dxa" w:w="1216"/>
+          </w:tcPr>
+          <w:p>
+            <w:pPr>
+              <w:pStyle w:val="Compact"/>
+              <w:spacing w:before="20" w:after="20" w:line="240" w:lineRule="auto"/>
+              <w:keepNext/>
+            </w:pPr>
+            <w:r>
+              <w:rPr>
+                <w:sz w:val="13"/>
+                <w:szCs w:val="13"/>
               </w:rPr>
               <w:t xml:space="preserve">3 (11.5%)</w:t>
             </w:r>
@@ -3130,7 +3130,7 @@
         </w:tc>
         <w:tc>
           <w:tcPr>
-            <w:tcW w:type="dxa" w:w="935"/>
+            <w:tcW w:type="dxa" w:w="931"/>
           </w:tcPr>
           <w:p>
             <w:pPr>
@@ -3141,8 +3141,8 @@
             </w:pPr>
             <w:r>
               <w:rPr>
-                <w:sz w:val="16"/>
-                <w:szCs w:val="16"/>
+                <w:sz w:val="13"/>
+                <w:szCs w:val="13"/>
               </w:rPr>
               <w:t xml:space="preserve">61.5</w:t>
             </w:r>
@@ -3150,18 +3150,18 @@
         </w:tc>
         <w:tc>
           <w:tcPr>
-            <w:tcW w:type="dxa" w:w="1769"/>
-          </w:tcPr>
-          <w:p>
-            <w:pPr>
-              <w:pStyle w:val="Compact"/>
-              <w:spacing w:before="20" w:after="20" w:line="240" w:lineRule="auto"/>
-              <w:keepNext/>
-            </w:pPr>
-            <w:r>
-              <w:rPr>
-                <w:sz w:val="16"/>
-                <w:szCs w:val="16"/>
+            <w:tcW w:type="dxa" w:w="1760"/>
+          </w:tcPr>
+          <w:p>
+            <w:pPr>
+              <w:pStyle w:val="Compact"/>
+              <w:spacing w:before="20" w:after="20" w:line="240" w:lineRule="auto"/>
+              <w:keepNext/>
+            </w:pPr>
+            <w:r>
+              <w:rPr>
+                <w:sz w:val="13"/>
+                <w:szCs w:val="13"/>
               </w:rPr>
               <w:t xml:space="preserve">6.88 (7.00)</w:t>
             </w:r>
@@ -3169,7 +3169,7 @@
         </w:tc>
         <w:tc>
           <w:tcPr>
-            <w:tcW w:type="dxa" w:w="1123"/>
+            <w:tcW w:type="dxa" w:w="1119"/>
           </w:tcPr>
           <w:p>
             <w:pPr>
@@ -3180,8 +3180,8 @@
             </w:pPr>
             <w:r>
               <w:rPr>
-                <w:sz w:val="16"/>
-                <w:szCs w:val="16"/>
+                <w:sz w:val="13"/>
+                <w:szCs w:val="13"/>
               </w:rPr>
               <w:t xml:space="preserve">2011.5</w:t>
             </w:r>
@@ -3194,18 +3194,18 @@
         </w:trPr>
         <w:tc>
           <w:tcPr>
-            <w:tcW w:type="dxa" w:w="952"/>
-          </w:tcPr>
-          <w:p>
-            <w:pPr>
-              <w:pStyle w:val="Compact"/>
-              <w:spacing w:before="20" w:after="20" w:line="240" w:lineRule="auto"/>
-              <w:keepNext/>
-            </w:pPr>
-            <w:r>
-              <w:rPr>
-                <w:sz w:val="16"/>
-                <w:szCs w:val="16"/>
+            <w:tcW w:type="dxa" w:w="949"/>
+          </w:tcPr>
+          <w:p>
+            <w:pPr>
+              <w:pStyle w:val="Compact"/>
+              <w:spacing w:before="20" w:after="20" w:line="240" w:lineRule="auto"/>
+              <w:keepNext/>
+            </w:pPr>
+            <w:r>
+              <w:rPr>
+                <w:sz w:val="13"/>
+                <w:szCs w:val="13"/>
               </w:rPr>
               <w:t xml:space="preserve">기타</w:t>
             </w:r>
@@ -3213,7 +3213,7 @@
         </w:tc>
         <w:tc>
           <w:tcPr>
-            <w:tcW w:type="dxa" w:w="408"/>
+            <w:tcW w:type="dxa" w:w="461"/>
           </w:tcPr>
           <w:p>
             <w:pPr>
@@ -3224,8 +3224,8 @@
             </w:pPr>
             <w:r>
               <w:rPr>
-                <w:sz w:val="16"/>
-                <w:szCs w:val="16"/>
+                <w:sz w:val="13"/>
+                <w:szCs w:val="13"/>
               </w:rPr>
               <w:t xml:space="preserve">16</w:t>
             </w:r>
@@ -3233,18 +3233,18 @@
         </w:tc>
         <w:tc>
           <w:tcPr>
-            <w:tcW w:type="dxa" w:w="1225"/>
-          </w:tcPr>
-          <w:p>
-            <w:pPr>
-              <w:pStyle w:val="Compact"/>
-              <w:spacing w:before="20" w:after="20" w:line="240" w:lineRule="auto"/>
-              <w:keepNext/>
-            </w:pPr>
-            <w:r>
-              <w:rPr>
-                <w:sz w:val="16"/>
-                <w:szCs w:val="16"/>
+            <w:tcW w:type="dxa" w:w="1216"/>
+          </w:tcPr>
+          <w:p>
+            <w:pPr>
+              <w:pStyle w:val="Compact"/>
+              <w:spacing w:before="20" w:after="20" w:line="240" w:lineRule="auto"/>
+              <w:keepNext/>
+            </w:pPr>
+            <w:r>
+              <w:rPr>
+                <w:sz w:val="13"/>
+                <w:szCs w:val="13"/>
               </w:rPr>
               <w:t xml:space="preserve">4 (25.0%)</w:t>
             </w:r>
@@ -3252,18 +3252,18 @@
         </w:tc>
         <w:tc>
           <w:tcPr>
-            <w:tcW w:type="dxa" w:w="1429"/>
-          </w:tcPr>
-          <w:p>
-            <w:pPr>
-              <w:pStyle w:val="Compact"/>
-              <w:spacing w:before="20" w:after="20" w:line="240" w:lineRule="auto"/>
-              <w:keepNext/>
-            </w:pPr>
-            <w:r>
-              <w:rPr>
-                <w:sz w:val="16"/>
-                <w:szCs w:val="16"/>
+            <w:tcW w:type="dxa" w:w="1423"/>
+          </w:tcPr>
+          <w:p>
+            <w:pPr>
+              <w:pStyle w:val="Compact"/>
+              <w:spacing w:before="20" w:after="20" w:line="240" w:lineRule="auto"/>
+              <w:keepNext/>
+            </w:pPr>
+            <w:r>
+              <w:rPr>
+                <w:sz w:val="13"/>
+                <w:szCs w:val="13"/>
               </w:rPr>
               <w:t xml:space="preserve">8 (50.0%)</w:t>
             </w:r>
@@ -3271,18 +3271,18 @@
         </w:tc>
         <w:tc>
           <w:tcPr>
-            <w:tcW w:type="dxa" w:w="1225"/>
-          </w:tcPr>
-          <w:p>
-            <w:pPr>
-              <w:pStyle w:val="Compact"/>
-              <w:spacing w:before="20" w:after="20" w:line="240" w:lineRule="auto"/>
-              <w:keepNext/>
-            </w:pPr>
-            <w:r>
-              <w:rPr>
-                <w:sz w:val="16"/>
-                <w:szCs w:val="16"/>
+            <w:tcW w:type="dxa" w:w="1216"/>
+          </w:tcPr>
+          <w:p>
+            <w:pPr>
+              <w:pStyle w:val="Compact"/>
+              <w:spacing w:before="20" w:after="20" w:line="240" w:lineRule="auto"/>
+              <w:keepNext/>
+            </w:pPr>
+            <w:r>
+              <w:rPr>
+                <w:sz w:val="13"/>
+                <w:szCs w:val="13"/>
               </w:rPr>
               <w:t xml:space="preserve">4 (25.0%)</w:t>
             </w:r>
@@ -3290,7 +3290,7 @@
         </w:tc>
         <w:tc>
           <w:tcPr>
-            <w:tcW w:type="dxa" w:w="935"/>
+            <w:tcW w:type="dxa" w:w="931"/>
           </w:tcPr>
           <w:p>
             <w:pPr>
@@ -3301,8 +3301,8 @@
             </w:pPr>
             <w:r>
               <w:rPr>
-                <w:sz w:val="16"/>
-                <w:szCs w:val="16"/>
+                <w:sz w:val="13"/>
+                <w:szCs w:val="13"/>
               </w:rPr>
               <w:t xml:space="preserve">75.0</w:t>
             </w:r>
@@ -3310,18 +3310,18 @@
         </w:tc>
         <w:tc>
           <w:tcPr>
-            <w:tcW w:type="dxa" w:w="1769"/>
-          </w:tcPr>
-          <w:p>
-            <w:pPr>
-              <w:pStyle w:val="Compact"/>
-              <w:spacing w:before="20" w:after="20" w:line="240" w:lineRule="auto"/>
-              <w:keepNext/>
-            </w:pPr>
-            <w:r>
-              <w:rPr>
-                <w:sz w:val="16"/>
-                <w:szCs w:val="16"/>
+            <w:tcW w:type="dxa" w:w="1760"/>
+          </w:tcPr>
+          <w:p>
+            <w:pPr>
+              <w:pStyle w:val="Compact"/>
+              <w:spacing w:before="20" w:after="20" w:line="240" w:lineRule="auto"/>
+              <w:keepNext/>
+            </w:pPr>
+            <w:r>
+              <w:rPr>
+                <w:sz w:val="13"/>
+                <w:szCs w:val="13"/>
               </w:rPr>
               <w:t xml:space="preserve">5.81 (6.23)</w:t>
             </w:r>
@@ -3329,7 +3329,7 @@
         </w:tc>
         <w:tc>
           <w:tcPr>
-            <w:tcW w:type="dxa" w:w="1123"/>
+            <w:tcW w:type="dxa" w:w="1119"/>
           </w:tcPr>
           <w:p>
             <w:pPr>
@@ -3340,8 +3340,8 @@
             </w:pPr>
             <w:r>
               <w:rPr>
-                <w:sz w:val="16"/>
-                <w:szCs w:val="16"/>
+                <w:sz w:val="13"/>
+                <w:szCs w:val="13"/>
               </w:rPr>
               <w:t xml:space="preserve">2015.5</w:t>
             </w:r>
@@ -3354,18 +3354,18 @@
         </w:trPr>
         <w:tc>
           <w:tcPr>
-            <w:tcW w:type="dxa" w:w="952"/>
-          </w:tcPr>
-          <w:p>
-            <w:pPr>
-              <w:pStyle w:val="Compact"/>
-              <w:spacing w:before="20" w:after="20" w:line="240" w:lineRule="auto"/>
-              <w:keepNext/>
-            </w:pPr>
-            <w:r>
-              <w:rPr>
-                <w:sz w:val="16"/>
-                <w:szCs w:val="16"/>
+            <w:tcW w:type="dxa" w:w="949"/>
+          </w:tcPr>
+          <w:p>
+            <w:pPr>
+              <w:pStyle w:val="Compact"/>
+              <w:spacing w:before="20" w:after="20" w:line="240" w:lineRule="auto"/>
+              <w:keepNext/>
+            </w:pPr>
+            <w:r>
+              <w:rPr>
+                <w:sz w:val="13"/>
+                <w:szCs w:val="13"/>
               </w:rPr>
               <w:t xml:space="preserve">전체</w:t>
             </w:r>
@@ -3373,7 +3373,7 @@
         </w:tc>
         <w:tc>
           <w:tcPr>
-            <w:tcW w:type="dxa" w:w="408"/>
+            <w:tcW w:type="dxa" w:w="461"/>
           </w:tcPr>
           <w:p>
             <w:pPr>
@@ -3384,8 +3384,8 @@
             </w:pPr>
             <w:r>
               <w:rPr>
-                <w:sz w:val="16"/>
-                <w:szCs w:val="16"/>
+                <w:sz w:val="13"/>
+                <w:szCs w:val="13"/>
               </w:rPr>
               <w:t xml:space="preserve">928</w:t>
             </w:r>
@@ -3393,18 +3393,18 @@
         </w:tc>
         <w:tc>
           <w:tcPr>
-            <w:tcW w:type="dxa" w:w="1225"/>
-          </w:tcPr>
-          <w:p>
-            <w:pPr>
-              <w:pStyle w:val="Compact"/>
-              <w:spacing w:before="20" w:after="20" w:line="240" w:lineRule="auto"/>
-              <w:keepNext/>
-            </w:pPr>
-            <w:r>
-              <w:rPr>
-                <w:sz w:val="16"/>
-                <w:szCs w:val="16"/>
+            <w:tcW w:type="dxa" w:w="1216"/>
+          </w:tcPr>
+          <w:p>
+            <w:pPr>
+              <w:pStyle w:val="Compact"/>
+              <w:spacing w:before="20" w:after="20" w:line="240" w:lineRule="auto"/>
+              <w:keepNext/>
+            </w:pPr>
+            <w:r>
+              <w:rPr>
+                <w:sz w:val="13"/>
+                <w:szCs w:val="13"/>
               </w:rPr>
               <w:t xml:space="preserve">338 (36.4%)</w:t>
             </w:r>
@@ -3412,18 +3412,18 @@
         </w:tc>
         <w:tc>
           <w:tcPr>
-            <w:tcW w:type="dxa" w:w="1429"/>
-          </w:tcPr>
-          <w:p>
-            <w:pPr>
-              <w:pStyle w:val="Compact"/>
-              <w:spacing w:before="20" w:after="20" w:line="240" w:lineRule="auto"/>
-              <w:keepNext/>
-            </w:pPr>
-            <w:r>
-              <w:rPr>
-                <w:sz w:val="16"/>
-                <w:szCs w:val="16"/>
+            <w:tcW w:type="dxa" w:w="1423"/>
+          </w:tcPr>
+          <w:p>
+            <w:pPr>
+              <w:pStyle w:val="Compact"/>
+              <w:spacing w:before="20" w:after="20" w:line="240" w:lineRule="auto"/>
+              <w:keepNext/>
+            </w:pPr>
+            <w:r>
+              <w:rPr>
+                <w:sz w:val="13"/>
+                <w:szCs w:val="13"/>
               </w:rPr>
               <w:t xml:space="preserve">425 (45.8%)</w:t>
             </w:r>
@@ -3431,18 +3431,18 @@
         </w:tc>
         <w:tc>
           <w:tcPr>
-            <w:tcW w:type="dxa" w:w="1225"/>
-          </w:tcPr>
-          <w:p>
-            <w:pPr>
-              <w:pStyle w:val="Compact"/>
-              <w:spacing w:before="20" w:after="20" w:line="240" w:lineRule="auto"/>
-              <w:keepNext/>
-            </w:pPr>
-            <w:r>
-              <w:rPr>
-                <w:sz w:val="16"/>
-                <w:szCs w:val="16"/>
+            <w:tcW w:type="dxa" w:w="1216"/>
+          </w:tcPr>
+          <w:p>
+            <w:pPr>
+              <w:pStyle w:val="Compact"/>
+              <w:spacing w:before="20" w:after="20" w:line="240" w:lineRule="auto"/>
+              <w:keepNext/>
+            </w:pPr>
+            <w:r>
+              <w:rPr>
+                <w:sz w:val="13"/>
+                <w:szCs w:val="13"/>
               </w:rPr>
               <w:t xml:space="preserve">165 (17.8%)</w:t>
             </w:r>
@@ -3450,7 +3450,7 @@
         </w:tc>
         <w:tc>
           <w:tcPr>
-            <w:tcW w:type="dxa" w:w="935"/>
+            <w:tcW w:type="dxa" w:w="931"/>
           </w:tcPr>
           <w:p>
             <w:pPr>
@@ -3461,8 +3461,8 @@
             </w:pPr>
             <w:r>
               <w:rPr>
-                <w:sz w:val="16"/>
-                <w:szCs w:val="16"/>
+                <w:sz w:val="13"/>
+                <w:szCs w:val="13"/>
               </w:rPr>
               <w:t xml:space="preserve">63.6</w:t>
             </w:r>
@@ -3470,18 +3470,18 @@
         </w:tc>
         <w:tc>
           <w:tcPr>
-            <w:tcW w:type="dxa" w:w="1769"/>
-          </w:tcPr>
-          <w:p>
-            <w:pPr>
-              <w:pStyle w:val="Compact"/>
-              <w:spacing w:before="20" w:after="20" w:line="240" w:lineRule="auto"/>
-              <w:keepNext/>
-            </w:pPr>
-            <w:r>
-              <w:rPr>
-                <w:sz w:val="16"/>
-                <w:szCs w:val="16"/>
+            <w:tcW w:type="dxa" w:w="1760"/>
+          </w:tcPr>
+          <w:p>
+            <w:pPr>
+              <w:pStyle w:val="Compact"/>
+              <w:spacing w:before="20" w:after="20" w:line="240" w:lineRule="auto"/>
+              <w:keepNext/>
+            </w:pPr>
+            <w:r>
+              <w:rPr>
+                <w:sz w:val="13"/>
+                <w:szCs w:val="13"/>
               </w:rPr>
               <w:t xml:space="preserve">5.69 (4.07)</w:t>
             </w:r>
@@ -3489,7 +3489,7 @@
         </w:tc>
         <w:tc>
           <w:tcPr>
-            <w:tcW w:type="dxa" w:w="1123"/>
+            <w:tcW w:type="dxa" w:w="1119"/>
           </w:tcPr>
           <w:p>
             <w:pPr>
@@ -3500,8 +3500,8 @@
             </w:pPr>
             <w:r>
               <w:rPr>
-                <w:sz w:val="16"/>
-                <w:szCs w:val="16"/>
+                <w:sz w:val="13"/>
+                <w:szCs w:val="13"/>
               </w:rPr>
               <w:t xml:space="preserve">2021</w:t>
             </w:r>
@@ -7614,8 +7614,8 @@
             </w:pPr>
             <w:r>
               <w:rPr>
-                <w:sz w:val="18"/>
-                <w:szCs w:val="18"/>
+                <w:sz w:val="13"/>
+                <w:szCs w:val="13"/>
               </w:rPr>
               <w:t xml:space="preserve">가설</w:t>
             </w:r>
@@ -7636,8 +7636,8 @@
             </w:pPr>
             <w:r>
               <w:rPr>
-                <w:sz w:val="18"/>
-                <w:szCs w:val="18"/>
+                <w:sz w:val="13"/>
+                <w:szCs w:val="13"/>
               </w:rPr>
               <w:t xml:space="preserve">예측</w:t>
             </w:r>
@@ -7658,8 +7658,8 @@
             </w:pPr>
             <w:r>
               <w:rPr>
-                <w:sz w:val="18"/>
-                <w:szCs w:val="18"/>
+                <w:sz w:val="13"/>
+                <w:szCs w:val="13"/>
               </w:rPr>
               <w:t xml:space="preserve">증거</w:t>
             </w:r>
@@ -7680,8 +7680,8 @@
             </w:pPr>
             <w:r>
               <w:rPr>
-                <w:sz w:val="18"/>
-                <w:szCs w:val="18"/>
+                <w:sz w:val="13"/>
+                <w:szCs w:val="13"/>
               </w:rPr>
               <w:t xml:space="preserve">판정</w:t>
             </w:r>
@@ -7704,8 +7704,8 @@
             </w:pPr>
             <w:r>
               <w:rPr>
-                <w:sz w:val="18"/>
-                <w:szCs w:val="18"/>
+                <w:sz w:val="13"/>
+                <w:szCs w:val="13"/>
               </w:rPr>
               <w:t xml:space="preserve">H1</w:t>
             </w:r>
@@ -7723,8 +7723,8 @@
             </w:pPr>
             <w:r>
               <w:rPr>
-                <w:sz w:val="18"/>
-                <w:szCs w:val="18"/>
+                <w:sz w:val="13"/>
+                <w:szCs w:val="13"/>
               </w:rPr>
               <w:t xml:space="preserve">범위가 넓을수록 경계 넘기(통합형)</w:t>
             </w:r>
@@ -7742,8 +7742,8 @@
             </w:pPr>
             <w:r>
               <w:rPr>
-                <w:sz w:val="18"/>
-                <w:szCs w:val="18"/>
+                <w:sz w:val="13"/>
+                <w:szCs w:val="13"/>
               </w:rPr>
               <w:t xml:space="preserve">본 검정: RRR 통합형 1.403***, 공정 단독형 0.905**(표 6); 조정 범위 1.262***, 패밀리 중복 제거 1.295***, 엄격 전공정 정의 1.352***, 무관 용법 제외 1.384***(표 9); 보조: 전공정 지향 OR 1.267***(표 5)</w:t>
             </w:r>
@@ -7761,8 +7761,8 @@
             </w:pPr>
             <w:r>
               <w:rPr>
-                <w:sz w:val="18"/>
-                <w:szCs w:val="18"/>
+                <w:sz w:val="13"/>
+                <w:szCs w:val="13"/>
               </w:rPr>
               <w:t xml:space="preserve">지지</w:t>
             </w:r>
@@ -7785,8 +7785,8 @@
             </w:pPr>
             <w:r>
               <w:rPr>
-                <w:sz w:val="18"/>
-                <w:szCs w:val="18"/>
+                <w:sz w:val="13"/>
+                <w:szCs w:val="13"/>
               </w:rPr>
               <w:t xml:space="preserve">H2</w:t>
             </w:r>
@@ -7804,8 +7804,8 @@
             </w:pPr>
             <w:r>
               <w:rPr>
-                <w:sz w:val="18"/>
-                <w:szCs w:val="18"/>
+                <w:sz w:val="13"/>
+                <w:szCs w:val="13"/>
               </w:rPr>
               <w:t xml:space="preserve">공정 단독형은 시간에 따라 감소, 통합형은 유지</w:t>
             </w:r>
@@ -7823,8 +7823,8 @@
             </w:pPr>
             <w:r>
               <w:rPr>
-                <w:sz w:val="18"/>
-                <w:szCs w:val="18"/>
+                <w:sz w:val="13"/>
+                <w:szCs w:val="13"/>
               </w:rPr>
               <w:t xml:space="preserve">공정 단독형: 모든 모형 설정에서 감소(RRR 0.913***, 표 6; 기간 더미 0.273***/0.101***, 표 9). 통합형: 전 기간 평탄(0.993; 표 6)이나 2015–2019년 정점 후 감소(두 기간 계수 차이 Wald p &lt; 0.001; 2010년 이후 표본 0.934**, 엄격 전공정 정의 0.967**, 무관 용법 제외 0.949**; 표 9)</w:t>
             </w:r>
@@ -7842,8 +7842,8 @@
             </w:pPr>
             <w:r>
               <w:rPr>
-                <w:sz w:val="18"/>
-                <w:szCs w:val="18"/>
+                <w:sz w:val="13"/>
+                <w:szCs w:val="13"/>
               </w:rPr>
               <w:t xml:space="preserve">부분 지지(공정 단독형의 감소만)</w:t>
             </w:r>
@@ -7866,8 +7866,8 @@
             </w:pPr>
             <w:r>
               <w:rPr>
-                <w:sz w:val="18"/>
-                <w:szCs w:val="18"/>
+                <w:sz w:val="13"/>
+                <w:szCs w:val="13"/>
               </w:rPr>
               <w:t xml:space="preserve">H3a</w:t>
             </w:r>
@@ -7885,8 +7885,8 @@
             </w:pPr>
             <w:r>
               <w:rPr>
-                <w:sz w:val="18"/>
-                <w:szCs w:val="18"/>
+                <w:sz w:val="13"/>
+                <w:szCs w:val="13"/>
               </w:rPr>
               <w:t xml:space="preserve">중국 출원청 출원이 기술범위가 좁고 더 전공정 지향적(특히 공정 단독형)</w:t>
             </w:r>
@@ -7904,8 +7904,8 @@
             </w:pPr>
             <w:r>
               <w:rPr>
-                <w:sz w:val="18"/>
-                <w:szCs w:val="18"/>
+                <w:sz w:val="13"/>
+                <w:szCs w:val="13"/>
               </w:rPr>
               <w:t xml:space="preserve">기술범위: IRR 0.785***(표 4), 모든 설정에서 유지(표 9). 공정 단독형: RRR 2.687***(표 6), 2.720–3.299***(표 9)이나 2023–2024년 제외 시 1.651(비유의). 전공정 지향 OR 1.650**(표 5), 조정 범위에서는 1.467*</w:t>
             </w:r>
@@ -7923,8 +7923,8 @@
             </w:pPr>
             <w:r>
               <w:rPr>
-                <w:sz w:val="18"/>
-                <w:szCs w:val="18"/>
+                <w:sz w:val="13"/>
+                <w:szCs w:val="13"/>
               </w:rPr>
               <w:t xml:space="preserve">지지(공정 단독형 성분은 2023–2024년 제외 시 유의성 상실)</w:t>
             </w:r>
@@ -7947,8 +7947,8 @@
             </w:pPr>
             <w:r>
               <w:rPr>
-                <w:sz w:val="18"/>
-                <w:szCs w:val="18"/>
+                <w:sz w:val="13"/>
+                <w:szCs w:val="13"/>
               </w:rPr>
               <w:t xml:space="preserve">H3b</w:t>
             </w:r>
@@ -7966,8 +7966,8 @@
             </w:pPr>
             <w:r>
               <w:rPr>
-                <w:sz w:val="18"/>
-                <w:szCs w:val="18"/>
+                <w:sz w:val="13"/>
+                <w:szCs w:val="13"/>
               </w:rPr>
               <w:t xml:space="preserve">일본 출원청 출원이 더 넓고 공정 단독형이 드묾</w:t>
             </w:r>
@@ -7985,8 +7985,8 @@
             </w:pPr>
             <w:r>
               <w:rPr>
-                <w:sz w:val="18"/>
-                <w:szCs w:val="18"/>
+                <w:sz w:val="13"/>
+                <w:szCs w:val="13"/>
               </w:rPr>
               <w:t xml:space="preserve">기술범위: IRR 1.270*(표 4)이나 로버스트 표준오차에서 비유의(p = 0.20); 2010년 이후 표본의 1.577***(보충자료 S1)는 기술범위 21의 동일 패밀리 4건에 의존. 공정 단독형: RRR 0.086***(표 6), 조정 범위·패밀리 중복 제거·엄격 전공정 정의·무관 용법 제외·2023–2024년 제외에서 유지되나 2010년 이후 표본에서는 비유의(3.240; 표 9); N = 26</w:t>
             </w:r>
@@ -8004,8 +8004,8 @@
             </w:pPr>
             <w:r>
               <w:rPr>
-                <w:sz w:val="18"/>
-                <w:szCs w:val="18"/>
+                <w:sz w:val="13"/>
+                <w:szCs w:val="13"/>
               </w:rPr>
               <w:t xml:space="preserve">기술범위 성분은 판정 유보, 공정 단독형 성분은 부분 지지</w:t>
             </w:r>
@@ -8805,7 +8805,7 @@
     <w:tbl>
       <w:tblPr>
         <w:tblStyle w:val="Table"/>
-        <w:tblW w:type="dxa" w:w="9073"/>
+        <w:tblW w:type="dxa" w:w="9072"/>
         <w:tblLayout w:type="fixed"/>
         <w:tblLook w:firstRow="1" w:lastRow="0" w:firstColumn="0" w:lastColumn="0" w:noHBand="0" w:noVBand="0" w:val="0020"/>
         <w:tblCellMar>
@@ -8824,15 +8824,15 @@
         </w:tblBorders>
       </w:tblPr>
       <w:tblGrid>
-        <w:gridCol w:w="1916"/>
-        <w:gridCol w:w="355"/>
-        <w:gridCol w:w="769"/>
-        <w:gridCol w:w="988"/>
-        <w:gridCol w:w="1017"/>
-        <w:gridCol w:w="1215"/>
-        <w:gridCol w:w="809"/>
-        <w:gridCol w:w="809"/>
-        <w:gridCol w:w="1195"/>
+        <w:gridCol w:w="1814"/>
+        <w:gridCol w:w="461"/>
+        <w:gridCol w:w="864"/>
+        <w:gridCol w:w="960"/>
+        <w:gridCol w:w="936"/>
+        <w:gridCol w:w="1081"/>
+        <w:gridCol w:w="784"/>
+        <w:gridCol w:w="784"/>
+        <w:gridCol w:w="1388"/>
       </w:tblGrid>
       <w:tr>
         <w:trPr>
@@ -8841,7 +8841,7 @@
         </w:trPr>
         <w:tc>
           <w:tcPr>
-            <w:tcW w:type="dxa" w:w="1916"/>
+            <w:tcW w:type="dxa" w:w="1814"/>
             <w:tcBorders>
               <w:bottom w:val="single" w:sz="4" w:space="0" w:color="000000"/>
             </w:tcBorders>
@@ -8863,7 +8863,7 @@
         </w:tc>
         <w:tc>
           <w:tcPr>
-            <w:tcW w:type="dxa" w:w="355"/>
+            <w:tcW w:type="dxa" w:w="461"/>
             <w:tcBorders>
               <w:bottom w:val="single" w:sz="4" w:space="0" w:color="000000"/>
             </w:tcBorders>
@@ -8886,7 +8886,7 @@
         </w:tc>
         <w:tc>
           <w:tcPr>
-            <w:tcW w:type="dxa" w:w="769"/>
+            <w:tcW w:type="dxa" w:w="864"/>
             <w:tcBorders>
               <w:bottom w:val="single" w:sz="4" w:space="0" w:color="000000"/>
             </w:tcBorders>
@@ -8908,7 +8908,7 @@
         </w:tc>
         <w:tc>
           <w:tcPr>
-            <w:tcW w:type="dxa" w:w="988"/>
+            <w:tcW w:type="dxa" w:w="960"/>
             <w:tcBorders>
               <w:bottom w:val="single" w:sz="4" w:space="0" w:color="000000"/>
             </w:tcBorders>
@@ -8930,7 +8930,7 @@
         </w:tc>
         <w:tc>
           <w:tcPr>
-            <w:tcW w:type="dxa" w:w="1017"/>
+            <w:tcW w:type="dxa" w:w="936"/>
             <w:tcBorders>
               <w:bottom w:val="single" w:sz="4" w:space="0" w:color="000000"/>
             </w:tcBorders>
@@ -8952,7 +8952,7 @@
         </w:tc>
         <w:tc>
           <w:tcPr>
-            <w:tcW w:type="dxa" w:w="1215"/>
+            <w:tcW w:type="dxa" w:w="1081"/>
             <w:tcBorders>
               <w:bottom w:val="single" w:sz="4" w:space="0" w:color="000000"/>
             </w:tcBorders>
@@ -8974,7 +8974,7 @@
         </w:tc>
         <w:tc>
           <w:tcPr>
-            <w:tcW w:type="dxa" w:w="809"/>
+            <w:tcW w:type="dxa" w:w="784"/>
             <w:tcBorders>
               <w:bottom w:val="single" w:sz="4" w:space="0" w:color="000000"/>
             </w:tcBorders>
@@ -8996,7 +8996,7 @@
         </w:tc>
         <w:tc>
           <w:tcPr>
-            <w:tcW w:type="dxa" w:w="809"/>
+            <w:tcW w:type="dxa" w:w="784"/>
             <w:tcBorders>
               <w:bottom w:val="single" w:sz="4" w:space="0" w:color="000000"/>
             </w:tcBorders>
@@ -9018,7 +9018,7 @@
         </w:tc>
         <w:tc>
           <w:tcPr>
-            <w:tcW w:type="dxa" w:w="1195"/>
+            <w:tcW w:type="dxa" w:w="1388"/>
             <w:tcBorders>
               <w:bottom w:val="single" w:sz="4" w:space="0" w:color="000000"/>
             </w:tcBorders>
@@ -9045,7 +9045,7 @@
         </w:trPr>
         <w:tc>
           <w:tcPr>
-            <w:tcW w:type="dxa" w:w="1916"/>
+            <w:tcW w:type="dxa" w:w="1814"/>
           </w:tcPr>
           <w:p>
             <w:pPr>
@@ -9064,7 +9064,7 @@
         </w:tc>
         <w:tc>
           <w:tcPr>
-            <w:tcW w:type="dxa" w:w="355"/>
+            <w:tcW w:type="dxa" w:w="461"/>
           </w:tcPr>
           <w:p>
             <w:pPr>
@@ -9084,7 +9084,7 @@
         </w:tc>
         <w:tc>
           <w:tcPr>
-            <w:tcW w:type="dxa" w:w="769"/>
+            <w:tcW w:type="dxa" w:w="864"/>
           </w:tcPr>
           <w:p>
             <w:pPr>
@@ -9103,7 +9103,7 @@
         </w:tc>
         <w:tc>
           <w:tcPr>
-            <w:tcW w:type="dxa" w:w="988"/>
+            <w:tcW w:type="dxa" w:w="960"/>
           </w:tcPr>
           <w:p>
             <w:pPr>
@@ -9122,7 +9122,7 @@
         </w:tc>
         <w:tc>
           <w:tcPr>
-            <w:tcW w:type="dxa" w:w="1017"/>
+            <w:tcW w:type="dxa" w:w="936"/>
           </w:tcPr>
           <w:p>
             <w:pPr>
@@ -9141,7 +9141,7 @@
         </w:tc>
         <w:tc>
           <w:tcPr>
-            <w:tcW w:type="dxa" w:w="1215"/>
+            <w:tcW w:type="dxa" w:w="1081"/>
           </w:tcPr>
           <w:p>
             <w:pPr>
@@ -9160,7 +9160,7 @@
         </w:tc>
         <w:tc>
           <w:tcPr>
-            <w:tcW w:type="dxa" w:w="809"/>
+            <w:tcW w:type="dxa" w:w="784"/>
           </w:tcPr>
           <w:p>
             <w:pPr>
@@ -9179,7 +9179,7 @@
         </w:tc>
         <w:tc>
           <w:tcPr>
-            <w:tcW w:type="dxa" w:w="809"/>
+            <w:tcW w:type="dxa" w:w="784"/>
           </w:tcPr>
           <w:p>
             <w:pPr>
@@ -9198,7 +9198,7 @@
         </w:tc>
         <w:tc>
           <w:tcPr>
-            <w:tcW w:type="dxa" w:w="1195"/>
+            <w:tcW w:type="dxa" w:w="1388"/>
           </w:tcPr>
           <w:p>
             <w:pPr>
@@ -9222,7 +9222,7 @@
         </w:trPr>
         <w:tc>
           <w:tcPr>
-            <w:tcW w:type="dxa" w:w="1916"/>
+            <w:tcW w:type="dxa" w:w="1814"/>
           </w:tcPr>
           <w:p>
             <w:pPr>
@@ -9241,7 +9241,7 @@
         </w:tc>
         <w:tc>
           <w:tcPr>
-            <w:tcW w:type="dxa" w:w="355"/>
+            <w:tcW w:type="dxa" w:w="461"/>
           </w:tcPr>
           <w:p>
             <w:pPr>
@@ -9261,7 +9261,7 @@
         </w:tc>
         <w:tc>
           <w:tcPr>
-            <w:tcW w:type="dxa" w:w="769"/>
+            <w:tcW w:type="dxa" w:w="864"/>
           </w:tcPr>
           <w:p>
             <w:pPr>
@@ -9280,7 +9280,7 @@
         </w:tc>
         <w:tc>
           <w:tcPr>
-            <w:tcW w:type="dxa" w:w="988"/>
+            <w:tcW w:type="dxa" w:w="960"/>
           </w:tcPr>
           <w:p>
             <w:pPr>
@@ -9299,7 +9299,7 @@
         </w:tc>
         <w:tc>
           <w:tcPr>
-            <w:tcW w:type="dxa" w:w="1017"/>
+            <w:tcW w:type="dxa" w:w="936"/>
           </w:tcPr>
           <w:p>
             <w:pPr>
@@ -9318,7 +9318,7 @@
         </w:tc>
         <w:tc>
           <w:tcPr>
-            <w:tcW w:type="dxa" w:w="1215"/>
+            <w:tcW w:type="dxa" w:w="1081"/>
           </w:tcPr>
           <w:p>
             <w:pPr>
@@ -9337,7 +9337,7 @@
         </w:tc>
         <w:tc>
           <w:tcPr>
-            <w:tcW w:type="dxa" w:w="809"/>
+            <w:tcW w:type="dxa" w:w="784"/>
           </w:tcPr>
           <w:p>
             <w:pPr>
@@ -9356,7 +9356,7 @@
         </w:tc>
         <w:tc>
           <w:tcPr>
-            <w:tcW w:type="dxa" w:w="809"/>
+            <w:tcW w:type="dxa" w:w="784"/>
           </w:tcPr>
           <w:p>
             <w:pPr>
@@ -9375,7 +9375,7 @@
         </w:tc>
         <w:tc>
           <w:tcPr>
-            <w:tcW w:type="dxa" w:w="1195"/>
+            <w:tcW w:type="dxa" w:w="1388"/>
           </w:tcPr>
           <w:p>
             <w:pPr>
@@ -9399,7 +9399,7 @@
         </w:trPr>
         <w:tc>
           <w:tcPr>
-            <w:tcW w:type="dxa" w:w="1916"/>
+            <w:tcW w:type="dxa" w:w="1814"/>
           </w:tcPr>
           <w:p>
             <w:pPr>
@@ -9418,7 +9418,7 @@
         </w:tc>
         <w:tc>
           <w:tcPr>
-            <w:tcW w:type="dxa" w:w="355"/>
+            <w:tcW w:type="dxa" w:w="461"/>
           </w:tcPr>
           <w:p>
             <w:pPr>
@@ -9438,7 +9438,7 @@
         </w:tc>
         <w:tc>
           <w:tcPr>
-            <w:tcW w:type="dxa" w:w="769"/>
+            <w:tcW w:type="dxa" w:w="864"/>
           </w:tcPr>
           <w:p>
             <w:pPr>
@@ -9457,7 +9457,7 @@
         </w:tc>
         <w:tc>
           <w:tcPr>
-            <w:tcW w:type="dxa" w:w="988"/>
+            <w:tcW w:type="dxa" w:w="960"/>
           </w:tcPr>
           <w:p>
             <w:pPr>
@@ -9476,7 +9476,7 @@
         </w:tc>
         <w:tc>
           <w:tcPr>
-            <w:tcW w:type="dxa" w:w="1017"/>
+            <w:tcW w:type="dxa" w:w="936"/>
           </w:tcPr>
           <w:p>
             <w:pPr>
@@ -9495,7 +9495,7 @@
         </w:tc>
         <w:tc>
           <w:tcPr>
-            <w:tcW w:type="dxa" w:w="1215"/>
+            <w:tcW w:type="dxa" w:w="1081"/>
           </w:tcPr>
           <w:p>
             <w:pPr>
@@ -9514,7 +9514,7 @@
         </w:tc>
         <w:tc>
           <w:tcPr>
-            <w:tcW w:type="dxa" w:w="809"/>
+            <w:tcW w:type="dxa" w:w="784"/>
           </w:tcPr>
           <w:p>
             <w:pPr>
@@ -9533,7 +9533,7 @@
         </w:tc>
         <w:tc>
           <w:tcPr>
-            <w:tcW w:type="dxa" w:w="809"/>
+            <w:tcW w:type="dxa" w:w="784"/>
           </w:tcPr>
           <w:p>
             <w:pPr>
@@ -9552,7 +9552,7 @@
         </w:tc>
         <w:tc>
           <w:tcPr>
-            <w:tcW w:type="dxa" w:w="1195"/>
+            <w:tcW w:type="dxa" w:w="1388"/>
           </w:tcPr>
           <w:p>
             <w:pPr>
@@ -9576,7 +9576,7 @@
         </w:trPr>
         <w:tc>
           <w:tcPr>
-            <w:tcW w:type="dxa" w:w="1916"/>
+            <w:tcW w:type="dxa" w:w="1814"/>
           </w:tcPr>
           <w:p>
             <w:pPr>
@@ -9595,7 +9595,7 @@
         </w:tc>
         <w:tc>
           <w:tcPr>
-            <w:tcW w:type="dxa" w:w="355"/>
+            <w:tcW w:type="dxa" w:w="461"/>
           </w:tcPr>
           <w:p>
             <w:pPr>
@@ -9615,7 +9615,7 @@
         </w:tc>
         <w:tc>
           <w:tcPr>
-            <w:tcW w:type="dxa" w:w="769"/>
+            <w:tcW w:type="dxa" w:w="864"/>
           </w:tcPr>
           <w:p>
             <w:pPr>
@@ -9634,7 +9634,7 @@
         </w:tc>
         <w:tc>
           <w:tcPr>
-            <w:tcW w:type="dxa" w:w="988"/>
+            <w:tcW w:type="dxa" w:w="960"/>
           </w:tcPr>
           <w:p>
             <w:pPr>
@@ -9653,7 +9653,7 @@
         </w:tc>
         <w:tc>
           <w:tcPr>
-            <w:tcW w:type="dxa" w:w="1017"/>
+            <w:tcW w:type="dxa" w:w="936"/>
           </w:tcPr>
           <w:p>
             <w:pPr>
@@ -9672,7 +9672,7 @@
         </w:tc>
         <w:tc>
           <w:tcPr>
-            <w:tcW w:type="dxa" w:w="1215"/>
+            <w:tcW w:type="dxa" w:w="1081"/>
           </w:tcPr>
           <w:p>
             <w:pPr>
@@ -9691,7 +9691,7 @@
         </w:tc>
         <w:tc>
           <w:tcPr>
-            <w:tcW w:type="dxa" w:w="809"/>
+            <w:tcW w:type="dxa" w:w="784"/>
           </w:tcPr>
           <w:p>
             <w:pPr>
@@ -9710,7 +9710,7 @@
         </w:tc>
         <w:tc>
           <w:tcPr>
-            <w:tcW w:type="dxa" w:w="809"/>
+            <w:tcW w:type="dxa" w:w="784"/>
           </w:tcPr>
           <w:p>
             <w:pPr>
@@ -9729,7 +9729,7 @@
         </w:tc>
         <w:tc>
           <w:tcPr>
-            <w:tcW w:type="dxa" w:w="1195"/>
+            <w:tcW w:type="dxa" w:w="1388"/>
           </w:tcPr>
           <w:p>
             <w:pPr>
@@ -9753,7 +9753,7 @@
         </w:trPr>
         <w:tc>
           <w:tcPr>
-            <w:tcW w:type="dxa" w:w="1916"/>
+            <w:tcW w:type="dxa" w:w="1814"/>
           </w:tcPr>
           <w:p>
             <w:pPr>
@@ -9772,7 +9772,7 @@
         </w:tc>
         <w:tc>
           <w:tcPr>
-            <w:tcW w:type="dxa" w:w="355"/>
+            <w:tcW w:type="dxa" w:w="461"/>
           </w:tcPr>
           <w:p>
             <w:pPr>
@@ -9792,7 +9792,7 @@
         </w:tc>
         <w:tc>
           <w:tcPr>
-            <w:tcW w:type="dxa" w:w="769"/>
+            <w:tcW w:type="dxa" w:w="864"/>
           </w:tcPr>
           <w:p>
             <w:pPr>
@@ -9811,7 +9811,7 @@
         </w:tc>
         <w:tc>
           <w:tcPr>
-            <w:tcW w:type="dxa" w:w="988"/>
+            <w:tcW w:type="dxa" w:w="960"/>
           </w:tcPr>
           <w:p>
             <w:pPr>
@@ -9830,7 +9830,7 @@
         </w:tc>
         <w:tc>
           <w:tcPr>
-            <w:tcW w:type="dxa" w:w="1017"/>
+            <w:tcW w:type="dxa" w:w="936"/>
           </w:tcPr>
           <w:p>
             <w:pPr>
@@ -9849,7 +9849,7 @@
         </w:tc>
         <w:tc>
           <w:tcPr>
-            <w:tcW w:type="dxa" w:w="1215"/>
+            <w:tcW w:type="dxa" w:w="1081"/>
           </w:tcPr>
           <w:p>
             <w:pPr>
@@ -9868,7 +9868,7 @@
         </w:tc>
         <w:tc>
           <w:tcPr>
-            <w:tcW w:type="dxa" w:w="809"/>
+            <w:tcW w:type="dxa" w:w="784"/>
           </w:tcPr>
           <w:p>
             <w:pPr>
@@ -9887,7 +9887,7 @@
         </w:tc>
         <w:tc>
           <w:tcPr>
-            <w:tcW w:type="dxa" w:w="809"/>
+            <w:tcW w:type="dxa" w:w="784"/>
           </w:tcPr>
           <w:p>
             <w:pPr>
@@ -9906,7 +9906,7 @@
         </w:tc>
         <w:tc>
           <w:tcPr>
-            <w:tcW w:type="dxa" w:w="1195"/>
+            <w:tcW w:type="dxa" w:w="1388"/>
           </w:tcPr>
           <w:p>
             <w:pPr>
@@ -9930,7 +9930,7 @@
         </w:trPr>
         <w:tc>
           <w:tcPr>
-            <w:tcW w:type="dxa" w:w="1916"/>
+            <w:tcW w:type="dxa" w:w="1814"/>
           </w:tcPr>
           <w:p>
             <w:pPr>
@@ -9949,7 +9949,7 @@
         </w:tc>
         <w:tc>
           <w:tcPr>
-            <w:tcW w:type="dxa" w:w="355"/>
+            <w:tcW w:type="dxa" w:w="461"/>
           </w:tcPr>
           <w:p>
             <w:pPr>
@@ -9969,7 +9969,7 @@
         </w:tc>
         <w:tc>
           <w:tcPr>
-            <w:tcW w:type="dxa" w:w="769"/>
+            <w:tcW w:type="dxa" w:w="864"/>
           </w:tcPr>
           <w:p>
             <w:pPr>
@@ -9988,7 +9988,7 @@
         </w:tc>
         <w:tc>
           <w:tcPr>
-            <w:tcW w:type="dxa" w:w="988"/>
+            <w:tcW w:type="dxa" w:w="960"/>
           </w:tcPr>
           <w:p>
             <w:pPr>
@@ -10007,7 +10007,7 @@
         </w:tc>
         <w:tc>
           <w:tcPr>
-            <w:tcW w:type="dxa" w:w="1017"/>
+            <w:tcW w:type="dxa" w:w="936"/>
           </w:tcPr>
           <w:p>
             <w:pPr>
@@ -10026,7 +10026,7 @@
         </w:tc>
         <w:tc>
           <w:tcPr>
-            <w:tcW w:type="dxa" w:w="1215"/>
+            <w:tcW w:type="dxa" w:w="1081"/>
           </w:tcPr>
           <w:p>
             <w:pPr>
@@ -10045,7 +10045,7 @@
         </w:tc>
         <w:tc>
           <w:tcPr>
-            <w:tcW w:type="dxa" w:w="809"/>
+            <w:tcW w:type="dxa" w:w="784"/>
           </w:tcPr>
           <w:p>
             <w:pPr>
@@ -10064,7 +10064,7 @@
         </w:tc>
         <w:tc>
           <w:tcPr>
-            <w:tcW w:type="dxa" w:w="809"/>
+            <w:tcW w:type="dxa" w:w="784"/>
           </w:tcPr>
           <w:p>
             <w:pPr>
@@ -10083,7 +10083,7 @@
         </w:tc>
         <w:tc>
           <w:tcPr>
-            <w:tcW w:type="dxa" w:w="1195"/>
+            <w:tcW w:type="dxa" w:w="1388"/>
           </w:tcPr>
           <w:p>
             <w:pPr>
@@ -10107,7 +10107,7 @@
         </w:trPr>
         <w:tc>
           <w:tcPr>
-            <w:tcW w:type="dxa" w:w="1916"/>
+            <w:tcW w:type="dxa" w:w="1814"/>
           </w:tcPr>
           <w:p>
             <w:pPr>
@@ -10126,7 +10126,7 @@
         </w:tc>
         <w:tc>
           <w:tcPr>
-            <w:tcW w:type="dxa" w:w="355"/>
+            <w:tcW w:type="dxa" w:w="461"/>
           </w:tcPr>
           <w:p>
             <w:pPr>
@@ -10146,7 +10146,7 @@
         </w:tc>
         <w:tc>
           <w:tcPr>
-            <w:tcW w:type="dxa" w:w="769"/>
+            <w:tcW w:type="dxa" w:w="864"/>
           </w:tcPr>
           <w:p>
             <w:pPr>
@@ -10165,7 +10165,7 @@
         </w:tc>
         <w:tc>
           <w:tcPr>
-            <w:tcW w:type="dxa" w:w="988"/>
+            <w:tcW w:type="dxa" w:w="960"/>
           </w:tcPr>
           <w:p>
             <w:pPr>
@@ -10184,7 +10184,7 @@
         </w:tc>
         <w:tc>
           <w:tcPr>
-            <w:tcW w:type="dxa" w:w="1017"/>
+            <w:tcW w:type="dxa" w:w="936"/>
           </w:tcPr>
           <w:p>
             <w:pPr>
@@ -10203,7 +10203,7 @@
         </w:tc>
         <w:tc>
           <w:tcPr>
-            <w:tcW w:type="dxa" w:w="1215"/>
+            <w:tcW w:type="dxa" w:w="1081"/>
           </w:tcPr>
           <w:p>
             <w:pPr>
@@ -10222,7 +10222,7 @@
         </w:tc>
         <w:tc>
           <w:tcPr>
-            <w:tcW w:type="dxa" w:w="809"/>
+            <w:tcW w:type="dxa" w:w="784"/>
           </w:tcPr>
           <w:p>
             <w:pPr>
@@ -10241,7 +10241,7 @@
         </w:tc>
         <w:tc>
           <w:tcPr>
-            <w:tcW w:type="dxa" w:w="809"/>
+            <w:tcW w:type="dxa" w:w="784"/>
           </w:tcPr>
           <w:p>
             <w:pPr>
@@ -10260,7 +10260,7 @@
         </w:tc>
         <w:tc>
           <w:tcPr>
-            <w:tcW w:type="dxa" w:w="1195"/>
+            <w:tcW w:type="dxa" w:w="1388"/>
           </w:tcPr>
           <w:p>
             <w:pPr>
@@ -10284,7 +10284,7 @@
         </w:trPr>
         <w:tc>
           <w:tcPr>
-            <w:tcW w:type="dxa" w:w="1916"/>
+            <w:tcW w:type="dxa" w:w="1814"/>
           </w:tcPr>
           <w:p>
             <w:pPr>
@@ -10303,7 +10303,7 @@
         </w:tc>
         <w:tc>
           <w:tcPr>
-            <w:tcW w:type="dxa" w:w="355"/>
+            <w:tcW w:type="dxa" w:w="461"/>
           </w:tcPr>
           <w:p>
             <w:pPr>
@@ -10323,7 +10323,7 @@
         </w:tc>
         <w:tc>
           <w:tcPr>
-            <w:tcW w:type="dxa" w:w="769"/>
+            <w:tcW w:type="dxa" w:w="864"/>
           </w:tcPr>
           <w:p>
             <w:pPr>
@@ -10342,7 +10342,7 @@
         </w:tc>
         <w:tc>
           <w:tcPr>
-            <w:tcW w:type="dxa" w:w="988"/>
+            <w:tcW w:type="dxa" w:w="960"/>
           </w:tcPr>
           <w:p>
             <w:pPr>
@@ -10361,7 +10361,7 @@
         </w:tc>
         <w:tc>
           <w:tcPr>
-            <w:tcW w:type="dxa" w:w="1017"/>
+            <w:tcW w:type="dxa" w:w="936"/>
           </w:tcPr>
           <w:p>
             <w:pPr>
@@ -10380,7 +10380,7 @@
         </w:tc>
         <w:tc>
           <w:tcPr>
-            <w:tcW w:type="dxa" w:w="1215"/>
+            <w:tcW w:type="dxa" w:w="1081"/>
           </w:tcPr>
           <w:p>
             <w:pPr>
@@ -10399,7 +10399,7 @@
         </w:tc>
         <w:tc>
           <w:tcPr>
-            <w:tcW w:type="dxa" w:w="809"/>
+            <w:tcW w:type="dxa" w:w="784"/>
           </w:tcPr>
           <w:p>
             <w:pPr>
@@ -10418,7 +10418,7 @@
         </w:tc>
         <w:tc>
           <w:tcPr>
-            <w:tcW w:type="dxa" w:w="809"/>
+            <w:tcW w:type="dxa" w:w="784"/>
           </w:tcPr>
           <w:p>
             <w:pPr>
@@ -10437,7 +10437,7 @@
         </w:tc>
         <w:tc>
           <w:tcPr>
-            <w:tcW w:type="dxa" w:w="1195"/>
+            <w:tcW w:type="dxa" w:w="1388"/>
           </w:tcPr>
           <w:p>
             <w:pPr>
@@ -10461,7 +10461,7 @@
         </w:trPr>
         <w:tc>
           <w:tcPr>
-            <w:tcW w:type="dxa" w:w="1916"/>
+            <w:tcW w:type="dxa" w:w="1814"/>
           </w:tcPr>
           <w:p>
             <w:pPr>
@@ -10480,7 +10480,7 @@
         </w:tc>
         <w:tc>
           <w:tcPr>
-            <w:tcW w:type="dxa" w:w="355"/>
+            <w:tcW w:type="dxa" w:w="461"/>
           </w:tcPr>
           <w:p>
             <w:pPr>
@@ -10500,7 +10500,7 @@
         </w:tc>
         <w:tc>
           <w:tcPr>
-            <w:tcW w:type="dxa" w:w="769"/>
+            <w:tcW w:type="dxa" w:w="864"/>
           </w:tcPr>
           <w:p>
             <w:pPr>
@@ -10519,7 +10519,7 @@
         </w:tc>
         <w:tc>
           <w:tcPr>
-            <w:tcW w:type="dxa" w:w="988"/>
+            <w:tcW w:type="dxa" w:w="960"/>
           </w:tcPr>
           <w:p>
             <w:pPr>
@@ -10538,7 +10538,7 @@
         </w:tc>
         <w:tc>
           <w:tcPr>
-            <w:tcW w:type="dxa" w:w="1017"/>
+            <w:tcW w:type="dxa" w:w="936"/>
           </w:tcPr>
           <w:p>
             <w:pPr>
@@ -10557,7 +10557,7 @@
         </w:tc>
         <w:tc>
           <w:tcPr>
-            <w:tcW w:type="dxa" w:w="1215"/>
+            <w:tcW w:type="dxa" w:w="1081"/>
           </w:tcPr>
           <w:p>
             <w:pPr>
@@ -10576,7 +10576,7 @@
         </w:tc>
         <w:tc>
           <w:tcPr>
-            <w:tcW w:type="dxa" w:w="809"/>
+            <w:tcW w:type="dxa" w:w="784"/>
           </w:tcPr>
           <w:p>
             <w:pPr>
@@ -10595,7 +10595,7 @@
         </w:tc>
         <w:tc>
           <w:tcPr>
-            <w:tcW w:type="dxa" w:w="809"/>
+            <w:tcW w:type="dxa" w:w="784"/>
           </w:tcPr>
           <w:p>
             <w:pPr>
@@ -10614,7 +10614,7 @@
         </w:tc>
         <w:tc>
           <w:tcPr>
-            <w:tcW w:type="dxa" w:w="1195"/>
+            <w:tcW w:type="dxa" w:w="1388"/>
           </w:tcPr>
           <w:p>
             <w:pPr>

</xml_diff>